<commit_message>
cambios estéticos demanda causal
</commit_message>
<xml_diff>
--- a/docs/Test plantilla demanda.docx
+++ b/docs/Test plantilla demanda.docx
@@ -65,23 +65,26 @@
           <w:color w:val="000000"/>
           <w:sz w:val="24"/>
           <w:szCs w:val="24"/>
-        </w:rPr>
-      </w:pPr>
-      <w:r>
-        <w:rPr>
-          <w:b/>
-          <w:bCs/>
-          <w:color w:val="000000"/>
-          <w:sz w:val="24"/>
-          <w:szCs w:val="24"/>
+          <w:lang w:val="es-ES"/>
+        </w:rPr>
+      </w:pPr>
+      <w:r>
+        <w:rPr>
+          <w:b/>
+          <w:bCs/>
+          <w:color w:val="000000" w:themeColor="text1"/>
+          <w:sz w:val="24"/>
+          <w:szCs w:val="24"/>
+          <w:lang w:val="es-ES"/>
         </w:rPr>
         <w:t>DOÑA DÁCIL ATTENERY RAMOS BELLO</w:t>
       </w:r>
       <w:r>
         <w:rPr>
-          <w:color w:val="000000"/>
-          <w:sz w:val="24"/>
-          <w:szCs w:val="24"/>
+          <w:color w:val="000000" w:themeColor="text1"/>
+          <w:sz w:val="24"/>
+          <w:szCs w:val="24"/>
+          <w:lang w:val="es-ES"/>
         </w:rPr>
         <w:t xml:space="preserve">, Procuradora de los tribunales en nombre y representación de </w:t>
       </w:r>
@@ -89,17 +92,19 @@
         <w:rPr>
           <w:b/>
           <w:bCs/>
-          <w:color w:val="000000"/>
-          <w:sz w:val="24"/>
-          <w:szCs w:val="24"/>
+          <w:color w:val="000000" w:themeColor="text1"/>
+          <w:sz w:val="24"/>
+          <w:szCs w:val="24"/>
+          <w:lang w:val="es-ES"/>
         </w:rPr>
         <w:t>{{NOMBRE}}</w:t>
       </w:r>
       <w:r>
         <w:rPr>
-          <w:color w:val="000000"/>
-          <w:sz w:val="24"/>
-          <w:szCs w:val="24"/>
+          <w:color w:val="000000" w:themeColor="text1"/>
+          <w:sz w:val="24"/>
+          <w:szCs w:val="24"/>
+          <w:lang w:val="es-ES"/>
         </w:rPr>
         <w:t xml:space="preserve">, mayor de edad, con DNI 45362114-L, y domicilio en calle Paraguay, 44, 35210, Telde, </w:t>
       </w:r>
@@ -108,6 +113,7 @@
           <w:color w:val="0070C0"/>
           <w:sz w:val="24"/>
           <w:szCs w:val="24"/>
+          <w:lang w:val="es-ES"/>
         </w:rPr>
         <w:t>en virtud de</w:t>
       </w:r>
@@ -116,32 +122,34 @@
           <w:color w:val="0070C0"/>
           <w:sz w:val="24"/>
           <w:szCs w:val="24"/>
+          <w:lang w:val="es-ES"/>
         </w:rPr>
         <w:t xml:space="preserve"> </w:t>
       </w:r>
-      <w:proofErr w:type="spellStart"/>
       <w:r>
         <w:rPr>
           <w:color w:val="0070C0"/>
           <w:sz w:val="24"/>
           <w:szCs w:val="24"/>
+          <w:lang w:val="es-ES"/>
         </w:rPr>
         <w:t>juju</w:t>
       </w:r>
-      <w:proofErr w:type="spellEnd"/>
       <w:r>
         <w:rPr>
           <w:color w:val="0070C0"/>
           <w:sz w:val="24"/>
           <w:szCs w:val="24"/>
+          <w:lang w:val="es-ES"/>
         </w:rPr>
         <w:t xml:space="preserve"> apoderamiento </w:t>
       </w:r>
       <w:r>
         <w:rPr>
-          <w:color w:val="000000"/>
-          <w:sz w:val="24"/>
-          <w:szCs w:val="24"/>
+          <w:color w:val="000000" w:themeColor="text1"/>
+          <w:sz w:val="24"/>
+          <w:szCs w:val="24"/>
+          <w:lang w:val="es-ES"/>
         </w:rPr>
         <w:t>“apud acta” que se conferirá en el juzgado en el momento procesal oportuno, y asistida por el Letrado D. Reinaldo Velázquez Quintana, como mejor proceda en Derecho comparezco y DIGO:</w:t>
       </w:r>
@@ -179,13 +187,15 @@
           <w:color w:val="000000" w:themeColor="text1"/>
           <w:sz w:val="24"/>
           <w:szCs w:val="24"/>
-        </w:rPr>
-      </w:pPr>
-      <w:r>
-        <w:rPr>
-          <w:color w:val="000000" w:themeColor="text1"/>
-          <w:sz w:val="24"/>
-          <w:szCs w:val="24"/>
+          <w:lang w:val="es-ES"/>
+        </w:rPr>
+      </w:pPr>
+      <w:r>
+        <w:rPr>
+          <w:color w:val="000000" w:themeColor="text1"/>
+          <w:sz w:val="24"/>
+          <w:szCs w:val="24"/>
+          <w:lang w:val="es-ES"/>
         </w:rPr>
         <w:t>{{Descripción accidente</w:t>
       </w:r>
@@ -194,26 +204,9 @@
           <w:color w:val="000000" w:themeColor="text1"/>
           <w:sz w:val="24"/>
           <w:szCs w:val="24"/>
-        </w:rPr>
-        <w:t xml:space="preserve"> [</w:t>
-      </w:r>
-      <w:proofErr w:type="spellStart"/>
-      <w:r>
-        <w:rPr>
-          <w:color w:val="000000" w:themeColor="text1"/>
-          <w:sz w:val="24"/>
-          <w:szCs w:val="24"/>
-        </w:rPr>
-        <w:t>select</w:t>
-      </w:r>
-      <w:proofErr w:type="spellEnd"/>
-      <w:r>
-        <w:rPr>
-          <w:color w:val="000000" w:themeColor="text1"/>
-          <w:sz w:val="24"/>
-          <w:szCs w:val="24"/>
-        </w:rPr>
-        <w:t>]</w:t>
+          <w:lang w:val="es-ES"/>
+        </w:rPr>
+        <w:t xml:space="preserve"> [select]</w:t>
       </w:r>
     </w:p>
     <w:p>
@@ -394,13 +387,15 @@
           <w:color w:val="000000" w:themeColor="text1"/>
           <w:sz w:val="24"/>
           <w:szCs w:val="24"/>
-        </w:rPr>
-      </w:pPr>
-      <w:r>
-        <w:rPr>
-          <w:color w:val="000000" w:themeColor="text1"/>
-          <w:sz w:val="24"/>
-          <w:szCs w:val="24"/>
+          <w:lang w:val="es-ES"/>
+        </w:rPr>
+      </w:pPr>
+      <w:r>
+        <w:rPr>
+          <w:color w:val="000000" w:themeColor="text1"/>
+          <w:sz w:val="24"/>
+          <w:szCs w:val="24"/>
+          <w:lang w:val="es-ES"/>
         </w:rPr>
         <w:t>{Autopista} {</w:t>
       </w:r>
@@ -410,54 +405,16 @@
           <w:sz w:val="24"/>
           <w:szCs w:val="24"/>
           <w:highlight w:val="green"/>
-        </w:rPr>
-        <w:t xml:space="preserve">Que, de forma repentina, vino desde el interior de la rotonda </w:t>
-      </w:r>
-      <w:proofErr w:type="spellStart"/>
-      <w:r>
-        <w:rPr>
-          <w:color w:val="000000" w:themeColor="text1"/>
-          <w:sz w:val="24"/>
-          <w:szCs w:val="24"/>
-          <w:highlight w:val="green"/>
-        </w:rPr>
-        <w:t>Daora</w:t>
-      </w:r>
-      <w:proofErr w:type="spellEnd"/>
-      <w:r>
-        <w:rPr>
-          <w:color w:val="000000" w:themeColor="text1"/>
-          <w:sz w:val="24"/>
-          <w:szCs w:val="24"/>
-          <w:highlight w:val="green"/>
-        </w:rPr>
-        <w:t xml:space="preserve"> el vehículo matrícula 8954-BKX, conducido por D. Francisco García Magariño y asegurado en Reale y, al incorporarse a la GC-10, golpeó, de forma </w:t>
-      </w:r>
-      <w:proofErr w:type="spellStart"/>
-      <w:r>
-        <w:rPr>
-          <w:color w:val="000000" w:themeColor="text1"/>
-          <w:sz w:val="24"/>
-          <w:szCs w:val="24"/>
-          <w:highlight w:val="green"/>
-        </w:rPr>
-        <w:t>fronto</w:t>
-      </w:r>
-      <w:proofErr w:type="spellEnd"/>
-      <w:r>
-        <w:rPr>
-          <w:color w:val="000000" w:themeColor="text1"/>
-          <w:sz w:val="24"/>
-          <w:szCs w:val="24"/>
-          <w:highlight w:val="green"/>
-        </w:rPr>
-        <w:t>-angular, el lateral del vehículo de mi mandante que, habiendo sufrido daños materiales, fueron ya reparados por convenio entre las entidades aseguradoras</w:t>
-      </w:r>
-      <w:r>
-        <w:rPr>
-          <w:color w:val="000000" w:themeColor="text1"/>
-          <w:sz w:val="24"/>
-          <w:szCs w:val="24"/>
+          <w:lang w:val="es-ES"/>
+        </w:rPr>
+        <w:t>Que, de forma repentina, vino desde el interior de la rotonda Daora el vehículo matrícula 8954-BKX, conducido por D. Francisco García Magariño y asegurado en Reale y, al incorporarse a la GC-10, golpeó, de forma fronto-angular, el lateral del vehículo de mi mandante que, habiendo sufrido daños materiales, fueron ya reparados por convenio entre las entidades aseguradoras</w:t>
+      </w:r>
+      <w:r>
+        <w:rPr>
+          <w:color w:val="000000" w:themeColor="text1"/>
+          <w:sz w:val="24"/>
+          <w:szCs w:val="24"/>
+          <w:lang w:val="es-ES"/>
         </w:rPr>
         <w:t>.</w:t>
       </w:r>
@@ -466,6 +423,7 @@
           <w:color w:val="000000" w:themeColor="text1"/>
           <w:sz w:val="24"/>
           <w:szCs w:val="24"/>
+          <w:lang w:val="es-ES"/>
         </w:rPr>
         <w:t>}</w:t>
       </w:r>
@@ -541,21 +499,24 @@
           <w:right w:val="nil"/>
           <w:between w:val="nil"/>
         </w:pBdr>
+        <w:spacing w:line="259" w:lineRule="auto"/>
         <w:ind w:left="2" w:right="136" w:firstLine="707"/>
         <w:jc w:val="both"/>
         <w:rPr>
           <w:color w:val="000000" w:themeColor="text1"/>
           <w:sz w:val="24"/>
           <w:szCs w:val="24"/>
-        </w:rPr>
-      </w:pPr>
-      <w:r>
-        <w:rPr>
-          <w:b/>
-          <w:bCs/>
-          <w:color w:val="000000" w:themeColor="text1"/>
-          <w:sz w:val="24"/>
-          <w:szCs w:val="24"/>
+          <w:lang w:val="es-ES"/>
+        </w:rPr>
+      </w:pPr>
+      <w:r>
+        <w:rPr>
+          <w:b/>
+          <w:bCs/>
+          <w:color w:val="000000" w:themeColor="text1"/>
+          <w:sz w:val="24"/>
+          <w:szCs w:val="24"/>
+          <w:lang w:val="es-ES"/>
         </w:rPr>
         <w:t>SEGUNDO</w:t>
       </w:r>
@@ -564,14 +525,90 @@
           <w:color w:val="000000" w:themeColor="text1"/>
           <w:sz w:val="24"/>
           <w:szCs w:val="24"/>
-        </w:rPr>
-        <w:t>.- A consecuencia del referido accidente, mi representada sufrió</w:t>
-      </w:r>
-      <w:r>
-        <w:rPr>
-          <w:color w:val="000000" w:themeColor="text1"/>
-          <w:sz w:val="24"/>
-          <w:szCs w:val="24"/>
+          <w:lang w:val="es-ES"/>
+        </w:rPr>
+        <w:t xml:space="preserve">.- A consecuencia del referido accidente, mi representada sufrió lesiones de diversa consideración, siendo </w:t>
+      </w:r>
+      <w:r>
+        <w:rPr>
+          <w:b/>
+          <w:bCs/>
+          <w:color w:val="000000" w:themeColor="text1"/>
+          <w:sz w:val="24"/>
+          <w:szCs w:val="24"/>
+          <w:u w:val="single"/>
+          <w:lang w:val="es-ES"/>
+        </w:rPr>
+        <w:t>que tardó en curar</w:t>
+      </w:r>
+      <w:r>
+        <w:rPr>
+          <w:b/>
+          <w:bCs/>
+          <w:color w:val="000000" w:themeColor="text1"/>
+          <w:sz w:val="24"/>
+          <w:szCs w:val="24"/>
+          <w:u w:val="single"/>
+          <w:lang w:val="es-ES"/>
+        </w:rPr>
+        <w:t xml:space="preserve"> {{Días de perjuicio totales [date </w:t>
+      </w:r>
+      <w:proofErr w:type="spellStart"/>
+      <w:r>
+        <w:rPr>
+          <w:b/>
+          <w:bCs/>
+          <w:color w:val="000000" w:themeColor="text1"/>
+          <w:sz w:val="24"/>
+          <w:szCs w:val="24"/>
+          <w:u w:val="single"/>
+          <w:lang w:val="es-ES"/>
+        </w:rPr>
+        <w:t>range</w:t>
+      </w:r>
+      <w:proofErr w:type="spellEnd"/>
+      <w:r>
+        <w:rPr>
+          <w:b/>
+          <w:bCs/>
+          <w:color w:val="000000" w:themeColor="text1"/>
+          <w:sz w:val="24"/>
+          <w:szCs w:val="24"/>
+          <w:u w:val="single"/>
+          <w:lang w:val="es-ES"/>
+        </w:rPr>
+        <w:t>]</w:t>
+      </w:r>
+      <w:r>
+        <w:rPr>
+          <w:b/>
+          <w:bCs/>
+          <w:color w:val="000000" w:themeColor="text1"/>
+          <w:sz w:val="24"/>
+          <w:szCs w:val="24"/>
+          <w:u w:val="single"/>
+          <w:lang w:val="es-ES"/>
+        </w:rPr>
+        <w:t>}}</w:t>
+      </w:r>
+      <w:r>
+        <w:rPr>
+          <w:b/>
+          <w:bCs/>
+          <w:color w:val="000000" w:themeColor="text1"/>
+          <w:sz w:val="24"/>
+          <w:szCs w:val="24"/>
+          <w:u w:val="single"/>
+          <w:lang w:val="es-ES"/>
+        </w:rPr>
+        <w:t xml:space="preserve"> días</w:t>
+      </w:r>
+      <w:r>
+        <w:rPr>
+          <w:color w:val="000000" w:themeColor="text1"/>
+          <w:sz w:val="24"/>
+          <w:szCs w:val="24"/>
+          <w:lang w:val="es-ES"/>
         </w:rPr>
         <w:t xml:space="preserve"> </w:t>
       </w:r>
@@ -580,237 +617,244 @@
           <w:color w:val="000000" w:themeColor="text1"/>
           <w:sz w:val="24"/>
           <w:szCs w:val="24"/>
-        </w:rPr>
-        <w:t xml:space="preserve">lesiones de diversa consideración, siendo </w:t>
-      </w:r>
-      <w:r>
-        <w:rPr>
-          <w:b/>
-          <w:bCs/>
+          <w:lang w:val="es-ES"/>
+        </w:rPr>
+        <w:t xml:space="preserve">(desde el día del accidente, esto es desde el </w:t>
+      </w:r>
+      <w:r>
+        <w:rPr>
+          <w:color w:val="000000" w:themeColor="text1"/>
+          <w:sz w:val="24"/>
+          <w:szCs w:val="24"/>
+          <w:lang w:val="es-ES"/>
+        </w:rPr>
+        <w:t xml:space="preserve">{{Días de perjuicio totales: </w:t>
+      </w:r>
+      <w:proofErr w:type="spellStart"/>
+      <w:r>
+        <w:rPr>
+          <w:color w:val="000000" w:themeColor="text1"/>
+          <w:sz w:val="24"/>
+          <w:szCs w:val="24"/>
+          <w:lang w:val="es-ES"/>
+        </w:rPr>
+        <w:t>start</w:t>
+      </w:r>
+      <w:proofErr w:type="spellEnd"/>
+      <w:r>
+        <w:rPr>
+          <w:color w:val="000000" w:themeColor="text1"/>
+          <w:sz w:val="24"/>
+          <w:szCs w:val="24"/>
+          <w:lang w:val="es-ES"/>
+        </w:rPr>
+        <w:t>}}</w:t>
+      </w:r>
+      <w:r>
+        <w:rPr>
+          <w:color w:val="000000" w:themeColor="text1"/>
+          <w:sz w:val="24"/>
+          <w:szCs w:val="24"/>
+          <w:lang w:val="es-ES"/>
+        </w:rPr>
+        <w:t xml:space="preserve"> y hasta el </w:t>
+      </w:r>
+      <w:r>
+        <w:rPr>
+          <w:color w:val="000000" w:themeColor="text1"/>
+          <w:sz w:val="24"/>
+          <w:szCs w:val="24"/>
+          <w:lang w:val="es-ES"/>
+        </w:rPr>
+        <w:t xml:space="preserve">{{Días de perjuicio totales: </w:t>
+      </w:r>
+      <w:proofErr w:type="spellStart"/>
+      <w:r>
+        <w:rPr>
+          <w:color w:val="000000" w:themeColor="text1"/>
+          <w:sz w:val="24"/>
+          <w:szCs w:val="24"/>
+          <w:lang w:val="es-ES"/>
+        </w:rPr>
+        <w:t>end</w:t>
+      </w:r>
+      <w:proofErr w:type="spellEnd"/>
+      <w:r>
+        <w:rPr>
+          <w:color w:val="000000" w:themeColor="text1"/>
+          <w:sz w:val="24"/>
+          <w:szCs w:val="24"/>
+          <w:lang w:val="es-ES"/>
+        </w:rPr>
+        <w:t>}}</w:t>
+      </w:r>
+      <w:r>
+        <w:rPr>
+          <w:color w:val="000000" w:themeColor="text1"/>
+          <w:sz w:val="24"/>
+          <w:szCs w:val="24"/>
+          <w:lang w:val="es-ES"/>
+        </w:rPr>
+        <w:t>, fecha ésta última en la que recibió la última sesión de rehabilitación, ambos inclusive)</w:t>
+      </w:r>
+      <w:r>
+        <w:rPr>
+          <w:color w:val="000000" w:themeColor="text1"/>
+          <w:sz w:val="24"/>
+          <w:szCs w:val="24"/>
+          <w:lang w:val="es-ES"/>
+        </w:rPr>
+        <w:t xml:space="preserve">, de los cuales </w:t>
+      </w:r>
+      <w:r>
+        <w:rPr>
           <w:color w:val="000000" w:themeColor="text1"/>
           <w:sz w:val="24"/>
           <w:szCs w:val="24"/>
           <w:u w:val="single"/>
-        </w:rPr>
-        <w:t xml:space="preserve">que tardó en curar </w:t>
-      </w:r>
-      <w:r>
-        <w:rPr>
-          <w:b/>
-          <w:bCs/>
+          <w:lang w:val="es-ES"/>
+        </w:rPr>
+        <w:t>{{Días de perjuicio moderado [</w:t>
+      </w:r>
+      <w:proofErr w:type="spellStart"/>
+      <w:r>
+        <w:rPr>
           <w:color w:val="000000" w:themeColor="text1"/>
           <w:sz w:val="24"/>
           <w:szCs w:val="24"/>
           <w:u w:val="single"/>
-        </w:rPr>
-        <w:t>{{CALC: Días de perjuicio moderado + Días de perjuicio básico</w:t>
-      </w:r>
-      <w:r>
-        <w:rPr>
-          <w:b/>
-          <w:bCs/>
+          <w:lang w:val="es-ES"/>
+        </w:rPr>
+        <w:t>int</w:t>
+      </w:r>
+      <w:proofErr w:type="spellEnd"/>
+      <w:r>
+        <w:rPr>
           <w:color w:val="000000" w:themeColor="text1"/>
           <w:sz w:val="24"/>
           <w:szCs w:val="24"/>
           <w:u w:val="single"/>
+          <w:lang w:val="es-ES"/>
+        </w:rPr>
+        <w:t xml:space="preserve">]}} </w:t>
+      </w:r>
+      <w:r>
+        <w:rPr>
+          <w:color w:val="000000" w:themeColor="text1"/>
+          <w:sz w:val="24"/>
+          <w:szCs w:val="24"/>
+          <w:u w:val="single"/>
+          <w:lang w:val="es-ES"/>
+        </w:rPr>
+        <w:t>lo fueron de perjuicio personal particular moderado</w:t>
+      </w:r>
+      <w:r>
+        <w:rPr>
+          <w:color w:val="000000" w:themeColor="text1"/>
+          <w:sz w:val="24"/>
+          <w:szCs w:val="24"/>
+          <w:lang w:val="es-ES"/>
+        </w:rPr>
+        <w:t xml:space="preserve"> </w:t>
+      </w:r>
+      <w:r>
+        <w:rPr>
+          <w:color w:val="000000" w:themeColor="text1"/>
+          <w:sz w:val="24"/>
+          <w:szCs w:val="24"/>
+          <w:highlight w:val="yellow"/>
+          <w:lang w:val="es-ES"/>
+        </w:rPr>
+        <w:t>(al haber requerido baja laboral durante dicho periodo, comprendiendo desde el 16/01/24 al 22/01/24 tras el accidente y desde el 30/01/24 hasta el 20/02/24 su baja laboral por recaída</w:t>
+      </w:r>
+      <w:r>
+        <w:rPr>
+          <w:color w:val="000000" w:themeColor="text1"/>
+          <w:sz w:val="24"/>
+          <w:szCs w:val="24"/>
+          <w:lang w:val="es-ES"/>
+        </w:rPr>
+        <w:t xml:space="preserve">) y </w:t>
+      </w:r>
+      <w:r>
+        <w:rPr>
+          <w:color w:val="000000" w:themeColor="text1"/>
+          <w:sz w:val="24"/>
+          <w:szCs w:val="24"/>
+          <w:u w:val="single"/>
+          <w:lang w:val="es-ES"/>
+        </w:rPr>
+        <w:t>{{</w:t>
+      </w:r>
+      <w:r>
+        <w:rPr>
+          <w:color w:val="000000" w:themeColor="text1"/>
+          <w:sz w:val="24"/>
+          <w:szCs w:val="24"/>
+          <w:u w:val="single"/>
+          <w:lang w:val="es-ES"/>
+        </w:rPr>
+        <w:t xml:space="preserve">CALC: </w:t>
+      </w:r>
+      <w:r>
+        <w:rPr>
+          <w:color w:val="000000" w:themeColor="text1"/>
+          <w:sz w:val="24"/>
+          <w:szCs w:val="24"/>
+          <w:u w:val="single"/>
+          <w:lang w:val="es-ES"/>
+        </w:rPr>
+        <w:t xml:space="preserve">Días de perjuicio </w:t>
+      </w:r>
+      <w:r>
+        <w:rPr>
+          <w:color w:val="000000" w:themeColor="text1"/>
+          <w:sz w:val="24"/>
+          <w:szCs w:val="24"/>
+          <w:u w:val="single"/>
+          <w:lang w:val="es-ES"/>
+        </w:rPr>
+        <w:t>totales - Días de perjuicio moderado</w:t>
+      </w:r>
+      <w:r>
+        <w:rPr>
+          <w:color w:val="000000" w:themeColor="text1"/>
+          <w:sz w:val="24"/>
+          <w:szCs w:val="24"/>
+          <w:u w:val="single"/>
+          <w:lang w:val="es-ES"/>
         </w:rPr>
         <w:t xml:space="preserve"> [</w:t>
       </w:r>
       <w:proofErr w:type="spellStart"/>
       <w:r>
         <w:rPr>
-          <w:b/>
-          <w:bCs/>
           <w:color w:val="000000" w:themeColor="text1"/>
           <w:sz w:val="24"/>
           <w:szCs w:val="24"/>
           <w:u w:val="single"/>
+          <w:lang w:val="es-ES"/>
         </w:rPr>
         <w:t>int</w:t>
       </w:r>
       <w:proofErr w:type="spellEnd"/>
       <w:r>
         <w:rPr>
-          <w:b/>
-          <w:bCs/>
           <w:color w:val="000000" w:themeColor="text1"/>
           <w:sz w:val="24"/>
           <w:szCs w:val="24"/>
           <w:u w:val="single"/>
-        </w:rPr>
-        <w:t>]</w:t>
-      </w:r>
-      <w:r>
-        <w:rPr>
-          <w:b/>
-          <w:bCs/>
+          <w:lang w:val="es-ES"/>
+        </w:rPr>
+        <w:t xml:space="preserve">]}} </w:t>
+      </w:r>
+      <w:r>
+        <w:rPr>
           <w:color w:val="000000" w:themeColor="text1"/>
           <w:sz w:val="24"/>
           <w:szCs w:val="24"/>
           <w:u w:val="single"/>
-        </w:rPr>
-        <w:t xml:space="preserve">}} </w:t>
-      </w:r>
-      <w:r>
-        <w:rPr>
-          <w:b/>
-          <w:bCs/>
-          <w:color w:val="000000" w:themeColor="text1"/>
-          <w:sz w:val="24"/>
-          <w:szCs w:val="24"/>
-          <w:u w:val="single"/>
-        </w:rPr>
-        <w:t xml:space="preserve"> días</w:t>
-      </w:r>
-      <w:r>
-        <w:rPr>
-          <w:color w:val="000000" w:themeColor="text1"/>
-          <w:sz w:val="24"/>
-          <w:szCs w:val="24"/>
-        </w:rPr>
-        <w:t xml:space="preserve"> (</w:t>
-      </w:r>
-      <w:r>
-        <w:rPr>
-          <w:color w:val="000000" w:themeColor="text1"/>
-          <w:sz w:val="24"/>
-          <w:szCs w:val="24"/>
-          <w:highlight w:val="yellow"/>
-        </w:rPr>
-        <w:t>desde el día del accidente, esto es desde el 15/01/24 y hasta el 13/08/24, fecha ésta última en la que recibió la última sesión de rehabilitación, ambos inclusive</w:t>
-      </w:r>
-      <w:r>
-        <w:rPr>
-          <w:color w:val="000000" w:themeColor="text1"/>
-          <w:sz w:val="24"/>
-          <w:szCs w:val="24"/>
-        </w:rPr>
-        <w:t xml:space="preserve">), de los </w:t>
-      </w:r>
-      <w:r>
-        <w:rPr>
-          <w:color w:val="000000" w:themeColor="text1"/>
-          <w:sz w:val="24"/>
-          <w:szCs w:val="24"/>
-        </w:rPr>
-        <w:t xml:space="preserve">cuales </w:t>
-      </w:r>
-      <w:r>
-        <w:rPr>
-          <w:color w:val="000000" w:themeColor="text1"/>
-          <w:sz w:val="24"/>
-          <w:szCs w:val="24"/>
-          <w:u w:val="single"/>
-        </w:rPr>
-        <w:t>{{Días de perjuicio moderado [</w:t>
-      </w:r>
-      <w:r>
-        <w:rPr>
-          <w:color w:val="000000" w:themeColor="text1"/>
-          <w:sz w:val="24"/>
-          <w:szCs w:val="24"/>
-          <w:u w:val="single"/>
-        </w:rPr>
-        <w:t>date-</w:t>
-      </w:r>
-      <w:proofErr w:type="spellStart"/>
-      <w:r>
-        <w:rPr>
-          <w:color w:val="000000" w:themeColor="text1"/>
-          <w:sz w:val="24"/>
-          <w:szCs w:val="24"/>
-          <w:u w:val="single"/>
-        </w:rPr>
-        <w:t>range</w:t>
-      </w:r>
-      <w:proofErr w:type="spellEnd"/>
-      <w:r>
-        <w:rPr>
-          <w:color w:val="000000" w:themeColor="text1"/>
-          <w:sz w:val="24"/>
-          <w:szCs w:val="24"/>
-          <w:u w:val="single"/>
-        </w:rPr>
-        <w:t xml:space="preserve">]}} </w:t>
-      </w:r>
-      <w:r>
-        <w:rPr>
-          <w:color w:val="000000" w:themeColor="text1"/>
-          <w:sz w:val="24"/>
-          <w:szCs w:val="24"/>
-          <w:u w:val="single"/>
-        </w:rPr>
-        <w:t>lo fueron de perjuicio personal particular moderado</w:t>
-      </w:r>
-      <w:r>
-        <w:rPr>
-          <w:color w:val="000000" w:themeColor="text1"/>
-          <w:sz w:val="24"/>
-          <w:szCs w:val="24"/>
-        </w:rPr>
-        <w:t xml:space="preserve"> (</w:t>
-      </w:r>
-      <w:r>
-        <w:rPr>
-          <w:color w:val="000000" w:themeColor="text1"/>
-          <w:sz w:val="24"/>
-          <w:szCs w:val="24"/>
-          <w:highlight w:val="green"/>
-        </w:rPr>
-        <w:t>al haber requerido baja laboral durante dicho periodo, comprendiendo desde el 16/01/24 al 22/01/24 tras el accidente y desde el 30/01/24 hasta el 20/02/24 su baja laboral por recaída</w:t>
-      </w:r>
-      <w:r>
-        <w:rPr>
-          <w:color w:val="000000" w:themeColor="text1"/>
-          <w:sz w:val="24"/>
-          <w:szCs w:val="24"/>
-        </w:rPr>
-        <w:t xml:space="preserve">) y </w:t>
-      </w:r>
-      <w:r>
-        <w:rPr>
-          <w:color w:val="000000" w:themeColor="text1"/>
-          <w:sz w:val="24"/>
-          <w:szCs w:val="24"/>
-          <w:u w:val="single"/>
-        </w:rPr>
-        <w:t>{{Días de perjuicio básico [</w:t>
-      </w:r>
-      <w:r>
-        <w:rPr>
-          <w:color w:val="000000" w:themeColor="text1"/>
-          <w:sz w:val="24"/>
-          <w:szCs w:val="24"/>
-          <w:u w:val="single"/>
-        </w:rPr>
-        <w:t>date-</w:t>
-      </w:r>
-      <w:proofErr w:type="spellStart"/>
-      <w:r>
-        <w:rPr>
-          <w:color w:val="000000" w:themeColor="text1"/>
-          <w:sz w:val="24"/>
-          <w:szCs w:val="24"/>
-          <w:u w:val="single"/>
-        </w:rPr>
-        <w:t>range</w:t>
-      </w:r>
-      <w:proofErr w:type="spellEnd"/>
-      <w:r>
-        <w:rPr>
-          <w:color w:val="000000" w:themeColor="text1"/>
-          <w:sz w:val="24"/>
-          <w:szCs w:val="24"/>
-          <w:u w:val="single"/>
-        </w:rPr>
-        <w:t xml:space="preserve">]}} </w:t>
-      </w:r>
-      <w:r>
-        <w:rPr>
-          <w:color w:val="000000" w:themeColor="text1"/>
-          <w:sz w:val="24"/>
-          <w:szCs w:val="24"/>
-          <w:u w:val="single"/>
+          <w:lang w:val="es-ES"/>
         </w:rPr>
         <w:t>lo fueron de perjuicio personal básico</w:t>
       </w:r>
@@ -819,40 +863,9 @@
           <w:color w:val="000000" w:themeColor="text1"/>
           <w:sz w:val="24"/>
           <w:szCs w:val="24"/>
-        </w:rPr>
-        <w:t xml:space="preserve"> (computados desde el día del accidente y hasta el día en que recibió su</w:t>
-      </w:r>
-      <w:r>
-        <w:rPr>
-          <w:color w:val="000000" w:themeColor="text1"/>
-          <w:sz w:val="24"/>
-          <w:szCs w:val="24"/>
-        </w:rPr>
-        <w:t xml:space="preserve"> </w:t>
-      </w:r>
-      <w:r>
-        <w:rPr>
-          <w:color w:val="000000" w:themeColor="text1"/>
-          <w:sz w:val="24"/>
-          <w:szCs w:val="24"/>
-        </w:rPr>
-        <w:t>última sesión de rehabilitación, por descontado el periodo en que estuvo de baja</w:t>
-      </w:r>
-      <w:r>
-        <w:rPr>
-          <w:color w:val="000000" w:themeColor="text1"/>
-          <w:sz w:val="24"/>
-          <w:szCs w:val="24"/>
-        </w:rPr>
-        <w:t xml:space="preserve"> </w:t>
-      </w:r>
-      <w:r>
-        <w:rPr>
-          <w:color w:val="000000" w:themeColor="text1"/>
-          <w:sz w:val="24"/>
-          <w:szCs w:val="24"/>
-        </w:rPr>
-        <w:t>laboral- ya computados como días moderados-), no quedándole secuelas.</w:t>
+          <w:lang w:val="es-ES"/>
+        </w:rPr>
+        <w:t xml:space="preserve"> (computados desde el día del accidente y hasta el día en que recibió su última sesión de rehabilitación, por descontado el periodo en que estuvo de baja laboral- ya computados como días moderados-), no quedándole secuelas.</w:t>
       </w:r>
     </w:p>
     <w:p>
@@ -1403,33 +1416,53 @@
         </w:rPr>
         <w:t xml:space="preserve">visor </w:t>
       </w:r>
+      <w:r>
+        <w:rPr>
+          <w:color w:val="000000" w:themeColor="text1"/>
+          <w:sz w:val="24"/>
+          <w:szCs w:val="24"/>
+        </w:rPr>
+        <w:t>IDEcanarias</w:t>
+      </w:r>
+      <w:r>
+        <w:rPr>
+          <w:color w:val="000000" w:themeColor="text1"/>
+          <w:sz w:val="24"/>
+          <w:szCs w:val="24"/>
+        </w:rPr>
+        <w:t>} {</w:t>
+      </w:r>
+      <w:r>
+        <w:rPr>
+          <w:b/>
+          <w:bCs/>
+          <w:color w:val="000000" w:themeColor="text1"/>
+          <w:sz w:val="24"/>
+          <w:szCs w:val="24"/>
+        </w:rPr>
+        <w:t xml:space="preserve">documento </w:t>
+      </w:r>
       <w:proofErr w:type="spellStart"/>
       <w:r>
         <w:rPr>
-          <w:color w:val="000000" w:themeColor="text1"/>
-          <w:sz w:val="24"/>
-          <w:szCs w:val="24"/>
-        </w:rPr>
-        <w:t>IDEcanarias</w:t>
+          <w:b/>
+          <w:bCs/>
+          <w:color w:val="000000" w:themeColor="text1"/>
+          <w:sz w:val="24"/>
+          <w:szCs w:val="24"/>
+        </w:rPr>
+        <w:t>nº</w:t>
       </w:r>
       <w:proofErr w:type="spellEnd"/>
       <w:r>
         <w:rPr>
-          <w:color w:val="000000" w:themeColor="text1"/>
-          <w:sz w:val="24"/>
-          <w:szCs w:val="24"/>
-        </w:rPr>
-        <w:t>} {</w:t>
-      </w:r>
-      <w:r>
-        <w:rPr>
-          <w:b/>
-          <w:bCs/>
-          <w:color w:val="000000" w:themeColor="text1"/>
-          <w:sz w:val="24"/>
-          <w:szCs w:val="24"/>
-        </w:rPr>
-        <w:t xml:space="preserve">documento </w:t>
+          <w:b/>
+          <w:bCs/>
+          <w:color w:val="000000" w:themeColor="text1"/>
+          <w:sz w:val="24"/>
+          <w:szCs w:val="24"/>
+        </w:rPr>
+        <w:t xml:space="preserve"> [</w:t>
       </w:r>
       <w:proofErr w:type="spellStart"/>
       <w:r>
@@ -1440,7 +1473,7 @@
           <w:sz w:val="24"/>
           <w:szCs w:val="24"/>
         </w:rPr>
-        <w:t>nº</w:t>
+        <w:t>num</w:t>
       </w:r>
       <w:proofErr w:type="spellEnd"/>
       <w:r>
@@ -1451,28 +1484,6 @@
           <w:sz w:val="24"/>
           <w:szCs w:val="24"/>
         </w:rPr>
-        <w:t xml:space="preserve"> [</w:t>
-      </w:r>
-      <w:proofErr w:type="spellStart"/>
-      <w:r>
-        <w:rPr>
-          <w:b/>
-          <w:bCs/>
-          <w:color w:val="000000" w:themeColor="text1"/>
-          <w:sz w:val="24"/>
-          <w:szCs w:val="24"/>
-        </w:rPr>
-        <w:t>num</w:t>
-      </w:r>
-      <w:proofErr w:type="spellEnd"/>
-      <w:r>
-        <w:rPr>
-          <w:b/>
-          <w:bCs/>
-          <w:color w:val="000000" w:themeColor="text1"/>
-          <w:sz w:val="24"/>
-          <w:szCs w:val="24"/>
-        </w:rPr>
         <w:t xml:space="preserve"> </w:t>
       </w:r>
       <w:r>
@@ -1492,9 +1503,8 @@
           <w:highlight w:val="yellow"/>
           <w:lang w:val="es-ES"/>
         </w:rPr>
-        <w:t xml:space="preserve">Situación visor </w:t>
-      </w:r>
-      <w:proofErr w:type="spellStart"/>
+        <w:t>Situación visor IDECanarias</w:t>
+      </w:r>
       <w:r>
         <w:rPr>
           <w:color w:val="000000" w:themeColor="text1"/>
@@ -1503,74 +1513,43 @@
           <w:highlight w:val="yellow"/>
           <w:lang w:val="es-ES"/>
         </w:rPr>
-        <w:t>IDECanarias</w:t>
-      </w:r>
-      <w:proofErr w:type="spellEnd"/>
+        <w:t>.</w:t>
+      </w:r>
+      <w:r>
+        <w:rPr>
+          <w:color w:val="000000" w:themeColor="text1"/>
+          <w:sz w:val="24"/>
+          <w:szCs w:val="24"/>
+          <w:lang w:val="es-ES"/>
+        </w:rPr>
+        <w:t>}</w:t>
+      </w:r>
+      <w:r>
+        <w:rPr>
+          <w:b/>
+          <w:bCs/>
+          <w:color w:val="000000" w:themeColor="text1"/>
+          <w:sz w:val="24"/>
+          <w:szCs w:val="24"/>
+        </w:rPr>
+        <w:t>]</w:t>
+      </w:r>
+      <w:r>
+        <w:rPr>
+          <w:color w:val="000000" w:themeColor="text1"/>
+          <w:sz w:val="24"/>
+          <w:szCs w:val="24"/>
+        </w:rPr>
+        <w:t xml:space="preserve">, </w:t>
+      </w:r>
       <w:r>
         <w:rPr>
           <w:color w:val="000000" w:themeColor="text1"/>
           <w:sz w:val="24"/>
           <w:szCs w:val="24"/>
           <w:highlight w:val="yellow"/>
-          <w:lang w:val="es-ES"/>
-        </w:rPr>
-        <w:t>.</w:t>
-      </w:r>
-      <w:r>
-        <w:rPr>
-          <w:color w:val="000000" w:themeColor="text1"/>
-          <w:sz w:val="24"/>
-          <w:szCs w:val="24"/>
-          <w:lang w:val="es-ES"/>
-        </w:rPr>
-        <w:t>}</w:t>
-      </w:r>
-      <w:r>
-        <w:rPr>
-          <w:b/>
-          <w:bCs/>
-          <w:color w:val="000000" w:themeColor="text1"/>
-          <w:sz w:val="24"/>
-          <w:szCs w:val="24"/>
-        </w:rPr>
-        <w:t>]</w:t>
-      </w:r>
-      <w:r>
-        <w:rPr>
-          <w:color w:val="000000" w:themeColor="text1"/>
-          <w:sz w:val="24"/>
-          <w:szCs w:val="24"/>
-        </w:rPr>
-        <w:t xml:space="preserve">, </w:t>
-      </w:r>
-      <w:r>
-        <w:rPr>
-          <w:color w:val="000000" w:themeColor="text1"/>
-          <w:sz w:val="24"/>
-          <w:szCs w:val="24"/>
-          <w:highlight w:val="yellow"/>
-        </w:rPr>
-        <w:t xml:space="preserve">visor </w:t>
-      </w:r>
-      <w:proofErr w:type="spellStart"/>
-      <w:r>
-        <w:rPr>
-          <w:color w:val="000000" w:themeColor="text1"/>
-          <w:sz w:val="24"/>
-          <w:szCs w:val="24"/>
-          <w:highlight w:val="yellow"/>
-        </w:rPr>
-        <w:t>IDECanarias</w:t>
-      </w:r>
-      <w:proofErr w:type="spellEnd"/>
-      <w:r>
-        <w:rPr>
-          <w:color w:val="000000" w:themeColor="text1"/>
-          <w:sz w:val="24"/>
-          <w:szCs w:val="24"/>
-          <w:highlight w:val="yellow"/>
-        </w:rPr>
-        <w:t xml:space="preserve"> que muestra</w:t>
+        </w:rPr>
+        <w:t>visor IDECanarias que muestra</w:t>
       </w:r>
       <w:r>
         <w:rPr>
@@ -1804,42 +1783,35 @@
           <w:color w:val="000000" w:themeColor="text1"/>
           <w:sz w:val="24"/>
           <w:szCs w:val="24"/>
-        </w:rPr>
-      </w:pPr>
-      <w:r>
-        <w:rPr>
-          <w:color w:val="000000" w:themeColor="text1"/>
-          <w:sz w:val="24"/>
-          <w:szCs w:val="24"/>
-        </w:rPr>
-        <w:lastRenderedPageBreak/>
-        <w:t xml:space="preserve">Se acompaña </w:t>
-      </w:r>
-      <w:r>
-        <w:rPr>
-          <w:color w:val="000000" w:themeColor="text1"/>
-          <w:sz w:val="24"/>
-          <w:szCs w:val="24"/>
-        </w:rPr>
-        <w:t>{{Relación documentos secundaria [</w:t>
-      </w:r>
-      <w:proofErr w:type="spellStart"/>
+          <w:lang w:val="es-ES"/>
+        </w:rPr>
+      </w:pPr>
+      <w:r>
+        <w:rPr>
+          <w:color w:val="000000" w:themeColor="text1"/>
+          <w:sz w:val="24"/>
+          <w:szCs w:val="24"/>
+          <w:lang w:val="es-ES"/>
+        </w:rPr>
+        <w:t>Se acompaña {{Relación documentos secundaria [</w:t>
+      </w:r>
       <w:proofErr w:type="gramStart"/>
       <w:r>
         <w:rPr>
           <w:color w:val="000000" w:themeColor="text1"/>
           <w:sz w:val="24"/>
           <w:szCs w:val="24"/>
+          <w:lang w:val="es-ES"/>
         </w:rPr>
         <w:t>checkbox:autowrap</w:t>
       </w:r>
-      <w:proofErr w:type="spellEnd"/>
       <w:proofErr w:type="gramEnd"/>
       <w:r>
         <w:rPr>
           <w:color w:val="000000" w:themeColor="text1"/>
           <w:sz w:val="24"/>
           <w:szCs w:val="24"/>
+          <w:lang w:val="es-ES"/>
         </w:rPr>
         <w:t xml:space="preserve">] </w:t>
       </w:r>
@@ -1859,75 +1831,37 @@
           <w:color w:val="000000" w:themeColor="text1"/>
           <w:sz w:val="24"/>
           <w:szCs w:val="24"/>
-        </w:rPr>
-      </w:pPr>
-      <w:r>
-        <w:rPr>
-          <w:color w:val="000000" w:themeColor="text1"/>
-          <w:sz w:val="24"/>
-          <w:szCs w:val="24"/>
-        </w:rPr>
-        <w:t>{Perito médico} {</w:t>
-      </w:r>
-      <w:r>
-        <w:rPr>
-          <w:color w:val="000000" w:themeColor="text1"/>
-          <w:sz w:val="24"/>
-          <w:szCs w:val="24"/>
-        </w:rPr>
-        <w:t xml:space="preserve">documentación médica asistencial, </w:t>
-      </w:r>
-      <w:r>
-        <w:rPr>
-          <w:b/>
-          <w:bCs/>
-          <w:color w:val="000000" w:themeColor="text1"/>
-          <w:sz w:val="24"/>
-          <w:szCs w:val="24"/>
-        </w:rPr>
-        <w:t xml:space="preserve">como bloque de documentos </w:t>
-      </w:r>
-      <w:proofErr w:type="spellStart"/>
-      <w:r>
-        <w:rPr>
-          <w:b/>
-          <w:bCs/>
-          <w:color w:val="000000" w:themeColor="text1"/>
-          <w:sz w:val="24"/>
-          <w:szCs w:val="24"/>
-        </w:rPr>
-        <w:t>nº</w:t>
-      </w:r>
-      <w:proofErr w:type="spellEnd"/>
-      <w:r>
-        <w:rPr>
-          <w:b/>
-          <w:bCs/>
-          <w:color w:val="000000" w:themeColor="text1"/>
-          <w:sz w:val="24"/>
-          <w:szCs w:val="24"/>
-        </w:rPr>
-        <w:t xml:space="preserve"> [</w:t>
-      </w:r>
-      <w:proofErr w:type="spellStart"/>
-      <w:r>
-        <w:rPr>
-          <w:b/>
-          <w:bCs/>
-          <w:color w:val="000000" w:themeColor="text1"/>
-          <w:sz w:val="24"/>
-          <w:szCs w:val="24"/>
-        </w:rPr>
-        <w:t>num</w:t>
-      </w:r>
-      <w:proofErr w:type="spellEnd"/>
-      <w:r>
-        <w:rPr>
-          <w:b/>
-          <w:bCs/>
-          <w:color w:val="000000" w:themeColor="text1"/>
-          <w:sz w:val="24"/>
-          <w:szCs w:val="24"/>
+          <w:lang w:val="es-ES"/>
+        </w:rPr>
+      </w:pPr>
+      <w:r>
+        <w:rPr>
+          <w:color w:val="000000" w:themeColor="text1"/>
+          <w:sz w:val="24"/>
+          <w:szCs w:val="24"/>
+          <w:lang w:val="es-ES"/>
+        </w:rPr>
+        <w:t xml:space="preserve">{Perito médico} {documentación médica asistencial, </w:t>
+      </w:r>
+      <w:r>
+        <w:rPr>
+          <w:b/>
+          <w:bCs/>
+          <w:color w:val="000000" w:themeColor="text1"/>
+          <w:sz w:val="24"/>
+          <w:szCs w:val="24"/>
+          <w:lang w:val="es-ES"/>
+        </w:rPr>
+        <w:t>como bloque de documentos nº [num</w:t>
+      </w:r>
+      <w:r>
+        <w:rPr>
+          <w:b/>
+          <w:bCs/>
+          <w:color w:val="000000" w:themeColor="text1"/>
+          <w:sz w:val="24"/>
+          <w:szCs w:val="24"/>
+          <w:lang w:val="es-ES"/>
         </w:rPr>
         <w:t xml:space="preserve"> </w:t>
       </w:r>
@@ -1936,6 +1870,7 @@
           <w:color w:val="000000" w:themeColor="text1"/>
           <w:sz w:val="24"/>
           <w:szCs w:val="24"/>
+          <w:lang w:val="es-ES"/>
         </w:rPr>
         <w:t>{Documentación médica</w:t>
       </w:r>
@@ -1944,6 +1879,7 @@
           <w:color w:val="000000" w:themeColor="text1"/>
           <w:sz w:val="24"/>
           <w:szCs w:val="24"/>
+          <w:lang w:val="es-ES"/>
         </w:rPr>
         <w:t>.</w:t>
       </w:r>
@@ -1952,6 +1888,7 @@
           <w:color w:val="000000" w:themeColor="text1"/>
           <w:sz w:val="24"/>
           <w:szCs w:val="24"/>
+          <w:lang w:val="es-ES"/>
         </w:rPr>
         <w:t>}</w:t>
       </w:r>
@@ -1962,6 +1899,7 @@
           <w:color w:val="000000" w:themeColor="text1"/>
           <w:sz w:val="24"/>
           <w:szCs w:val="24"/>
+          <w:lang w:val="es-ES"/>
         </w:rPr>
         <w:t>]</w:t>
       </w:r>
@@ -1970,6 +1908,7 @@
           <w:color w:val="000000" w:themeColor="text1"/>
           <w:sz w:val="24"/>
           <w:szCs w:val="24"/>
+          <w:lang w:val="es-ES"/>
         </w:rPr>
         <w:t>}</w:t>
       </w:r>
@@ -1989,75 +1928,37 @@
           <w:color w:val="000000" w:themeColor="text1"/>
           <w:sz w:val="24"/>
           <w:szCs w:val="24"/>
-        </w:rPr>
-      </w:pPr>
-      <w:r>
-        <w:rPr>
-          <w:color w:val="000000" w:themeColor="text1"/>
-          <w:sz w:val="24"/>
-          <w:szCs w:val="24"/>
-        </w:rPr>
-        <w:t>{Baja laboral} {</w:t>
-      </w:r>
-      <w:r>
-        <w:rPr>
-          <w:color w:val="000000" w:themeColor="text1"/>
-          <w:sz w:val="24"/>
-          <w:szCs w:val="24"/>
-        </w:rPr>
-        <w:t xml:space="preserve">partes de baja y alta laboral como </w:t>
-      </w:r>
-      <w:r>
-        <w:rPr>
-          <w:b/>
-          <w:bCs/>
-          <w:color w:val="000000" w:themeColor="text1"/>
-          <w:sz w:val="24"/>
-          <w:szCs w:val="24"/>
-        </w:rPr>
-        <w:t xml:space="preserve">bloque de documentos </w:t>
-      </w:r>
-      <w:proofErr w:type="spellStart"/>
-      <w:r>
-        <w:rPr>
-          <w:b/>
-          <w:bCs/>
-          <w:color w:val="000000" w:themeColor="text1"/>
-          <w:sz w:val="24"/>
-          <w:szCs w:val="24"/>
-        </w:rPr>
-        <w:t>nº</w:t>
-      </w:r>
-      <w:proofErr w:type="spellEnd"/>
-      <w:r>
-        <w:rPr>
-          <w:b/>
-          <w:bCs/>
-          <w:color w:val="000000" w:themeColor="text1"/>
-          <w:sz w:val="24"/>
-          <w:szCs w:val="24"/>
-        </w:rPr>
-        <w:t xml:space="preserve"> [</w:t>
-      </w:r>
-      <w:proofErr w:type="spellStart"/>
-      <w:r>
-        <w:rPr>
-          <w:b/>
-          <w:bCs/>
-          <w:color w:val="000000" w:themeColor="text1"/>
-          <w:sz w:val="24"/>
-          <w:szCs w:val="24"/>
-        </w:rPr>
-        <w:t>num</w:t>
-      </w:r>
-      <w:proofErr w:type="spellEnd"/>
-      <w:r>
-        <w:rPr>
-          <w:b/>
-          <w:bCs/>
-          <w:color w:val="000000" w:themeColor="text1"/>
-          <w:sz w:val="24"/>
-          <w:szCs w:val="24"/>
+          <w:lang w:val="es-ES"/>
+        </w:rPr>
+      </w:pPr>
+      <w:r>
+        <w:rPr>
+          <w:color w:val="000000" w:themeColor="text1"/>
+          <w:sz w:val="24"/>
+          <w:szCs w:val="24"/>
+          <w:lang w:val="es-ES"/>
+        </w:rPr>
+        <w:t xml:space="preserve">{Baja laboral} {partes de baja y alta laboral como </w:t>
+      </w:r>
+      <w:r>
+        <w:rPr>
+          <w:b/>
+          <w:bCs/>
+          <w:color w:val="000000" w:themeColor="text1"/>
+          <w:sz w:val="24"/>
+          <w:szCs w:val="24"/>
+          <w:lang w:val="es-ES"/>
+        </w:rPr>
+        <w:t>bloque de documentos nº [num</w:t>
+      </w:r>
+      <w:r>
+        <w:rPr>
+          <w:b/>
+          <w:bCs/>
+          <w:color w:val="000000" w:themeColor="text1"/>
+          <w:sz w:val="24"/>
+          <w:szCs w:val="24"/>
+          <w:lang w:val="es-ES"/>
         </w:rPr>
         <w:t xml:space="preserve"> </w:t>
       </w:r>
@@ -2066,6 +1967,7 @@
           <w:color w:val="000000" w:themeColor="text1"/>
           <w:sz w:val="24"/>
           <w:szCs w:val="24"/>
+          <w:lang w:val="es-ES"/>
         </w:rPr>
         <w:t>{Partes de baja y alta laboral.}</w:t>
       </w:r>
@@ -2076,6 +1978,7 @@
           <w:color w:val="000000" w:themeColor="text1"/>
           <w:sz w:val="24"/>
           <w:szCs w:val="24"/>
+          <w:lang w:val="es-ES"/>
         </w:rPr>
         <w:t>]</w:t>
       </w:r>
@@ -2084,6 +1987,7 @@
           <w:color w:val="000000" w:themeColor="text1"/>
           <w:sz w:val="24"/>
           <w:szCs w:val="24"/>
+          <w:lang w:val="es-ES"/>
         </w:rPr>
         <w:t>}</w:t>
       </w:r>
@@ -2328,6 +2232,7 @@
           <w:sz w:val="24"/>
           <w:szCs w:val="24"/>
           <w:highlight w:val="green"/>
+          <w:lang w:val="es-ES"/>
         </w:rPr>
       </w:pPr>
       <w:r>
@@ -2336,28 +2241,9 @@
           <w:sz w:val="24"/>
           <w:szCs w:val="24"/>
           <w:highlight w:val="green"/>
-        </w:rPr>
-        <w:t xml:space="preserve">Respecto al tratamiento rehabilitador, éste se inicia y finaliza en centro médico </w:t>
-      </w:r>
-      <w:proofErr w:type="spellStart"/>
-      <w:r>
-        <w:rPr>
-          <w:color w:val="000000" w:themeColor="text1"/>
-          <w:sz w:val="24"/>
-          <w:szCs w:val="24"/>
-          <w:highlight w:val="green"/>
-        </w:rPr>
-        <w:t>Icot</w:t>
-      </w:r>
-      <w:proofErr w:type="spellEnd"/>
-      <w:r>
-        <w:rPr>
-          <w:color w:val="000000" w:themeColor="text1"/>
-          <w:sz w:val="24"/>
-          <w:szCs w:val="24"/>
-          <w:highlight w:val="green"/>
-        </w:rPr>
-        <w:t>,</w:t>
+          <w:lang w:val="es-ES"/>
+        </w:rPr>
+        <w:t>Respecto al tratamiento rehabilitador, éste se inicia y finaliza en centro médico Icot,</w:t>
       </w:r>
     </w:p>
     <w:p>
@@ -2380,6 +2266,7 @@
           <w:color w:val="000000" w:themeColor="text1"/>
           <w:sz w:val="24"/>
           <w:szCs w:val="24"/>
+          <w:lang w:val="es-ES"/>
         </w:rPr>
       </w:pPr>
       <w:r>
@@ -2388,34 +2275,16 @@
           <w:sz w:val="24"/>
           <w:szCs w:val="24"/>
           <w:highlight w:val="green"/>
-        </w:rPr>
-        <w:t xml:space="preserve">Y luego se fue </w:t>
-      </w:r>
-      <w:proofErr w:type="spellStart"/>
-      <w:r>
-        <w:rPr>
-          <w:color w:val="000000" w:themeColor="text1"/>
-          <w:sz w:val="24"/>
-          <w:szCs w:val="24"/>
-          <w:highlight w:val="green"/>
-        </w:rPr>
-        <w:t>pa</w:t>
-      </w:r>
-      <w:proofErr w:type="spellEnd"/>
-      <w:r>
-        <w:rPr>
-          <w:color w:val="000000" w:themeColor="text1"/>
-          <w:sz w:val="24"/>
-          <w:szCs w:val="24"/>
-          <w:highlight w:val="green"/>
-        </w:rPr>
-        <w:t xml:space="preserve"> su casa</w:t>
-      </w:r>
-      <w:r>
-        <w:rPr>
-          <w:color w:val="000000" w:themeColor="text1"/>
-          <w:sz w:val="24"/>
-          <w:szCs w:val="24"/>
+          <w:lang w:val="es-ES"/>
+        </w:rPr>
+        <w:t>Y luego se fue pa su casa</w:t>
+      </w:r>
+      <w:r>
+        <w:rPr>
+          <w:color w:val="000000" w:themeColor="text1"/>
+          <w:sz w:val="24"/>
+          <w:szCs w:val="24"/>
+          <w:lang w:val="es-ES"/>
         </w:rPr>
         <w:t>.</w:t>
       </w:r>
@@ -2424,6 +2293,7 @@
           <w:color w:val="000000" w:themeColor="text1"/>
           <w:sz w:val="24"/>
           <w:szCs w:val="24"/>
+          <w:lang w:val="es-ES"/>
         </w:rPr>
         <w:t>}}}</w:t>
       </w:r>
@@ -2917,24 +2787,9 @@
           <w:color w:val="000000" w:themeColor="text1"/>
           <w:sz w:val="24"/>
           <w:szCs w:val="24"/>
-        </w:rPr>
-        <w:t>{{</w:t>
-      </w:r>
-      <w:r>
-        <w:rPr>
-          <w:color w:val="000000" w:themeColor="text1"/>
-          <w:sz w:val="24"/>
-          <w:szCs w:val="24"/>
-        </w:rPr>
-        <w:t xml:space="preserve">Días de perjuicio </w:t>
-      </w:r>
-      <w:r>
-        <w:rPr>
-          <w:color w:val="000000" w:themeColor="text1"/>
-          <w:sz w:val="24"/>
-          <w:szCs w:val="24"/>
-        </w:rPr>
-        <w:t>básico [</w:t>
+          <w:lang w:val="es-ES"/>
+        </w:rPr>
+        <w:t>{{CALC: Días de perjuicio totales - Días de perjuicio moderado [</w:t>
       </w:r>
       <w:proofErr w:type="spellStart"/>
       <w:r>
@@ -2942,6 +2797,7 @@
           <w:color w:val="000000" w:themeColor="text1"/>
           <w:sz w:val="24"/>
           <w:szCs w:val="24"/>
+          <w:lang w:val="es-ES"/>
         </w:rPr>
         <w:t>int</w:t>
       </w:r>
@@ -2951,6 +2807,7 @@
           <w:color w:val="000000" w:themeColor="text1"/>
           <w:sz w:val="24"/>
           <w:szCs w:val="24"/>
+          <w:lang w:val="es-ES"/>
         </w:rPr>
         <w:t>]}}</w:t>
       </w:r>
@@ -2959,6 +2816,8 @@
           <w:color w:val="000000" w:themeColor="text1"/>
           <w:sz w:val="24"/>
           <w:szCs w:val="24"/>
+          <w:u w:val="single"/>
+          <w:lang w:val="es-ES"/>
         </w:rPr>
         <w:t xml:space="preserve"> </w:t>
       </w:r>
@@ -3029,7 +2888,42 @@
           <w:sz w:val="24"/>
           <w:szCs w:val="24"/>
         </w:rPr>
-        <w:t>{{CALC: Días de perjuicio básico * Importe por día de perjuicio básico</w:t>
+        <w:t>{{CALC</w:t>
+      </w:r>
+      <w:r>
+        <w:rPr>
+          <w:color w:val="000000" w:themeColor="text1"/>
+          <w:sz w:val="24"/>
+          <w:szCs w:val="24"/>
+        </w:rPr>
+        <w:t>: (</w:t>
+      </w:r>
+      <w:r>
+        <w:rPr>
+          <w:color w:val="000000" w:themeColor="text1"/>
+          <w:sz w:val="24"/>
+          <w:szCs w:val="24"/>
+          <w:lang w:val="es-ES"/>
+        </w:rPr>
+        <w:t>Días de perjuicio totales - Días de perjuicio moderado</w:t>
+      </w:r>
+      <w:r>
+        <w:rPr>
+          <w:color w:val="000000" w:themeColor="text1"/>
+          <w:sz w:val="24"/>
+          <w:szCs w:val="24"/>
+          <w:u w:val="single"/>
+          <w:lang w:val="es-ES"/>
+        </w:rPr>
+        <w:t>)</w:t>
+      </w:r>
+      <w:r>
+        <w:rPr>
+          <w:color w:val="000000" w:themeColor="text1"/>
+          <w:sz w:val="24"/>
+          <w:szCs w:val="24"/>
+        </w:rPr>
+        <w:t xml:space="preserve"> * Importe por día de perjuicio básico</w:t>
       </w:r>
       <w:proofErr w:type="gramStart"/>
       <w:r>
@@ -3110,6 +3004,7 @@
           <w:lang w:val="es-ES"/>
         </w:rPr>
       </w:pPr>
+      <w:proofErr w:type="gramStart"/>
       <w:r>
         <w:rPr>
           <w:color w:val="000000" w:themeColor="text1"/>
@@ -3119,19 +3014,9 @@
         </w:rPr>
         <w:t>Todas las cantidades señaladas asciende</w:t>
       </w:r>
-      <w:r>
-        <w:rPr>
-          <w:color w:val="000000" w:themeColor="text1"/>
-          <w:sz w:val="24"/>
-          <w:szCs w:val="24"/>
-          <w:lang w:val="es-ES"/>
-        </w:rPr>
-        <w:t xml:space="preserve"> a</w:t>
-      </w:r>
-      <w:r>
-        <w:rPr>
-          <w:b/>
-          <w:bCs/>
+      <w:proofErr w:type="gramEnd"/>
+      <w:r>
+        <w:rPr>
           <w:color w:val="000000" w:themeColor="text1"/>
           <w:sz w:val="24"/>
           <w:szCs w:val="24"/>
@@ -3141,16 +3026,17 @@
       </w:r>
       <w:r>
         <w:rPr>
-          <w:b/>
-          <w:bCs/>
-          <w:color w:val="000000" w:themeColor="text1"/>
-          <w:sz w:val="24"/>
-          <w:szCs w:val="24"/>
-        </w:rPr>
-        <w:t>{{CALC: Días de perjuicio moderado * Importe por día de perjuicio moderado + Días de perjuicio básico * Importe por día de perjuicio básico}}</w:t>
-      </w:r>
-      <w:r>
-        <w:rPr>
+          <w:color w:val="000000" w:themeColor="text1"/>
+          <w:sz w:val="24"/>
+          <w:szCs w:val="24"/>
+          <w:lang w:val="es-ES"/>
+        </w:rPr>
+        <w:t>a</w:t>
+      </w:r>
+      <w:r>
+        <w:rPr>
+          <w:b/>
+          <w:bCs/>
           <w:color w:val="000000" w:themeColor="text1"/>
           <w:sz w:val="24"/>
           <w:szCs w:val="24"/>
@@ -3165,18 +3051,37 @@
           <w:color w:val="000000" w:themeColor="text1"/>
           <w:sz w:val="24"/>
           <w:szCs w:val="24"/>
-          <w:lang w:val="es-ES"/>
-        </w:rPr>
-        <w:t>euros, importe que</w:t>
-      </w:r>
-      <w:r>
-        <w:rPr>
-          <w:b/>
-          <w:bCs/>
-          <w:color w:val="000000" w:themeColor="text1"/>
-          <w:sz w:val="24"/>
-          <w:szCs w:val="24"/>
-          <w:lang w:val="es-ES"/>
+        </w:rPr>
+        <w:t xml:space="preserve">{{CALC: Días de perjuicio moderado * Importe por día de perjuicio moderado + </w:t>
+      </w:r>
+      <w:r>
+        <w:rPr>
+          <w:b/>
+          <w:bCs/>
+          <w:color w:val="000000" w:themeColor="text1"/>
+          <w:sz w:val="24"/>
+          <w:szCs w:val="24"/>
+        </w:rPr>
+        <w:t>(</w:t>
+      </w:r>
+      <w:r>
+        <w:rPr>
+          <w:b/>
+          <w:bCs/>
+          <w:color w:val="000000" w:themeColor="text1"/>
+          <w:sz w:val="24"/>
+          <w:szCs w:val="24"/>
+          <w:lang w:val="es-ES"/>
+        </w:rPr>
+        <w:t>Días de perjuicio totales - Días de perjuicio moderado)</w:t>
+      </w:r>
+      <w:r>
+        <w:rPr>
+          <w:b/>
+          <w:bCs/>
+          <w:color w:val="000000" w:themeColor="text1"/>
+          <w:sz w:val="24"/>
+          <w:szCs w:val="24"/>
         </w:rPr>
         <w:t xml:space="preserve"> </w:t>
       </w:r>
@@ -3187,6 +3092,38 @@
           <w:color w:val="000000" w:themeColor="text1"/>
           <w:sz w:val="24"/>
           <w:szCs w:val="24"/>
+        </w:rPr>
+        <w:t>* Importe por día de perjuicio básico}}</w:t>
+      </w:r>
+      <w:r>
+        <w:rPr>
+          <w:b/>
+          <w:bCs/>
+          <w:color w:val="000000" w:themeColor="text1"/>
+          <w:sz w:val="24"/>
+          <w:szCs w:val="24"/>
+          <w:lang w:val="es-ES"/>
+        </w:rPr>
+        <w:t xml:space="preserve"> euros, importe que</w:t>
+      </w:r>
+      <w:r>
+        <w:rPr>
+          <w:b/>
+          <w:bCs/>
+          <w:color w:val="000000" w:themeColor="text1"/>
+          <w:sz w:val="24"/>
+          <w:szCs w:val="24"/>
+          <w:lang w:val="es-ES"/>
+        </w:rPr>
+        <w:t xml:space="preserve"> </w:t>
+      </w:r>
+      <w:r>
+        <w:rPr>
+          <w:b/>
+          <w:bCs/>
+          <w:color w:val="000000" w:themeColor="text1"/>
+          <w:sz w:val="24"/>
+          <w:szCs w:val="24"/>
           <w:lang w:val="es-ES"/>
         </w:rPr>
         <w:t>se re</w:t>
@@ -3211,16 +3148,7 @@
           <w:szCs w:val="24"/>
           <w:lang w:val="es-ES"/>
         </w:rPr>
-        <w:t>lama como principal</w:t>
-      </w:r>
-      <w:r>
-        <w:rPr>
-          <w:color w:val="000000" w:themeColor="text1"/>
-          <w:sz w:val="24"/>
-          <w:szCs w:val="24"/>
-          <w:lang w:val="es-ES"/>
-        </w:rPr>
-        <w:t>.</w:t>
+        <w:t>lama como principal.</w:t>
       </w:r>
     </w:p>
     <w:p>
@@ -4063,7 +3991,17 @@
           <w:szCs w:val="24"/>
           <w:lang w:val="es-ES"/>
         </w:rPr>
-        <w:t>Por todo lo expuesto no puede considerarse que exista falta de nexo causal, ya</w:t>
+        <w:t xml:space="preserve">Por todo lo expuesto no puede considerarse que </w:t>
+      </w:r>
+      <w:r>
+        <w:rPr>
+          <w:color w:val="000000" w:themeColor="text1"/>
+          <w:sz w:val="24"/>
+          <w:szCs w:val="24"/>
+          <w:lang w:val="es-ES"/>
+        </w:rPr>
+        <w:lastRenderedPageBreak/>
+        <w:t>exista falta de nexo causal, ya</w:t>
       </w:r>
       <w:r>
         <w:rPr>
@@ -4117,17 +4055,7 @@
           <w:szCs w:val="24"/>
           <w:lang w:val="es-ES"/>
         </w:rPr>
-        <w:t xml:space="preserve">pericial para negar igualmente nexo causal y éste se fundamenta </w:t>
-      </w:r>
-      <w:r>
-        <w:rPr>
-          <w:color w:val="000000" w:themeColor="text1"/>
-          <w:sz w:val="24"/>
-          <w:szCs w:val="24"/>
-          <w:lang w:val="es-ES"/>
-        </w:rPr>
-        <w:lastRenderedPageBreak/>
-        <w:t>principalmente en el</w:t>
+        <w:t>pericial para negar igualmente nexo causal y éste se fundamenta principalmente en el</w:t>
       </w:r>
       <w:r>
         <w:rPr>
@@ -4263,7 +4191,48 @@
           <w:sz w:val="24"/>
           <w:szCs w:val="24"/>
         </w:rPr>
-        <w:t>{{CALC: Días de perjuicio moderado * Importe por día de perjuicio moderado + Días de perjuicio básico * Importe por día de perjuicio básico}}</w:t>
+        <w:t xml:space="preserve">{{CALC: Días de perjuicio moderado * Importe por día de perjuicio moderado + </w:t>
+      </w:r>
+      <w:r>
+        <w:rPr>
+          <w:b/>
+          <w:bCs/>
+          <w:color w:val="000000" w:themeColor="text1"/>
+          <w:sz w:val="24"/>
+          <w:szCs w:val="24"/>
+        </w:rPr>
+        <w:t>(</w:t>
+      </w:r>
+      <w:r>
+        <w:rPr>
+          <w:b/>
+          <w:bCs/>
+          <w:color w:val="000000" w:themeColor="text1"/>
+          <w:sz w:val="24"/>
+          <w:szCs w:val="24"/>
+          <w:lang w:val="es-ES"/>
+        </w:rPr>
+        <w:t>Días de perjuicio totales - Días de perjuicio moderado)</w:t>
+      </w:r>
+      <w:r>
+        <w:rPr>
+          <w:b/>
+          <w:bCs/>
+          <w:color w:val="000000" w:themeColor="text1"/>
+          <w:sz w:val="24"/>
+          <w:szCs w:val="24"/>
+        </w:rPr>
+        <w:t xml:space="preserve"> </w:t>
+      </w:r>
+      <w:r>
+        <w:rPr>
+          <w:b/>
+          <w:bCs/>
+          <w:color w:val="000000" w:themeColor="text1"/>
+          <w:sz w:val="24"/>
+          <w:szCs w:val="24"/>
+        </w:rPr>
+        <w:t>* Importe por día de perjuicio básico}}</w:t>
       </w:r>
       <w:r>
         <w:rPr>
@@ -4502,7 +4471,38 @@
           <w:sz w:val="24"/>
           <w:szCs w:val="24"/>
         </w:rPr>
-        <w:t>{{CALC: Días de perjuicio moderado * Importe por día de perjuicio moderado + Días de perjuicio básico * Importe por día de perjuicio básico</w:t>
+        <w:t xml:space="preserve">{{CALC: </w:t>
+      </w:r>
+      <w:r>
+        <w:rPr>
+          <w:b/>
+          <w:bCs/>
+          <w:color w:val="000000" w:themeColor="text1"/>
+          <w:sz w:val="24"/>
+          <w:szCs w:val="24"/>
+        </w:rPr>
+        <w:t>Días de perjuicio moderado * Importe por día de perjuicio moderado + (</w:t>
+      </w:r>
+      <w:r>
+        <w:rPr>
+          <w:b/>
+          <w:bCs/>
+          <w:color w:val="000000" w:themeColor="text1"/>
+          <w:sz w:val="24"/>
+          <w:szCs w:val="24"/>
+          <w:lang w:val="es-ES"/>
+        </w:rPr>
+        <w:t>Días de perjuicio totales - Días de perjuicio moderado)</w:t>
+      </w:r>
+      <w:r>
+        <w:rPr>
+          <w:b/>
+          <w:bCs/>
+          <w:color w:val="000000" w:themeColor="text1"/>
+          <w:sz w:val="24"/>
+          <w:szCs w:val="24"/>
+        </w:rPr>
+        <w:t xml:space="preserve"> * Importe por día de perjuicio básico</w:t>
       </w:r>
       <w:r>
         <w:rPr>

</xml_diff>

<commit_message>
nuevo campo fecha simple en Dem.Caus.
</commit_message>
<xml_diff>
--- a/docs/Test plantilla demanda.docx
+++ b/docs/Test plantilla demanda.docx
@@ -88,6 +88,278 @@
         </w:rPr>
         <w:t>, Procuradora de los tribunales en nombre y representación de</w:t>
       </w:r>
+      <w:r>
+        <w:rPr>
+          <w:color w:val="000000" w:themeColor="text1"/>
+          <w:sz w:val="24"/>
+          <w:szCs w:val="24"/>
+          <w:lang w:val="es-ES"/>
+        </w:rPr>
+        <w:t xml:space="preserve"> </w:t>
+      </w:r>
+      <w:r>
+        <w:rPr>
+          <w:b/>
+          <w:bCs/>
+          <w:color w:val="000000" w:themeColor="text1"/>
+          <w:sz w:val="24"/>
+          <w:szCs w:val="24"/>
+          <w:highlight w:val="green"/>
+          <w:lang w:val="es-ES"/>
+        </w:rPr>
+        <w:t>{</w:t>
+      </w:r>
+      <w:r>
+        <w:rPr>
+          <w:b/>
+          <w:bCs/>
+          <w:color w:val="000000" w:themeColor="text1"/>
+          <w:sz w:val="24"/>
+          <w:szCs w:val="24"/>
+          <w:highlight w:val="green"/>
+          <w:lang w:val="es-ES"/>
+        </w:rPr>
+        <w:t>{Tratamiento</w:t>
+      </w:r>
+      <w:r>
+        <w:rPr>
+          <w:b/>
+          <w:bCs/>
+          <w:color w:val="000000" w:themeColor="text1"/>
+          <w:sz w:val="24"/>
+          <w:szCs w:val="24"/>
+          <w:highlight w:val="green"/>
+          <w:lang w:val="es-ES"/>
+        </w:rPr>
+        <w:t xml:space="preserve"> [</w:t>
+      </w:r>
+      <w:proofErr w:type="spellStart"/>
+      <w:r>
+        <w:rPr>
+          <w:b/>
+          <w:bCs/>
+          <w:color w:val="000000" w:themeColor="text1"/>
+          <w:sz w:val="24"/>
+          <w:szCs w:val="24"/>
+          <w:highlight w:val="green"/>
+          <w:lang w:val="es-ES"/>
+        </w:rPr>
+        <w:t>select</w:t>
+      </w:r>
+      <w:proofErr w:type="spellEnd"/>
+      <w:r>
+        <w:rPr>
+          <w:b/>
+          <w:bCs/>
+          <w:color w:val="000000" w:themeColor="text1"/>
+          <w:sz w:val="24"/>
+          <w:szCs w:val="24"/>
+          <w:highlight w:val="green"/>
+          <w:lang w:val="es-ES"/>
+        </w:rPr>
+        <w:t>]</w:t>
+      </w:r>
+      <w:r>
+        <w:rPr>
+          <w:b/>
+          <w:bCs/>
+          <w:color w:val="000000" w:themeColor="text1"/>
+          <w:sz w:val="24"/>
+          <w:szCs w:val="24"/>
+          <w:highlight w:val="green"/>
+          <w:lang w:val="es-ES"/>
+        </w:rPr>
+        <w:t xml:space="preserve"> </w:t>
+      </w:r>
+      <w:r>
+        <w:rPr>
+          <w:b/>
+          <w:bCs/>
+          <w:color w:val="000000" w:themeColor="text1"/>
+          <w:sz w:val="24"/>
+          <w:szCs w:val="24"/>
+          <w:highlight w:val="green"/>
+          <w:lang w:val="es-ES"/>
+        </w:rPr>
+        <w:t>{DON} {DON</w:t>
+      </w:r>
+      <w:r>
+        <w:rPr>
+          <w:b/>
+          <w:bCs/>
+          <w:color w:val="000000" w:themeColor="text1"/>
+          <w:sz w:val="24"/>
+          <w:szCs w:val="24"/>
+          <w:highlight w:val="green"/>
+          <w:lang w:val="es-ES"/>
+        </w:rPr>
+        <w:t>} {DOÑA</w:t>
+      </w:r>
+      <w:r>
+        <w:rPr>
+          <w:b/>
+          <w:bCs/>
+          <w:color w:val="000000" w:themeColor="text1"/>
+          <w:sz w:val="24"/>
+          <w:szCs w:val="24"/>
+          <w:highlight w:val="green"/>
+          <w:lang w:val="es-ES"/>
+        </w:rPr>
+        <w:t>}</w:t>
+      </w:r>
+      <w:r>
+        <w:rPr>
+          <w:b/>
+          <w:bCs/>
+          <w:color w:val="000000" w:themeColor="text1"/>
+          <w:sz w:val="24"/>
+          <w:szCs w:val="24"/>
+          <w:highlight w:val="green"/>
+          <w:lang w:val="es-ES"/>
+        </w:rPr>
+        <w:t xml:space="preserve"> {DOÑA}</w:t>
+      </w:r>
+      <w:r>
+        <w:rPr>
+          <w:b/>
+          <w:bCs/>
+          <w:color w:val="000000" w:themeColor="text1"/>
+          <w:sz w:val="24"/>
+          <w:szCs w:val="24"/>
+          <w:highlight w:val="green"/>
+          <w:lang w:val="es-ES"/>
+        </w:rPr>
+        <w:t>}</w:t>
+      </w:r>
+      <w:r>
+        <w:rPr>
+          <w:b/>
+          <w:bCs/>
+          <w:color w:val="000000" w:themeColor="text1"/>
+          <w:sz w:val="24"/>
+          <w:szCs w:val="24"/>
+          <w:highlight w:val="green"/>
+          <w:lang w:val="es-ES"/>
+        </w:rPr>
+        <w:t>}</w:t>
+      </w:r>
+      <w:r>
+        <w:rPr>
+          <w:b/>
+          <w:bCs/>
+          <w:color w:val="000000" w:themeColor="text1"/>
+          <w:sz w:val="24"/>
+          <w:szCs w:val="24"/>
+          <w:highlight w:val="green"/>
+          <w:lang w:val="es-ES"/>
+        </w:rPr>
+        <w:t xml:space="preserve"> </w:t>
+      </w:r>
+      <w:r>
+        <w:rPr>
+          <w:b/>
+          <w:bCs/>
+          <w:color w:val="000000" w:themeColor="text1"/>
+          <w:sz w:val="24"/>
+          <w:szCs w:val="24"/>
+          <w:highlight w:val="green"/>
+          <w:lang w:val="es-ES"/>
+        </w:rPr>
+        <w:t>{</w:t>
+      </w:r>
+      <w:r>
+        <w:rPr>
+          <w:b/>
+          <w:bCs/>
+          <w:color w:val="000000" w:themeColor="text1"/>
+          <w:sz w:val="24"/>
+          <w:szCs w:val="24"/>
+          <w:highlight w:val="green"/>
+          <w:lang w:val="es-ES"/>
+        </w:rPr>
+        <w:t>{NOMBRE}}</w:t>
+      </w:r>
+      <w:r>
+        <w:rPr>
+          <w:color w:val="000000" w:themeColor="text1"/>
+          <w:sz w:val="24"/>
+          <w:szCs w:val="24"/>
+          <w:highlight w:val="green"/>
+          <w:lang w:val="es-ES"/>
+        </w:rPr>
+        <w:t xml:space="preserve">, mayor de edad, con DNI </w:t>
+      </w:r>
+      <w:r>
+        <w:rPr>
+          <w:color w:val="000000" w:themeColor="text1"/>
+          <w:sz w:val="24"/>
+          <w:szCs w:val="24"/>
+          <w:highlight w:val="green"/>
+          <w:lang w:val="es-ES"/>
+        </w:rPr>
+        <w:t>{{DNI}}</w:t>
+      </w:r>
+      <w:r>
+        <w:rPr>
+          <w:color w:val="000000" w:themeColor="text1"/>
+          <w:sz w:val="24"/>
+          <w:szCs w:val="24"/>
+          <w:highlight w:val="green"/>
+          <w:lang w:val="es-ES"/>
+        </w:rPr>
+        <w:t xml:space="preserve">, y </w:t>
+      </w:r>
+      <w:r>
+        <w:rPr>
+          <w:sz w:val="24"/>
+          <w:szCs w:val="24"/>
+          <w:highlight w:val="green"/>
+          <w:lang w:val="es-ES"/>
+        </w:rPr>
+        <w:t xml:space="preserve">domicilio en </w:t>
+      </w:r>
+      <w:r>
+        <w:rPr>
+          <w:sz w:val="24"/>
+          <w:szCs w:val="24"/>
+          <w:highlight w:val="green"/>
+          <w:lang w:val="es-ES"/>
+        </w:rPr>
+        <w:t>{{Domicilio}}</w:t>
+      </w:r>
+      <w:r>
+        <w:rPr>
+          <w:sz w:val="24"/>
+          <w:szCs w:val="24"/>
+          <w:lang w:val="es-ES"/>
+        </w:rPr>
+        <w:t>, en virtud de</w:t>
+      </w:r>
+      <w:r>
+        <w:rPr>
+          <w:sz w:val="24"/>
+          <w:szCs w:val="24"/>
+          <w:lang w:val="es-ES"/>
+        </w:rPr>
+        <w:t xml:space="preserve"> </w:t>
+      </w:r>
+      <w:r>
+        <w:rPr>
+          <w:sz w:val="24"/>
+          <w:szCs w:val="24"/>
+          <w:lang w:val="es-ES"/>
+        </w:rPr>
+        <w:t xml:space="preserve">apoderamiento “apud acta” que se conferirá en el juzgado </w:t>
+      </w:r>
+      <w:r>
+        <w:rPr>
+          <w:color w:val="000000" w:themeColor="text1"/>
+          <w:sz w:val="24"/>
+          <w:szCs w:val="24"/>
+          <w:lang w:val="es-ES"/>
+        </w:rPr>
+        <w:t>en el momento procesal oportuno, y asistida por el Letrado D. Reinaldo Velázquez Quintana, como mejor proceda en Derecho comparezco y DIGO:</w:t>
+      </w:r>
     </w:p>
     <w:p>
       <w:pPr>
@@ -101,7 +373,7 @@
         <w:ind w:left="2" w:right="136" w:firstLine="707"/>
         <w:jc w:val="both"/>
         <w:rPr>
-          <w:color w:val="000000" w:themeColor="text1"/>
+          <w:color w:val="000000"/>
           <w:sz w:val="24"/>
           <w:szCs w:val="24"/>
           <w:lang w:val="es-ES"/>
@@ -120,38 +392,48 @@
         <w:ind w:left="2" w:right="136" w:firstLine="707"/>
         <w:jc w:val="both"/>
         <w:rPr>
-          <w:color w:val="000000" w:themeColor="text1"/>
-          <w:sz w:val="24"/>
-          <w:szCs w:val="24"/>
-          <w:lang w:val="es-ES"/>
-        </w:rPr>
-      </w:pPr>
-      <w:r>
-        <w:rPr>
-          <w:color w:val="000000" w:themeColor="text1"/>
-          <w:sz w:val="24"/>
-          <w:szCs w:val="24"/>
-          <w:lang w:val="es-ES"/>
-        </w:rPr>
-        <w:t xml:space="preserve"> {</w:t>
-      </w:r>
-      <w:r>
-        <w:rPr>
-          <w:color w:val="000000" w:themeColor="text1"/>
-          <w:sz w:val="24"/>
-          <w:szCs w:val="24"/>
-          <w:lang w:val="es-ES"/>
-        </w:rPr>
-        <w:t>{Tratamiento</w:t>
-      </w:r>
-      <w:r>
-        <w:rPr>
-          <w:color w:val="000000" w:themeColor="text1"/>
-          <w:sz w:val="24"/>
-          <w:szCs w:val="24"/>
-          <w:lang w:val="es-ES"/>
-        </w:rPr>
-        <w:t xml:space="preserve"> [select]</w:t>
+          <w:color w:val="000000"/>
+          <w:sz w:val="24"/>
+          <w:szCs w:val="24"/>
+          <w:lang w:val="es-ES"/>
+        </w:rPr>
+      </w:pPr>
+      <w:r>
+        <w:rPr>
+          <w:color w:val="000000"/>
+          <w:sz w:val="24"/>
+          <w:szCs w:val="24"/>
+          <w:lang w:val="es-ES"/>
+        </w:rPr>
+        <w:t>Que siguiendo instrucciones expresas de mis mandantes, por medio del presente escrito vengo a deducir DEMANDA DE JUICIO VERBAL DE RECLAMACIÓN DE CANTIDAD POR DAÑOS PRODUCIDOS EN ACCIDENTE DE CIRCULACIÓN contra la entidad</w:t>
+      </w:r>
+      <w:r>
+        <w:rPr>
+          <w:color w:val="000000"/>
+          <w:sz w:val="24"/>
+          <w:szCs w:val="24"/>
+          <w:lang w:val="es-ES"/>
+        </w:rPr>
+        <w:t xml:space="preserve"> </w:t>
+      </w:r>
+      <w:r>
+        <w:rPr>
+          <w:color w:val="000000"/>
+          <w:sz w:val="24"/>
+          <w:szCs w:val="24"/>
+          <w:highlight w:val="yellow"/>
+          <w:lang w:val="es-ES"/>
+        </w:rPr>
+        <w:t>REALE, con CIF A-78520293, domicilio social en calle Príncipe de Vergara, 125, 28002, Madrid y teléfono 914 547 400</w:t>
+      </w:r>
+      <w:r>
+        <w:rPr>
+          <w:color w:val="000000"/>
+          <w:sz w:val="24"/>
+          <w:szCs w:val="24"/>
+          <w:lang w:val="es-ES"/>
+        </w:rPr>
+        <w:t>, a fin de que en el ejercicio de la acción que a mi principal corresponde como resarcimiento de daños y perjuicios, reclamar, previos los trámites correspondientes, se dicte sentencia condenándole a abonar a mi representada el principal reclamado, los intereses que le son aplicables a dicha cantidad y las costas, en base a los hechos y fundamentos que se exponen.</w:t>
       </w:r>
     </w:p>
     <w:p>
@@ -166,7 +448,7 @@
         <w:ind w:left="2" w:right="136" w:firstLine="707"/>
         <w:jc w:val="both"/>
         <w:rPr>
-          <w:color w:val="000000" w:themeColor="text1"/>
+          <w:color w:val="000000"/>
           <w:sz w:val="24"/>
           <w:szCs w:val="24"/>
           <w:lang w:val="es-ES"/>
@@ -185,30 +467,12 @@
         <w:ind w:left="2" w:right="136" w:firstLine="707"/>
         <w:jc w:val="both"/>
         <w:rPr>
-          <w:color w:val="000000" w:themeColor="text1"/>
-          <w:sz w:val="24"/>
-          <w:szCs w:val="24"/>
-          <w:lang w:val="es-ES"/>
-        </w:rPr>
-      </w:pPr>
-      <w:r>
-        <w:rPr>
-          <w:color w:val="000000" w:themeColor="text1"/>
-          <w:sz w:val="24"/>
-          <w:szCs w:val="24"/>
-          <w:lang w:val="es-ES"/>
-        </w:rPr>
-        <w:t xml:space="preserve"> {DON} {DON</w:t>
-      </w:r>
-      <w:r>
-        <w:rPr>
-          <w:color w:val="000000" w:themeColor="text1"/>
-          <w:sz w:val="24"/>
-          <w:szCs w:val="24"/>
-          <w:lang w:val="es-ES"/>
-        </w:rPr>
-        <w:t xml:space="preserve">} </w:t>
-      </w:r>
+          <w:color w:val="000000"/>
+          <w:sz w:val="24"/>
+          <w:szCs w:val="24"/>
+          <w:lang w:val="es-ES"/>
+        </w:rPr>
+      </w:pPr>
     </w:p>
     <w:p>
       <w:pPr>
@@ -220,14 +484,27 @@
           <w:between w:val="nil"/>
         </w:pBdr>
         <w:ind w:left="2" w:right="136" w:firstLine="707"/>
-        <w:jc w:val="both"/>
-        <w:rPr>
-          <w:color w:val="000000" w:themeColor="text1"/>
-          <w:sz w:val="24"/>
-          <w:szCs w:val="24"/>
-          <w:lang w:val="es-ES"/>
-        </w:rPr>
-      </w:pPr>
+        <w:jc w:val="center"/>
+        <w:rPr>
+          <w:b/>
+          <w:bCs/>
+          <w:color w:val="000000"/>
+          <w:sz w:val="24"/>
+          <w:szCs w:val="24"/>
+          <w:lang w:val="es-ES"/>
+        </w:rPr>
+      </w:pPr>
+      <w:r>
+        <w:rPr>
+          <w:b/>
+          <w:bCs/>
+          <w:color w:val="000000"/>
+          <w:sz w:val="24"/>
+          <w:szCs w:val="24"/>
+          <w:lang w:val="es-ES"/>
+        </w:rPr>
+        <w:t>HECHOS</w:t>
+      </w:r>
     </w:p>
     <w:p>
       <w:pPr>
@@ -244,36 +521,605 @@
           <w:color w:val="000000" w:themeColor="text1"/>
           <w:sz w:val="24"/>
           <w:szCs w:val="24"/>
-          <w:lang w:val="es-ES"/>
-        </w:rPr>
-      </w:pPr>
-      <w:r>
-        <w:rPr>
-          <w:color w:val="000000" w:themeColor="text1"/>
-          <w:sz w:val="24"/>
-          <w:szCs w:val="24"/>
-          <w:lang w:val="es-ES"/>
-        </w:rPr>
-        <w:t>{DOÑA</w:t>
-      </w:r>
-      <w:r>
-        <w:rPr>
-          <w:color w:val="000000" w:themeColor="text1"/>
+        </w:rPr>
+      </w:pPr>
+    </w:p>
+    <w:p>
+      <w:pPr>
+        <w:pBdr>
+          <w:top w:val="nil"/>
+          <w:left w:val="nil"/>
+          <w:bottom w:val="nil"/>
+          <w:right w:val="nil"/>
+          <w:between w:val="nil"/>
+        </w:pBdr>
+        <w:ind w:left="2" w:right="136" w:firstLine="707"/>
+        <w:jc w:val="both"/>
+        <w:rPr>
+          <w:b/>
+          <w:bCs/>
+          <w:color w:val="000000" w:themeColor="text1"/>
+          <w:sz w:val="24"/>
+          <w:szCs w:val="24"/>
+          <w:lang w:val="es-ES"/>
+        </w:rPr>
+      </w:pPr>
+      <w:proofErr w:type="gramStart"/>
+      <w:r>
+        <w:rPr>
+          <w:b/>
+          <w:bCs/>
+          <w:color w:val="000000" w:themeColor="text1"/>
+          <w:sz w:val="24"/>
+          <w:szCs w:val="24"/>
+          <w:lang w:val="es-ES"/>
+        </w:rPr>
+        <w:t>PREVIO.-</w:t>
+      </w:r>
+      <w:proofErr w:type="gramEnd"/>
+      <w:r>
+        <w:rPr>
+          <w:b/>
+          <w:bCs/>
+          <w:color w:val="000000" w:themeColor="text1"/>
+          <w:sz w:val="24"/>
+          <w:szCs w:val="24"/>
+          <w:lang w:val="es-ES"/>
+        </w:rPr>
+        <w:t xml:space="preserve"> CUMPLIMIENTO DEL PRESUPUESTO DE PROCEDIBILIDAD DEL MEDIO</w:t>
+      </w:r>
+    </w:p>
+    <w:p>
+      <w:pPr>
+        <w:pBdr>
+          <w:top w:val="nil"/>
+          <w:left w:val="nil"/>
+          <w:bottom w:val="nil"/>
+          <w:right w:val="nil"/>
+          <w:between w:val="nil"/>
+        </w:pBdr>
+        <w:ind w:right="136"/>
+        <w:jc w:val="both"/>
+        <w:rPr>
+          <w:b/>
+          <w:bCs/>
+          <w:color w:val="000000" w:themeColor="text1"/>
+          <w:sz w:val="24"/>
+          <w:szCs w:val="24"/>
+          <w:lang w:val="es-ES"/>
+        </w:rPr>
+      </w:pPr>
+      <w:r>
+        <w:rPr>
+          <w:b/>
+          <w:bCs/>
+          <w:color w:val="000000" w:themeColor="text1"/>
+          <w:sz w:val="24"/>
+          <w:szCs w:val="24"/>
+          <w:lang w:val="es-ES"/>
+        </w:rPr>
+        <w:t>ADECUADO DE SOLUCIÓN DE CONTROVERSIA NO JURIDICCIONAL.</w:t>
+      </w:r>
+    </w:p>
+    <w:p>
+      <w:pPr>
+        <w:pBdr>
+          <w:top w:val="nil"/>
+          <w:left w:val="nil"/>
+          <w:bottom w:val="nil"/>
+          <w:right w:val="nil"/>
+          <w:between w:val="nil"/>
+        </w:pBdr>
+        <w:ind w:left="2" w:right="136" w:firstLine="707"/>
+        <w:jc w:val="both"/>
+        <w:rPr>
+          <w:color w:val="000000" w:themeColor="text1"/>
+          <w:sz w:val="24"/>
+          <w:szCs w:val="24"/>
+          <w:lang w:val="es-ES"/>
+        </w:rPr>
+      </w:pPr>
+    </w:p>
+    <w:p>
+      <w:pPr>
+        <w:pBdr>
+          <w:top w:val="nil"/>
+          <w:left w:val="nil"/>
+          <w:bottom w:val="nil"/>
+          <w:right w:val="nil"/>
+          <w:between w:val="nil"/>
+        </w:pBdr>
+        <w:ind w:left="2" w:right="136" w:firstLine="707"/>
+        <w:jc w:val="both"/>
+        <w:rPr>
+          <w:color w:val="000000" w:themeColor="text1"/>
+          <w:sz w:val="24"/>
+          <w:szCs w:val="24"/>
+          <w:lang w:val="es-ES"/>
+        </w:rPr>
+      </w:pPr>
+      <w:r>
+        <w:rPr>
+          <w:color w:val="000000" w:themeColor="text1"/>
+          <w:sz w:val="24"/>
+          <w:szCs w:val="24"/>
+          <w:lang w:val="es-ES"/>
+        </w:rPr>
+        <w:t>Se presentó la preceptiva reclamación extrajudicial con la comunicación del siniestro ante la aseguradora, en fecha 21 de mayo de 2024, de acuerdo a lo establecido en el art. 7 del Texto Refundido de la Ley de Responsabilidad Civil y Seguro en la circulación de vehículo a motor, aprobado por el Real Decreto Legislativo, 8/2004, de 29 de octubre, según redacción dada por la Ley 35/2014, de 22 de septiembre, de reforma del sistema para la valoración de los daños y perjuicios causados a las personas en accidentes de circulación, habiendo contestado la misma negando pago indemnizatorio, en los términos y según documentación acreditativa que queda adjunta a la presente demanda, no quedando a esta parte otro remedio que instar la actual demanda.</w:t>
+      </w:r>
+    </w:p>
+    <w:p>
+      <w:pPr>
+        <w:pBdr>
+          <w:top w:val="nil"/>
+          <w:left w:val="nil"/>
+          <w:bottom w:val="nil"/>
+          <w:right w:val="nil"/>
+          <w:between w:val="nil"/>
+        </w:pBdr>
+        <w:ind w:left="2" w:right="136" w:firstLine="707"/>
+        <w:jc w:val="both"/>
+        <w:rPr>
+          <w:color w:val="000000" w:themeColor="text1"/>
+          <w:sz w:val="24"/>
+          <w:szCs w:val="24"/>
+          <w:lang w:val="es-ES"/>
+        </w:rPr>
+      </w:pPr>
+    </w:p>
+    <w:p>
+      <w:pPr>
+        <w:pBdr>
+          <w:top w:val="nil"/>
+          <w:left w:val="nil"/>
+          <w:bottom w:val="nil"/>
+          <w:right w:val="nil"/>
+          <w:between w:val="nil"/>
+        </w:pBdr>
+        <w:ind w:left="2" w:right="136" w:firstLine="707"/>
+        <w:jc w:val="both"/>
+        <w:rPr>
+          <w:color w:val="000000" w:themeColor="text1"/>
+          <w:sz w:val="24"/>
+          <w:szCs w:val="24"/>
+          <w:lang w:val="es-ES"/>
+        </w:rPr>
+      </w:pPr>
+      <w:r>
+        <w:rPr>
+          <w:color w:val="000000" w:themeColor="text1"/>
+          <w:sz w:val="24"/>
+          <w:szCs w:val="24"/>
+          <w:lang w:val="es-ES"/>
+        </w:rPr>
+        <w:t>Se ha cumplido con el requisito de procedibilidad exigido en el art. 5 de la Ley Orgánica 1/2025, de 2 de enero, de Medidas de Eficiencia del Servicio Público de Justifica y desarrollados en los arts. 2 a 19 de dicho cuerpo legal acudiendo a un previo medio adecuado de solución de controversias (MASC).</w:t>
+      </w:r>
+    </w:p>
+    <w:p>
+      <w:pPr>
+        <w:pBdr>
+          <w:top w:val="nil"/>
+          <w:left w:val="nil"/>
+          <w:bottom w:val="nil"/>
+          <w:right w:val="nil"/>
+          <w:between w:val="nil"/>
+        </w:pBdr>
+        <w:ind w:left="2" w:right="136" w:firstLine="707"/>
+        <w:jc w:val="both"/>
+        <w:rPr>
+          <w:color w:val="000000" w:themeColor="text1"/>
+          <w:sz w:val="24"/>
+          <w:szCs w:val="24"/>
+          <w:lang w:val="es-ES"/>
+        </w:rPr>
+      </w:pPr>
+    </w:p>
+    <w:p>
+      <w:pPr>
+        <w:pBdr>
+          <w:top w:val="nil"/>
+          <w:left w:val="nil"/>
+          <w:bottom w:val="nil"/>
+          <w:right w:val="nil"/>
+          <w:between w:val="nil"/>
+        </w:pBdr>
+        <w:ind w:left="2" w:right="136" w:firstLine="707"/>
+        <w:jc w:val="both"/>
+        <w:rPr>
+          <w:color w:val="000000" w:themeColor="text1"/>
+          <w:sz w:val="24"/>
+          <w:szCs w:val="24"/>
+          <w:lang w:val="es-ES"/>
+        </w:rPr>
+      </w:pPr>
+      <w:r>
+        <w:rPr>
+          <w:color w:val="000000" w:themeColor="text1"/>
+          <w:sz w:val="24"/>
+          <w:szCs w:val="24"/>
+          <w:lang w:val="es-ES"/>
+        </w:rPr>
+        <w:t xml:space="preserve">Se acompaña, como </w:t>
+      </w:r>
+      <w:r>
+        <w:rPr>
+          <w:b/>
+          <w:bCs/>
+          <w:color w:val="000000" w:themeColor="text1"/>
+          <w:sz w:val="24"/>
+          <w:szCs w:val="24"/>
+          <w:lang w:val="es-ES"/>
+        </w:rPr>
+        <w:t xml:space="preserve">documento </w:t>
+      </w:r>
+      <w:proofErr w:type="spellStart"/>
+      <w:r>
+        <w:rPr>
+          <w:b/>
+          <w:bCs/>
+          <w:color w:val="000000" w:themeColor="text1"/>
+          <w:sz w:val="24"/>
+          <w:szCs w:val="24"/>
+          <w:lang w:val="es-ES"/>
+        </w:rPr>
+        <w:t>nº</w:t>
+      </w:r>
+      <w:proofErr w:type="spellEnd"/>
+      <w:r>
+        <w:rPr>
+          <w:b/>
+          <w:bCs/>
+          <w:color w:val="000000" w:themeColor="text1"/>
+          <w:sz w:val="24"/>
+          <w:szCs w:val="24"/>
+          <w:lang w:val="es-ES"/>
+        </w:rPr>
+        <w:t xml:space="preserve"> 1</w:t>
+      </w:r>
+      <w:r>
+        <w:rPr>
+          <w:color w:val="000000" w:themeColor="text1"/>
+          <w:sz w:val="24"/>
+          <w:szCs w:val="24"/>
+          <w:lang w:val="es-ES"/>
+        </w:rPr>
+        <w:t>, dicha Comunicación a la aseguradora a efectos de acreditación del intento de negociación, con terminación del proceso sin acuerdo del art. 10.1 de la LO 1/2025 tal como recoge el art. 264.4 LEC.</w:t>
+      </w:r>
+    </w:p>
+    <w:p>
+      <w:pPr>
+        <w:pBdr>
+          <w:top w:val="nil"/>
+          <w:left w:val="nil"/>
+          <w:bottom w:val="nil"/>
+          <w:right w:val="nil"/>
+          <w:between w:val="nil"/>
+        </w:pBdr>
+        <w:ind w:left="2" w:right="136" w:firstLine="707"/>
+        <w:jc w:val="both"/>
+        <w:rPr>
+          <w:color w:val="000000" w:themeColor="text1"/>
+          <w:sz w:val="24"/>
+          <w:szCs w:val="24"/>
+          <w:lang w:val="es-ES"/>
+        </w:rPr>
+      </w:pPr>
+    </w:p>
+    <w:p>
+      <w:pPr>
+        <w:pBdr>
+          <w:top w:val="nil"/>
+          <w:left w:val="nil"/>
+          <w:bottom w:val="nil"/>
+          <w:right w:val="nil"/>
+          <w:between w:val="nil"/>
+        </w:pBdr>
+        <w:ind w:left="2" w:right="136" w:firstLine="707"/>
+        <w:jc w:val="both"/>
+        <w:rPr>
+          <w:color w:val="000000" w:themeColor="text1"/>
+          <w:sz w:val="24"/>
+          <w:szCs w:val="24"/>
+          <w:lang w:val="es-ES"/>
+        </w:rPr>
+      </w:pPr>
+      <w:proofErr w:type="gramStart"/>
+      <w:r>
+        <w:rPr>
+          <w:b/>
+          <w:bCs/>
+          <w:color w:val="000000" w:themeColor="text1"/>
+          <w:sz w:val="24"/>
+          <w:szCs w:val="24"/>
+          <w:lang w:val="es-ES"/>
+        </w:rPr>
+        <w:t>PRIMERO</w:t>
+      </w:r>
+      <w:r>
+        <w:rPr>
+          <w:color w:val="000000" w:themeColor="text1"/>
+          <w:sz w:val="24"/>
+          <w:szCs w:val="24"/>
+          <w:lang w:val="es-ES"/>
+        </w:rPr>
+        <w:t>.-</w:t>
+      </w:r>
+      <w:proofErr w:type="gramEnd"/>
+      <w:r>
+        <w:rPr>
+          <w:color w:val="000000" w:themeColor="text1"/>
+          <w:sz w:val="24"/>
+          <w:szCs w:val="24"/>
+          <w:lang w:val="es-ES"/>
+        </w:rPr>
+        <w:t xml:space="preserve"> El día </w:t>
+      </w:r>
+      <w:r>
+        <w:rPr>
+          <w:color w:val="000000" w:themeColor="text1"/>
+          <w:sz w:val="24"/>
+          <w:szCs w:val="24"/>
+          <w:highlight w:val="green"/>
+          <w:lang w:val="es-ES"/>
+        </w:rPr>
+        <w:t>{{Fecha accidente</w:t>
+      </w:r>
+      <w:r>
+        <w:rPr>
+          <w:color w:val="000000" w:themeColor="text1"/>
+          <w:sz w:val="24"/>
+          <w:szCs w:val="24"/>
+          <w:highlight w:val="green"/>
+          <w:lang w:val="es-ES"/>
+        </w:rPr>
+        <w:t xml:space="preserve"> [date]</w:t>
+      </w:r>
+      <w:r>
+        <w:rPr>
+          <w:color w:val="000000" w:themeColor="text1"/>
+          <w:sz w:val="24"/>
+          <w:szCs w:val="24"/>
+          <w:highlight w:val="green"/>
+          <w:lang w:val="es-ES"/>
+        </w:rPr>
+        <w:t>}}</w:t>
+      </w:r>
+      <w:r>
+        <w:rPr>
+          <w:color w:val="000000" w:themeColor="text1"/>
+          <w:sz w:val="24"/>
+          <w:szCs w:val="24"/>
+          <w:highlight w:val="green"/>
+          <w:lang w:val="es-ES"/>
+        </w:rPr>
+        <w:t>,</w:t>
+      </w:r>
+      <w:r>
+        <w:rPr>
+          <w:color w:val="000000" w:themeColor="text1"/>
+          <w:sz w:val="24"/>
+          <w:szCs w:val="24"/>
+          <w:lang w:val="es-ES"/>
+        </w:rPr>
+        <w:t xml:space="preserve"> mi representada, </w:t>
+      </w:r>
+      <w:r>
+        <w:rPr>
+          <w:color w:val="000000" w:themeColor="text1"/>
+          <w:sz w:val="24"/>
+          <w:szCs w:val="24"/>
+          <w:highlight w:val="yellow"/>
+          <w:lang w:val="es-ES"/>
+        </w:rPr>
+        <w:t xml:space="preserve">sobre las 14:30 horas, iba conduciendo el vehículo matrícula 7199-GHT por el carril izquierdo de la GC-10, próximo a la rotonda </w:t>
+      </w:r>
+      <w:proofErr w:type="spellStart"/>
+      <w:r>
+        <w:rPr>
+          <w:color w:val="000000" w:themeColor="text1"/>
+          <w:sz w:val="24"/>
+          <w:szCs w:val="24"/>
+          <w:highlight w:val="yellow"/>
+          <w:lang w:val="es-ES"/>
+        </w:rPr>
+        <w:t>Daora</w:t>
+      </w:r>
+      <w:proofErr w:type="spellEnd"/>
+      <w:r>
+        <w:rPr>
+          <w:color w:val="000000" w:themeColor="text1"/>
+          <w:sz w:val="24"/>
+          <w:szCs w:val="24"/>
+          <w:highlight w:val="yellow"/>
+          <w:lang w:val="es-ES"/>
+        </w:rPr>
+        <w:t>, en el término municipal de Telde.</w:t>
+      </w:r>
+    </w:p>
+    <w:p>
+      <w:pPr>
+        <w:pBdr>
+          <w:top w:val="nil"/>
+          <w:left w:val="nil"/>
+          <w:bottom w:val="nil"/>
+          <w:right w:val="nil"/>
+          <w:between w:val="nil"/>
+        </w:pBdr>
+        <w:ind w:left="2" w:right="136" w:firstLine="707"/>
+        <w:jc w:val="both"/>
+        <w:rPr>
+          <w:color w:val="000000" w:themeColor="text1"/>
+          <w:sz w:val="24"/>
+          <w:szCs w:val="24"/>
+          <w:lang w:val="es-ES"/>
+        </w:rPr>
+      </w:pPr>
+    </w:p>
+    <w:p>
+      <w:pPr>
+        <w:pBdr>
+          <w:top w:val="nil"/>
+          <w:left w:val="nil"/>
+          <w:bottom w:val="nil"/>
+          <w:right w:val="nil"/>
+          <w:between w:val="nil"/>
+        </w:pBdr>
+        <w:ind w:left="2" w:right="136" w:firstLine="707"/>
+        <w:jc w:val="both"/>
+        <w:rPr>
+          <w:color w:val="000000" w:themeColor="text1"/>
+          <w:sz w:val="24"/>
+          <w:szCs w:val="24"/>
+          <w:lang w:val="es-ES"/>
+        </w:rPr>
+      </w:pPr>
+    </w:p>
+    <w:p>
+      <w:pPr>
+        <w:pBdr>
+          <w:top w:val="nil"/>
+          <w:left w:val="nil"/>
+          <w:bottom w:val="nil"/>
+          <w:right w:val="nil"/>
+          <w:between w:val="nil"/>
+        </w:pBdr>
+        <w:ind w:left="2" w:right="136" w:firstLine="707"/>
+        <w:jc w:val="both"/>
+        <w:rPr>
+          <w:color w:val="000000" w:themeColor="text1"/>
+          <w:sz w:val="24"/>
+          <w:szCs w:val="24"/>
+          <w:lang w:val="es-ES"/>
+        </w:rPr>
+      </w:pPr>
+      <w:r>
+        <w:rPr>
+          <w:color w:val="000000" w:themeColor="text1"/>
+          <w:sz w:val="24"/>
+          <w:szCs w:val="24"/>
+          <w:lang w:val="es-ES"/>
+        </w:rPr>
+        <w:t>{{Descripción accidente</w:t>
+      </w:r>
+      <w:r>
+        <w:rPr>
+          <w:color w:val="000000" w:themeColor="text1"/>
+          <w:sz w:val="24"/>
+          <w:szCs w:val="24"/>
+          <w:lang w:val="es-ES"/>
+        </w:rPr>
+        <w:t xml:space="preserve"> [</w:t>
+      </w:r>
+      <w:proofErr w:type="spellStart"/>
+      <w:r>
+        <w:rPr>
+          <w:color w:val="000000" w:themeColor="text1"/>
+          <w:sz w:val="24"/>
+          <w:szCs w:val="24"/>
+          <w:lang w:val="es-ES"/>
+        </w:rPr>
+        <w:t>select</w:t>
+      </w:r>
+      <w:proofErr w:type="spellEnd"/>
+      <w:r>
+        <w:rPr>
+          <w:color w:val="000000" w:themeColor="text1"/>
+          <w:sz w:val="24"/>
+          <w:szCs w:val="24"/>
+          <w:lang w:val="es-ES"/>
+        </w:rPr>
+        <w:t>]</w:t>
+      </w:r>
+    </w:p>
+    <w:p>
+      <w:pPr>
+        <w:pBdr>
+          <w:top w:val="nil"/>
+          <w:left w:val="nil"/>
+          <w:bottom w:val="nil"/>
+          <w:right w:val="nil"/>
+          <w:between w:val="nil"/>
+        </w:pBdr>
+        <w:ind w:left="2" w:right="136" w:firstLine="707"/>
+        <w:jc w:val="both"/>
+        <w:rPr>
+          <w:color w:val="000000" w:themeColor="text1"/>
+          <w:sz w:val="24"/>
+          <w:szCs w:val="24"/>
+        </w:rPr>
+      </w:pPr>
+    </w:p>
+    <w:p>
+      <w:pPr>
+        <w:pBdr>
+          <w:top w:val="nil"/>
+          <w:left w:val="nil"/>
+          <w:bottom w:val="nil"/>
+          <w:right w:val="nil"/>
+          <w:between w:val="nil"/>
+        </w:pBdr>
+        <w:ind w:left="2" w:right="136" w:firstLine="707"/>
+        <w:jc w:val="both"/>
+        <w:rPr>
+          <w:color w:val="000000" w:themeColor="text1"/>
+          <w:sz w:val="24"/>
+          <w:szCs w:val="24"/>
+          <w:lang w:val="es-ES"/>
+        </w:rPr>
+      </w:pPr>
+      <w:r>
+        <w:rPr>
+          <w:color w:val="000000" w:themeColor="text1"/>
+          <w:sz w:val="24"/>
+          <w:szCs w:val="24"/>
+          <w:lang w:val="es-ES"/>
+        </w:rPr>
+        <w:t>{Colisión por alcance} {</w:t>
+      </w:r>
+      <w:r>
+        <w:rPr>
+          <w:sz w:val="24"/>
+          <w:szCs w:val="24"/>
+          <w:highlight w:val="green"/>
+          <w:lang w:val="es-ES"/>
+        </w:rPr>
+        <w:t xml:space="preserve">El vehículo vino por detrás y le </w:t>
+      </w:r>
+      <w:r>
+        <w:rPr>
+          <w:sz w:val="24"/>
+          <w:szCs w:val="24"/>
+          <w:highlight w:val="green"/>
+          <w:lang w:val="es-ES"/>
+        </w:rPr>
+        <w:t xml:space="preserve">metió </w:t>
+      </w:r>
+      <w:r>
+        <w:rPr>
+          <w:sz w:val="24"/>
+          <w:szCs w:val="24"/>
+          <w:highlight w:val="green"/>
+          <w:lang w:val="es-ES"/>
+        </w:rPr>
+        <w:t>tremendo</w:t>
+      </w:r>
+      <w:r>
+        <w:rPr>
+          <w:sz w:val="24"/>
+          <w:szCs w:val="24"/>
+          <w:highlight w:val="green"/>
+          <w:lang w:val="es-ES"/>
+        </w:rPr>
+        <w:t xml:space="preserve"> viaje …</w:t>
+      </w:r>
+      <w:r>
+        <w:rPr>
           <w:sz w:val="24"/>
           <w:szCs w:val="24"/>
           <w:lang w:val="es-ES"/>
         </w:rPr>
         <w:t>}</w:t>
       </w:r>
-      <w:r>
-        <w:rPr>
-          <w:color w:val="000000" w:themeColor="text1"/>
-          <w:sz w:val="24"/>
-          <w:szCs w:val="24"/>
-          <w:lang w:val="es-ES"/>
-        </w:rPr>
-        <w:t xml:space="preserve"> {DOÑA}</w:t>
-      </w:r>
     </w:p>
     <w:p>
       <w:pPr>
@@ -286,12 +1132,6 @@
         </w:pBdr>
         <w:ind w:left="2" w:right="136" w:firstLine="707"/>
         <w:jc w:val="both"/>
-        <w:rPr>
-          <w:color w:val="000000" w:themeColor="text1"/>
-          <w:sz w:val="24"/>
-          <w:szCs w:val="24"/>
-          <w:lang w:val="es-ES"/>
-        </w:rPr>
       </w:pPr>
     </w:p>
     <w:p>
@@ -319,26 +1159,27 @@
           <w:szCs w:val="24"/>
           <w:lang w:val="es-ES"/>
         </w:rPr>
+        <w:t>{Rotonda} {</w:t>
+      </w:r>
+      <w:r>
+        <w:rPr>
+          <w:color w:val="000000" w:themeColor="text1"/>
+          <w:sz w:val="24"/>
+          <w:szCs w:val="24"/>
+          <w:highlight w:val="green"/>
+          <w:lang w:val="es-ES"/>
+        </w:rPr>
+        <w:t>El vehículo entro en la rotonda…</w:t>
+      </w:r>
+      <w:r>
+        <w:rPr>
+          <w:color w:val="000000" w:themeColor="text1"/>
+          <w:sz w:val="24"/>
+          <w:szCs w:val="24"/>
+          <w:lang w:val="es-ES"/>
+        </w:rPr>
         <w:t>}</w:t>
       </w:r>
-      <w:r>
-        <w:rPr>
-          <w:color w:val="000000" w:themeColor="text1"/>
-          <w:sz w:val="24"/>
-          <w:szCs w:val="24"/>
-          <w:lang w:val="es-ES"/>
-        </w:rPr>
-        <w:t>}</w:t>
-      </w:r>
-      <w:r>
-        <w:rPr>
-          <w:color w:val="000000" w:themeColor="text1"/>
-          <w:sz w:val="24"/>
-          <w:szCs w:val="24"/>
-          <w:lang w:val="es-ES"/>
-        </w:rPr>
-        <w:t xml:space="preserve"> </w:t>
-      </w:r>
     </w:p>
     <w:p>
       <w:pPr>
@@ -351,12 +1192,6 @@
         </w:pBdr>
         <w:ind w:left="2" w:right="136" w:firstLine="707"/>
         <w:jc w:val="both"/>
-        <w:rPr>
-          <w:color w:val="000000" w:themeColor="text1"/>
-          <w:sz w:val="24"/>
-          <w:szCs w:val="24"/>
-          <w:lang w:val="es-ES"/>
-        </w:rPr>
       </w:pPr>
     </w:p>
     <w:p>
@@ -371,274 +1206,65 @@
         <w:ind w:left="2" w:right="136" w:firstLine="707"/>
         <w:jc w:val="both"/>
         <w:rPr>
-          <w:color w:val="000000"/>
-          <w:sz w:val="24"/>
-          <w:szCs w:val="24"/>
-          <w:lang w:val="es-ES"/>
-        </w:rPr>
-      </w:pPr>
-      <w:r>
-        <w:rPr>
-          <w:b/>
-          <w:bCs/>
-          <w:color w:val="000000" w:themeColor="text1"/>
-          <w:sz w:val="24"/>
-          <w:szCs w:val="24"/>
-          <w:lang w:val="es-ES"/>
-        </w:rPr>
-        <w:t>{</w:t>
-      </w:r>
-      <w:r>
-        <w:rPr>
-          <w:b/>
-          <w:bCs/>
-          <w:color w:val="000000" w:themeColor="text1"/>
-          <w:sz w:val="24"/>
-          <w:szCs w:val="24"/>
-          <w:lang w:val="es-ES"/>
-        </w:rPr>
-        <w:t>{NOMBRE}}</w:t>
-      </w:r>
-      <w:r>
-        <w:rPr>
-          <w:color w:val="000000" w:themeColor="text1"/>
-          <w:sz w:val="24"/>
-          <w:szCs w:val="24"/>
-          <w:lang w:val="es-ES"/>
-        </w:rPr>
-        <w:t xml:space="preserve">, mayor de edad, con DNI 45362114-L, y domicilio en calle Paraguay, 44, 35210, Telde, </w:t>
-      </w:r>
-      <w:r>
-        <w:rPr>
-          <w:color w:val="0070C0"/>
-          <w:sz w:val="24"/>
-          <w:szCs w:val="24"/>
-          <w:lang w:val="es-ES"/>
-        </w:rPr>
-        <w:t>en virtud de</w:t>
-      </w:r>
-      <w:r>
-        <w:rPr>
-          <w:color w:val="0070C0"/>
-          <w:sz w:val="24"/>
-          <w:szCs w:val="24"/>
-          <w:lang w:val="es-ES"/>
-        </w:rPr>
-        <w:t xml:space="preserve"> </w:t>
-      </w:r>
-      <w:r>
-        <w:rPr>
-          <w:color w:val="0070C0"/>
-          <w:sz w:val="24"/>
-          <w:szCs w:val="24"/>
-          <w:lang w:val="es-ES"/>
-        </w:rPr>
-        <w:t>juju</w:t>
-      </w:r>
-      <w:r>
-        <w:rPr>
-          <w:color w:val="0070C0"/>
-          <w:sz w:val="24"/>
-          <w:szCs w:val="24"/>
-          <w:lang w:val="es-ES"/>
-        </w:rPr>
-        <w:t xml:space="preserve"> apoderamiento </w:t>
-      </w:r>
-      <w:r>
-        <w:rPr>
-          <w:color w:val="000000" w:themeColor="text1"/>
-          <w:sz w:val="24"/>
-          <w:szCs w:val="24"/>
-          <w:lang w:val="es-ES"/>
-        </w:rPr>
-        <w:t>“apud acta” que se conferirá en el juzgado en el momento procesal oportuno, y asistida por el Letrado D. Reinaldo Velázquez Quintana, como mejor proceda en Derecho comparezco y DIGO:</w:t>
-      </w:r>
-    </w:p>
-    <w:p>
-      <w:pPr>
-        <w:pBdr>
-          <w:top w:val="nil"/>
-          <w:left w:val="nil"/>
-          <w:bottom w:val="nil"/>
-          <w:right w:val="nil"/>
-          <w:between w:val="nil"/>
-        </w:pBdr>
-        <w:ind w:left="2" w:right="136" w:firstLine="707"/>
-        <w:jc w:val="both"/>
-        <w:rPr>
-          <w:color w:val="000000" w:themeColor="text1"/>
-          <w:sz w:val="24"/>
-          <w:szCs w:val="24"/>
-        </w:rPr>
-      </w:pPr>
-    </w:p>
-    <w:p>
-      <w:pPr>
-        <w:pBdr>
-          <w:top w:val="nil"/>
-          <w:left w:val="nil"/>
-          <w:bottom w:val="nil"/>
-          <w:right w:val="nil"/>
-          <w:between w:val="nil"/>
-        </w:pBdr>
-        <w:ind w:left="2" w:right="136" w:firstLine="707"/>
-        <w:jc w:val="both"/>
-        <w:rPr>
-          <w:color w:val="000000" w:themeColor="text1"/>
-          <w:sz w:val="24"/>
-          <w:szCs w:val="24"/>
-          <w:lang w:val="es-ES"/>
-        </w:rPr>
-      </w:pPr>
-      <w:r>
-        <w:rPr>
-          <w:color w:val="000000" w:themeColor="text1"/>
-          <w:sz w:val="24"/>
-          <w:szCs w:val="24"/>
-          <w:lang w:val="es-ES"/>
-        </w:rPr>
-        <w:t>{{Descripción accidente</w:t>
-      </w:r>
-      <w:r>
-        <w:rPr>
-          <w:color w:val="000000" w:themeColor="text1"/>
-          <w:sz w:val="24"/>
-          <w:szCs w:val="24"/>
-          <w:lang w:val="es-ES"/>
-        </w:rPr>
-        <w:t xml:space="preserve"> [select]</w:t>
-      </w:r>
-    </w:p>
-    <w:p>
-      <w:pPr>
-        <w:pBdr>
-          <w:top w:val="nil"/>
-          <w:left w:val="nil"/>
-          <w:bottom w:val="nil"/>
-          <w:right w:val="nil"/>
-          <w:between w:val="nil"/>
-        </w:pBdr>
-        <w:ind w:left="2" w:right="136" w:firstLine="707"/>
-        <w:jc w:val="both"/>
-        <w:rPr>
-          <w:color w:val="000000" w:themeColor="text1"/>
-          <w:sz w:val="24"/>
-          <w:szCs w:val="24"/>
-        </w:rPr>
-      </w:pPr>
-    </w:p>
-    <w:p>
-      <w:pPr>
-        <w:pBdr>
-          <w:top w:val="nil"/>
-          <w:left w:val="nil"/>
-          <w:bottom w:val="nil"/>
-          <w:right w:val="nil"/>
-          <w:between w:val="nil"/>
-        </w:pBdr>
-        <w:ind w:left="2" w:right="136" w:firstLine="707"/>
-        <w:jc w:val="both"/>
-        <w:rPr>
-          <w:color w:val="000000" w:themeColor="text1"/>
-          <w:sz w:val="24"/>
-          <w:szCs w:val="24"/>
-          <w:lang w:val="es-ES"/>
-        </w:rPr>
-      </w:pPr>
-      <w:r>
-        <w:rPr>
-          <w:color w:val="000000" w:themeColor="text1"/>
-          <w:sz w:val="24"/>
-          <w:szCs w:val="24"/>
-          <w:lang w:val="es-ES"/>
-        </w:rPr>
-        <w:t>{Colisión por alcance} {</w:t>
-      </w:r>
-      <w:r>
-        <w:rPr>
+          <w:color w:val="000000" w:themeColor="text1"/>
+          <w:sz w:val="24"/>
+          <w:szCs w:val="24"/>
+          <w:lang w:val="es-ES"/>
+        </w:rPr>
+      </w:pPr>
+      <w:r>
+        <w:rPr>
+          <w:color w:val="000000" w:themeColor="text1"/>
+          <w:sz w:val="24"/>
+          <w:szCs w:val="24"/>
+          <w:lang w:val="es-ES"/>
+        </w:rPr>
+        <w:t>{Autopista} {</w:t>
+      </w:r>
+      <w:r>
+        <w:rPr>
+          <w:color w:val="000000" w:themeColor="text1"/>
           <w:sz w:val="24"/>
           <w:szCs w:val="24"/>
           <w:highlight w:val="green"/>
           <w:lang w:val="es-ES"/>
         </w:rPr>
-        <w:t xml:space="preserve">El vehículo vino por detrás y le </w:t>
-      </w:r>
-      <w:r>
-        <w:rPr>
+        <w:t xml:space="preserve">Que, de forma repentina, vino desde el interior de la rotonda </w:t>
+      </w:r>
+      <w:proofErr w:type="spellStart"/>
+      <w:r>
+        <w:rPr>
+          <w:color w:val="000000" w:themeColor="text1"/>
           <w:sz w:val="24"/>
           <w:szCs w:val="24"/>
           <w:highlight w:val="green"/>
           <w:lang w:val="es-ES"/>
         </w:rPr>
-        <w:t xml:space="preserve">metió </w:t>
-      </w:r>
-      <w:r>
-        <w:rPr>
+        <w:t>Daora</w:t>
+      </w:r>
+      <w:proofErr w:type="spellEnd"/>
+      <w:r>
+        <w:rPr>
+          <w:color w:val="000000" w:themeColor="text1"/>
           <w:sz w:val="24"/>
           <w:szCs w:val="24"/>
           <w:highlight w:val="green"/>
           <w:lang w:val="es-ES"/>
         </w:rPr>
-        <w:t>tremendo</w:t>
-      </w:r>
-      <w:r>
-        <w:rPr>
+        <w:t xml:space="preserve"> el vehículo matrícula 8954-BKX, conducido por D. Francisco García Magariño y asegurado en Reale y, al incorporarse a la GC-10, golpeó, de forma </w:t>
+      </w:r>
+      <w:proofErr w:type="spellStart"/>
+      <w:r>
+        <w:rPr>
+          <w:color w:val="000000" w:themeColor="text1"/>
           <w:sz w:val="24"/>
           <w:szCs w:val="24"/>
           <w:highlight w:val="green"/>
           <w:lang w:val="es-ES"/>
         </w:rPr>
-        <w:t xml:space="preserve"> viaje …</w:t>
-      </w:r>
-      <w:r>
-        <w:rPr>
-          <w:sz w:val="24"/>
-          <w:szCs w:val="24"/>
-          <w:lang w:val="es-ES"/>
-        </w:rPr>
-        <w:t>}</w:t>
-      </w:r>
-    </w:p>
-    <w:p>
-      <w:pPr>
-        <w:pBdr>
-          <w:top w:val="nil"/>
-          <w:left w:val="nil"/>
-          <w:bottom w:val="nil"/>
-          <w:right w:val="nil"/>
-          <w:between w:val="nil"/>
-        </w:pBdr>
-        <w:ind w:left="2" w:right="136" w:firstLine="707"/>
-        <w:jc w:val="both"/>
-      </w:pPr>
-    </w:p>
-    <w:p>
-      <w:pPr>
-        <w:pBdr>
-          <w:top w:val="nil"/>
-          <w:left w:val="nil"/>
-          <w:bottom w:val="nil"/>
-          <w:right w:val="nil"/>
-          <w:between w:val="nil"/>
-        </w:pBdr>
-        <w:ind w:left="2" w:right="136" w:firstLine="707"/>
-        <w:jc w:val="both"/>
-        <w:rPr>
-          <w:color w:val="000000" w:themeColor="text1"/>
-          <w:sz w:val="24"/>
-          <w:szCs w:val="24"/>
-          <w:lang w:val="es-ES"/>
-        </w:rPr>
-      </w:pPr>
-      <w:r>
-        <w:rPr>
-          <w:color w:val="000000" w:themeColor="text1"/>
-          <w:sz w:val="24"/>
-          <w:szCs w:val="24"/>
-          <w:lang w:val="es-ES"/>
-        </w:rPr>
-        <w:t>{Rotonda} {</w:t>
-      </w:r>
+        <w:t>fronto</w:t>
+      </w:r>
+      <w:proofErr w:type="spellEnd"/>
       <w:r>
         <w:rPr>
           <w:color w:val="000000" w:themeColor="text1"/>
@@ -647,67 +1273,7 @@
           <w:highlight w:val="green"/>
           <w:lang w:val="es-ES"/>
         </w:rPr>
-        <w:t>El vehículo entro en la rotonda…</w:t>
-      </w:r>
-      <w:r>
-        <w:rPr>
-          <w:color w:val="000000" w:themeColor="text1"/>
-          <w:sz w:val="24"/>
-          <w:szCs w:val="24"/>
-          <w:lang w:val="es-ES"/>
-        </w:rPr>
-        <w:t>}</w:t>
-      </w:r>
-    </w:p>
-    <w:p>
-      <w:pPr>
-        <w:pBdr>
-          <w:top w:val="nil"/>
-          <w:left w:val="nil"/>
-          <w:bottom w:val="nil"/>
-          <w:right w:val="nil"/>
-          <w:between w:val="nil"/>
-        </w:pBdr>
-        <w:ind w:left="2" w:right="136" w:firstLine="707"/>
-        <w:jc w:val="both"/>
-      </w:pPr>
-    </w:p>
-    <w:p>
-      <w:pPr>
-        <w:pBdr>
-          <w:top w:val="nil"/>
-          <w:left w:val="nil"/>
-          <w:bottom w:val="nil"/>
-          <w:right w:val="nil"/>
-          <w:between w:val="nil"/>
-        </w:pBdr>
-        <w:ind w:left="2" w:right="136" w:firstLine="707"/>
-        <w:jc w:val="both"/>
-        <w:rPr>
-          <w:color w:val="000000" w:themeColor="text1"/>
-          <w:sz w:val="24"/>
-          <w:szCs w:val="24"/>
-          <w:lang w:val="es-ES"/>
-        </w:rPr>
-      </w:pPr>
-      <w:r>
-        <w:rPr>
-          <w:color w:val="000000" w:themeColor="text1"/>
-          <w:sz w:val="24"/>
-          <w:szCs w:val="24"/>
-          <w:lang w:val="es-ES"/>
-        </w:rPr>
-        <w:t>{Autopista} {</w:t>
-      </w:r>
-      <w:r>
-        <w:rPr>
-          <w:color w:val="000000" w:themeColor="text1"/>
-          <w:sz w:val="24"/>
-          <w:szCs w:val="24"/>
-          <w:highlight w:val="green"/>
-          <w:lang w:val="es-ES"/>
-        </w:rPr>
-        <w:t>Que, de forma repentina, vino desde el interior de la rotonda Daora el vehículo matrícula 8954-BKX, conducido por D. Francisco García Magariño y asegurado en Reale y, al incorporarse a la GC-10, golpeó, de forma fronto-angular, el lateral del vehículo de mi mandante que, habiendo sufrido daños materiales, fueron ya reparados por convenio entre las entidades aseguradoras</w:t>
+        <w:t>-angular, el lateral del vehículo de mi mandante que, habiendo sufrido daños materiales, fueron ya reparados por convenio entre las entidades aseguradoras</w:t>
       </w:r>
       <w:r>
         <w:rPr>
@@ -853,6 +1419,7 @@
         </w:rPr>
         <w:t xml:space="preserve"> {{Días de perjuicio totales [date </w:t>
       </w:r>
+      <w:proofErr w:type="spellStart"/>
       <w:r>
         <w:rPr>
           <w:b/>
@@ -863,8 +1430,9 @@
           <w:u w:val="single"/>
           <w:lang w:val="es-ES"/>
         </w:rPr>
-        <w:t>range]</w:t>
-      </w:r>
+        <w:t>range</w:t>
+      </w:r>
+      <w:proofErr w:type="spellEnd"/>
       <w:r>
         <w:rPr>
           <w:b/>
@@ -875,6 +1443,18 @@
           <w:u w:val="single"/>
           <w:lang w:val="es-ES"/>
         </w:rPr>
+        <w:t>]</w:t>
+      </w:r>
+      <w:r>
+        <w:rPr>
+          <w:b/>
+          <w:bCs/>
+          <w:color w:val="000000" w:themeColor="text1"/>
+          <w:sz w:val="24"/>
+          <w:szCs w:val="24"/>
+          <w:u w:val="single"/>
+          <w:lang w:val="es-ES"/>
+        </w:rPr>
         <w:t>}}</w:t>
       </w:r>
       <w:r>
@@ -914,7 +1494,27 @@
           <w:szCs w:val="24"/>
           <w:lang w:val="es-ES"/>
         </w:rPr>
-        <w:t>{{Días de perjuicio totales: start}}</w:t>
+        <w:t xml:space="preserve">{{Días de perjuicio totales: </w:t>
+      </w:r>
+      <w:proofErr w:type="spellStart"/>
+      <w:r>
+        <w:rPr>
+          <w:color w:val="000000" w:themeColor="text1"/>
+          <w:sz w:val="24"/>
+          <w:szCs w:val="24"/>
+          <w:lang w:val="es-ES"/>
+        </w:rPr>
+        <w:t>start</w:t>
+      </w:r>
+      <w:proofErr w:type="spellEnd"/>
+      <w:r>
+        <w:rPr>
+          <w:color w:val="000000" w:themeColor="text1"/>
+          <w:sz w:val="24"/>
+          <w:szCs w:val="24"/>
+          <w:lang w:val="es-ES"/>
+        </w:rPr>
+        <w:t>}}</w:t>
       </w:r>
       <w:r>
         <w:rPr>
@@ -932,7 +1532,27 @@
           <w:szCs w:val="24"/>
           <w:lang w:val="es-ES"/>
         </w:rPr>
-        <w:t>{{Días de perjuicio totales: end}}</w:t>
+        <w:t xml:space="preserve">{{Días de perjuicio totales: </w:t>
+      </w:r>
+      <w:proofErr w:type="spellStart"/>
+      <w:r>
+        <w:rPr>
+          <w:color w:val="000000" w:themeColor="text1"/>
+          <w:sz w:val="24"/>
+          <w:szCs w:val="24"/>
+          <w:lang w:val="es-ES"/>
+        </w:rPr>
+        <w:t>end</w:t>
+      </w:r>
+      <w:proofErr w:type="spellEnd"/>
+      <w:r>
+        <w:rPr>
+          <w:color w:val="000000" w:themeColor="text1"/>
+          <w:sz w:val="24"/>
+          <w:szCs w:val="24"/>
+          <w:lang w:val="es-ES"/>
+        </w:rPr>
+        <w:t>}}</w:t>
       </w:r>
       <w:r>
         <w:rPr>
@@ -962,6 +1582,7 @@
         </w:rPr>
         <w:t>{{Días de perjuicio moderado [</w:t>
       </w:r>
+      <w:proofErr w:type="spellStart"/>
       <w:r>
         <w:rPr>
           <w:color w:val="000000" w:themeColor="text1"/>
@@ -972,6 +1593,7 @@
         </w:rPr>
         <w:t>int</w:t>
       </w:r>
+      <w:proofErr w:type="spellEnd"/>
       <w:r>
         <w:rPr>
           <w:color w:val="000000" w:themeColor="text1"/>
@@ -1070,6 +1692,7 @@
         </w:rPr>
         <w:t xml:space="preserve"> [</w:t>
       </w:r>
+      <w:proofErr w:type="spellStart"/>
       <w:r>
         <w:rPr>
           <w:color w:val="000000" w:themeColor="text1"/>
@@ -1080,6 +1703,7 @@
         </w:rPr>
         <w:t>int</w:t>
       </w:r>
+      <w:proofErr w:type="spellEnd"/>
       <w:r>
         <w:rPr>
           <w:color w:val="000000" w:themeColor="text1"/>
@@ -1171,7 +1795,27 @@
           <w:szCs w:val="24"/>
           <w:lang w:val="es-ES"/>
         </w:rPr>
-        <w:t xml:space="preserve">[checkbox:2:autowrap] </w:t>
+        <w:t>[checkbox:</w:t>
+      </w:r>
+      <w:proofErr w:type="gramStart"/>
+      <w:r>
+        <w:rPr>
+          <w:color w:val="000000" w:themeColor="text1"/>
+          <w:sz w:val="24"/>
+          <w:szCs w:val="24"/>
+          <w:lang w:val="es-ES"/>
+        </w:rPr>
+        <w:t>2:autowrap</w:t>
+      </w:r>
+      <w:proofErr w:type="gramEnd"/>
+      <w:r>
+        <w:rPr>
+          <w:color w:val="000000" w:themeColor="text1"/>
+          <w:sz w:val="24"/>
+          <w:szCs w:val="24"/>
+          <w:lang w:val="es-ES"/>
+        </w:rPr>
+        <w:t xml:space="preserve">] </w:t>
       </w:r>
     </w:p>
     <w:p>
@@ -1210,8 +1854,45 @@
           <w:szCs w:val="24"/>
           <w:lang w:val="es-ES"/>
         </w:rPr>
-        <w:t>documento nº [num</w:t>
-      </w:r>
+        <w:t xml:space="preserve">documento </w:t>
+      </w:r>
+      <w:proofErr w:type="spellStart"/>
+      <w:r>
+        <w:rPr>
+          <w:b/>
+          <w:bCs/>
+          <w:color w:val="000000" w:themeColor="text1"/>
+          <w:sz w:val="24"/>
+          <w:szCs w:val="24"/>
+          <w:lang w:val="es-ES"/>
+        </w:rPr>
+        <w:t>nº</w:t>
+      </w:r>
+      <w:proofErr w:type="spellEnd"/>
+      <w:r>
+        <w:rPr>
+          <w:b/>
+          <w:bCs/>
+          <w:color w:val="000000" w:themeColor="text1"/>
+          <w:sz w:val="24"/>
+          <w:szCs w:val="24"/>
+          <w:lang w:val="es-ES"/>
+        </w:rPr>
+        <w:t xml:space="preserve"> [</w:t>
+      </w:r>
+      <w:proofErr w:type="spellStart"/>
+      <w:r>
+        <w:rPr>
+          <w:b/>
+          <w:bCs/>
+          <w:color w:val="000000" w:themeColor="text1"/>
+          <w:sz w:val="24"/>
+          <w:szCs w:val="24"/>
+          <w:lang w:val="es-ES"/>
+        </w:rPr>
+        <w:t>num</w:t>
+      </w:r>
+      <w:proofErr w:type="spellEnd"/>
       <w:r>
         <w:rPr>
           <w:b/>
@@ -1289,8 +1970,45 @@
           <w:szCs w:val="24"/>
           <w:lang w:val="es-ES"/>
         </w:rPr>
-        <w:t>documento nº [num</w:t>
-      </w:r>
+        <w:t xml:space="preserve">documento </w:t>
+      </w:r>
+      <w:proofErr w:type="spellStart"/>
+      <w:r>
+        <w:rPr>
+          <w:b/>
+          <w:bCs/>
+          <w:color w:val="000000" w:themeColor="text1"/>
+          <w:sz w:val="24"/>
+          <w:szCs w:val="24"/>
+          <w:lang w:val="es-ES"/>
+        </w:rPr>
+        <w:t>nº</w:t>
+      </w:r>
+      <w:proofErr w:type="spellEnd"/>
+      <w:r>
+        <w:rPr>
+          <w:b/>
+          <w:bCs/>
+          <w:color w:val="000000" w:themeColor="text1"/>
+          <w:sz w:val="24"/>
+          <w:szCs w:val="24"/>
+          <w:lang w:val="es-ES"/>
+        </w:rPr>
+        <w:t xml:space="preserve"> [</w:t>
+      </w:r>
+      <w:proofErr w:type="spellStart"/>
+      <w:r>
+        <w:rPr>
+          <w:b/>
+          <w:bCs/>
+          <w:color w:val="000000" w:themeColor="text1"/>
+          <w:sz w:val="24"/>
+          <w:szCs w:val="24"/>
+          <w:lang w:val="es-ES"/>
+        </w:rPr>
+        <w:t>num</w:t>
+      </w:r>
+      <w:proofErr w:type="spellEnd"/>
       <w:r>
         <w:rPr>
           <w:b/>
@@ -1318,17 +2036,7 @@
           <w:szCs w:val="24"/>
           <w:lang w:val="es-ES"/>
         </w:rPr>
-        <w:t xml:space="preserve">Fotografías que muestran el daño material </w:t>
-      </w:r>
-      <w:r>
-        <w:rPr>
-          <w:color w:val="000000" w:themeColor="text1"/>
-          <w:sz w:val="24"/>
-          <w:szCs w:val="24"/>
-          <w:lang w:val="es-ES"/>
-        </w:rPr>
-        <w:lastRenderedPageBreak/>
-        <w:t>irrogado en los</w:t>
+        <w:t>Fotografías que muestran el daño material irrogado en los</w:t>
       </w:r>
       <w:r>
         <w:rPr>
@@ -1414,8 +2122,45 @@
           <w:szCs w:val="24"/>
           <w:lang w:val="es-ES"/>
         </w:rPr>
-        <w:t>documento nº [num</w:t>
-      </w:r>
+        <w:t xml:space="preserve">documento </w:t>
+      </w:r>
+      <w:proofErr w:type="spellStart"/>
+      <w:r>
+        <w:rPr>
+          <w:b/>
+          <w:bCs/>
+          <w:color w:val="000000" w:themeColor="text1"/>
+          <w:sz w:val="24"/>
+          <w:szCs w:val="24"/>
+          <w:lang w:val="es-ES"/>
+        </w:rPr>
+        <w:t>nº</w:t>
+      </w:r>
+      <w:proofErr w:type="spellEnd"/>
+      <w:r>
+        <w:rPr>
+          <w:b/>
+          <w:bCs/>
+          <w:color w:val="000000" w:themeColor="text1"/>
+          <w:sz w:val="24"/>
+          <w:szCs w:val="24"/>
+          <w:lang w:val="es-ES"/>
+        </w:rPr>
+        <w:t xml:space="preserve"> [</w:t>
+      </w:r>
+      <w:proofErr w:type="spellStart"/>
+      <w:r>
+        <w:rPr>
+          <w:b/>
+          <w:bCs/>
+          <w:color w:val="000000" w:themeColor="text1"/>
+          <w:sz w:val="24"/>
+          <w:szCs w:val="24"/>
+          <w:lang w:val="es-ES"/>
+        </w:rPr>
+        <w:t>num</w:t>
+      </w:r>
+      <w:proofErr w:type="spellEnd"/>
       <w:r>
         <w:rPr>
           <w:b/>
@@ -1561,8 +2306,42 @@
           <w:sz w:val="24"/>
           <w:szCs w:val="24"/>
         </w:rPr>
-        <w:t>documento nº [num</w:t>
-      </w:r>
+        <w:t xml:space="preserve">documento </w:t>
+      </w:r>
+      <w:proofErr w:type="spellStart"/>
+      <w:r>
+        <w:rPr>
+          <w:b/>
+          <w:bCs/>
+          <w:color w:val="000000" w:themeColor="text1"/>
+          <w:sz w:val="24"/>
+          <w:szCs w:val="24"/>
+        </w:rPr>
+        <w:t>nº</w:t>
+      </w:r>
+      <w:proofErr w:type="spellEnd"/>
+      <w:r>
+        <w:rPr>
+          <w:b/>
+          <w:bCs/>
+          <w:color w:val="000000" w:themeColor="text1"/>
+          <w:sz w:val="24"/>
+          <w:szCs w:val="24"/>
+        </w:rPr>
+        <w:t xml:space="preserve"> [</w:t>
+      </w:r>
+      <w:proofErr w:type="spellStart"/>
+      <w:r>
+        <w:rPr>
+          <w:b/>
+          <w:bCs/>
+          <w:color w:val="000000" w:themeColor="text1"/>
+          <w:sz w:val="24"/>
+          <w:szCs w:val="24"/>
+        </w:rPr>
+        <w:t>num</w:t>
+      </w:r>
+      <w:proofErr w:type="spellEnd"/>
       <w:r>
         <w:rPr>
           <w:b/>
@@ -1689,8 +2468,42 @@
           <w:sz w:val="24"/>
           <w:szCs w:val="24"/>
         </w:rPr>
-        <w:t>documento nº [num</w:t>
-      </w:r>
+        <w:t xml:space="preserve">documento </w:t>
+      </w:r>
+      <w:proofErr w:type="spellStart"/>
+      <w:r>
+        <w:rPr>
+          <w:b/>
+          <w:bCs/>
+          <w:color w:val="000000" w:themeColor="text1"/>
+          <w:sz w:val="24"/>
+          <w:szCs w:val="24"/>
+        </w:rPr>
+        <w:t>nº</w:t>
+      </w:r>
+      <w:proofErr w:type="spellEnd"/>
+      <w:r>
+        <w:rPr>
+          <w:b/>
+          <w:bCs/>
+          <w:color w:val="000000" w:themeColor="text1"/>
+          <w:sz w:val="24"/>
+          <w:szCs w:val="24"/>
+        </w:rPr>
+        <w:t xml:space="preserve"> [</w:t>
+      </w:r>
+      <w:proofErr w:type="spellStart"/>
+      <w:r>
+        <w:rPr>
+          <w:b/>
+          <w:bCs/>
+          <w:color w:val="000000" w:themeColor="text1"/>
+          <w:sz w:val="24"/>
+          <w:szCs w:val="24"/>
+        </w:rPr>
+        <w:t>num</w:t>
+      </w:r>
+      <w:proofErr w:type="spellEnd"/>
       <w:r>
         <w:rPr>
           <w:b/>
@@ -1846,7 +2659,29 @@
           <w:szCs w:val="24"/>
           <w:lang w:val="es-ES"/>
         </w:rPr>
-        <w:t xml:space="preserve">Se acompaña {{Relación documentos secundaria [checkbox:autowrap] </w:t>
+        <w:t>Se acompaña {{Relación documentos secundaria [</w:t>
+      </w:r>
+      <w:proofErr w:type="spellStart"/>
+      <w:proofErr w:type="gramStart"/>
+      <w:r>
+        <w:rPr>
+          <w:color w:val="000000" w:themeColor="text1"/>
+          <w:sz w:val="24"/>
+          <w:szCs w:val="24"/>
+          <w:lang w:val="es-ES"/>
+        </w:rPr>
+        <w:t>checkbox:autowrap</w:t>
+      </w:r>
+      <w:proofErr w:type="spellEnd"/>
+      <w:proofErr w:type="gramEnd"/>
+      <w:r>
+        <w:rPr>
+          <w:color w:val="000000" w:themeColor="text1"/>
+          <w:sz w:val="24"/>
+          <w:szCs w:val="24"/>
+          <w:lang w:val="es-ES"/>
+        </w:rPr>
+        <w:t xml:space="preserve">] </w:t>
       </w:r>
     </w:p>
     <w:p>
@@ -1885,8 +2720,45 @@
           <w:szCs w:val="24"/>
           <w:lang w:val="es-ES"/>
         </w:rPr>
-        <w:t>como bloque de documentos nº [num</w:t>
-      </w:r>
+        <w:t xml:space="preserve">como bloque de documentos </w:t>
+      </w:r>
+      <w:proofErr w:type="spellStart"/>
+      <w:r>
+        <w:rPr>
+          <w:b/>
+          <w:bCs/>
+          <w:color w:val="000000" w:themeColor="text1"/>
+          <w:sz w:val="24"/>
+          <w:szCs w:val="24"/>
+          <w:lang w:val="es-ES"/>
+        </w:rPr>
+        <w:t>nº</w:t>
+      </w:r>
+      <w:proofErr w:type="spellEnd"/>
+      <w:r>
+        <w:rPr>
+          <w:b/>
+          <w:bCs/>
+          <w:color w:val="000000" w:themeColor="text1"/>
+          <w:sz w:val="24"/>
+          <w:szCs w:val="24"/>
+          <w:lang w:val="es-ES"/>
+        </w:rPr>
+        <w:t xml:space="preserve"> [</w:t>
+      </w:r>
+      <w:proofErr w:type="spellStart"/>
+      <w:r>
+        <w:rPr>
+          <w:b/>
+          <w:bCs/>
+          <w:color w:val="000000" w:themeColor="text1"/>
+          <w:sz w:val="24"/>
+          <w:szCs w:val="24"/>
+          <w:lang w:val="es-ES"/>
+        </w:rPr>
+        <w:t>num</w:t>
+      </w:r>
+      <w:proofErr w:type="spellEnd"/>
       <w:r>
         <w:rPr>
           <w:b/>
@@ -1982,8 +2854,45 @@
           <w:szCs w:val="24"/>
           <w:lang w:val="es-ES"/>
         </w:rPr>
-        <w:t>bloque de documentos nº [num</w:t>
-      </w:r>
+        <w:t xml:space="preserve">bloque de documentos </w:t>
+      </w:r>
+      <w:proofErr w:type="spellStart"/>
+      <w:r>
+        <w:rPr>
+          <w:b/>
+          <w:bCs/>
+          <w:color w:val="000000" w:themeColor="text1"/>
+          <w:sz w:val="24"/>
+          <w:szCs w:val="24"/>
+          <w:lang w:val="es-ES"/>
+        </w:rPr>
+        <w:t>nº</w:t>
+      </w:r>
+      <w:proofErr w:type="spellEnd"/>
+      <w:r>
+        <w:rPr>
+          <w:b/>
+          <w:bCs/>
+          <w:color w:val="000000" w:themeColor="text1"/>
+          <w:sz w:val="24"/>
+          <w:szCs w:val="24"/>
+          <w:lang w:val="es-ES"/>
+        </w:rPr>
+        <w:t xml:space="preserve"> [</w:t>
+      </w:r>
+      <w:proofErr w:type="spellStart"/>
+      <w:r>
+        <w:rPr>
+          <w:b/>
+          <w:bCs/>
+          <w:color w:val="000000" w:themeColor="text1"/>
+          <w:sz w:val="24"/>
+          <w:szCs w:val="24"/>
+          <w:lang w:val="es-ES"/>
+        </w:rPr>
+        <w:t>num</w:t>
+      </w:r>
+      <w:proofErr w:type="spellEnd"/>
       <w:r>
         <w:rPr>
           <w:b/>
@@ -2276,7 +3185,29 @@
           <w:highlight w:val="green"/>
           <w:lang w:val="es-ES"/>
         </w:rPr>
-        <w:t>Respecto al tratamiento rehabilitador, éste se inicia y finaliza en centro médico Icot,</w:t>
+        <w:t xml:space="preserve">Respecto al tratamiento rehabilitador, éste se inicia y finaliza en centro médico </w:t>
+      </w:r>
+      <w:proofErr w:type="spellStart"/>
+      <w:r>
+        <w:rPr>
+          <w:color w:val="000000" w:themeColor="text1"/>
+          <w:sz w:val="24"/>
+          <w:szCs w:val="24"/>
+          <w:highlight w:val="green"/>
+          <w:lang w:val="es-ES"/>
+        </w:rPr>
+        <w:t>Icot</w:t>
+      </w:r>
+      <w:proofErr w:type="spellEnd"/>
+      <w:r>
+        <w:rPr>
+          <w:color w:val="000000" w:themeColor="text1"/>
+          <w:sz w:val="24"/>
+          <w:szCs w:val="24"/>
+          <w:highlight w:val="green"/>
+          <w:lang w:val="es-ES"/>
+        </w:rPr>
+        <w:t>,</w:t>
       </w:r>
     </w:p>
     <w:p>
@@ -2310,7 +3241,30 @@
           <w:highlight w:val="green"/>
           <w:lang w:val="es-ES"/>
         </w:rPr>
-        <w:t>Y luego se fue pa su casa</w:t>
+        <w:lastRenderedPageBreak/>
+        <w:t xml:space="preserve">Y luego se fue </w:t>
+      </w:r>
+      <w:proofErr w:type="spellStart"/>
+      <w:r>
+        <w:rPr>
+          <w:color w:val="000000" w:themeColor="text1"/>
+          <w:sz w:val="24"/>
+          <w:szCs w:val="24"/>
+          <w:highlight w:val="green"/>
+          <w:lang w:val="es-ES"/>
+        </w:rPr>
+        <w:t>pa</w:t>
+      </w:r>
+      <w:proofErr w:type="spellEnd"/>
+      <w:r>
+        <w:rPr>
+          <w:color w:val="000000" w:themeColor="text1"/>
+          <w:sz w:val="24"/>
+          <w:szCs w:val="24"/>
+          <w:highlight w:val="green"/>
+          <w:lang w:val="es-ES"/>
+        </w:rPr>
+        <w:t xml:space="preserve"> su casa</w:t>
       </w:r>
       <w:r>
         <w:rPr>
@@ -2469,6 +3423,7 @@
           <w:lang w:val="es-ES"/>
         </w:rPr>
       </w:pPr>
+      <w:proofErr w:type="gramStart"/>
       <w:r>
         <w:rPr>
           <w:b/>
@@ -2487,7 +3442,17 @@
           <w:szCs w:val="24"/>
           <w:lang w:val="es-ES"/>
         </w:rPr>
-        <w:t xml:space="preserve">.- Por ello, se reclama en este procedimiento, a favor de </w:t>
+        <w:t>.-</w:t>
+      </w:r>
+      <w:proofErr w:type="gramEnd"/>
+      <w:r>
+        <w:rPr>
+          <w:color w:val="000000" w:themeColor="text1"/>
+          <w:sz w:val="24"/>
+          <w:szCs w:val="24"/>
+          <w:lang w:val="es-ES"/>
+        </w:rPr>
+        <w:t xml:space="preserve"> Por ello, se reclama en este procedimiento, a favor de </w:t>
       </w:r>
       <w:r>
         <w:rPr>
@@ -2580,13 +3545,23 @@
         </w:rPr>
         <w:t xml:space="preserve"> [</w:t>
       </w:r>
-      <w:r>
-        <w:rPr>
-          <w:color w:val="000000" w:themeColor="text1"/>
-          <w:sz w:val="24"/>
-          <w:szCs w:val="24"/>
-        </w:rPr>
-        <w:t>int]}</w:t>
+      <w:proofErr w:type="spellStart"/>
+      <w:r>
+        <w:rPr>
+          <w:color w:val="000000" w:themeColor="text1"/>
+          <w:sz w:val="24"/>
+          <w:szCs w:val="24"/>
+        </w:rPr>
+        <w:t>int</w:t>
+      </w:r>
+      <w:proofErr w:type="spellEnd"/>
+      <w:r>
+        <w:rPr>
+          <w:color w:val="000000" w:themeColor="text1"/>
+          <w:sz w:val="24"/>
+          <w:szCs w:val="24"/>
+        </w:rPr>
+        <w:t>]}</w:t>
       </w:r>
       <w:r>
         <w:rPr>
@@ -2671,6 +3646,7 @@
         </w:rPr>
         <w:t xml:space="preserve"> </w:t>
       </w:r>
+      <w:proofErr w:type="gramStart"/>
       <w:r>
         <w:rPr>
           <w:color w:val="00B0F0"/>
@@ -2687,7 +3663,17 @@
           <w:szCs w:val="24"/>
           <w:lang w:val="es-ES"/>
         </w:rPr>
-        <w:t xml:space="preserve">), el importe de </w:t>
+        <w:t>)</w:t>
+      </w:r>
+      <w:proofErr w:type="gramEnd"/>
+      <w:r>
+        <w:rPr>
+          <w:color w:val="000000" w:themeColor="text1"/>
+          <w:sz w:val="24"/>
+          <w:szCs w:val="24"/>
+          <w:lang w:val="es-ES"/>
+        </w:rPr>
+        <w:t xml:space="preserve">, el importe de </w:t>
       </w:r>
       <w:r>
         <w:rPr>
@@ -2790,7 +3776,27 @@
           <w:szCs w:val="24"/>
           <w:lang w:val="es-ES"/>
         </w:rPr>
-        <w:t>{{CALC: Días de perjuicio totales - Días de perjuicio moderado [int]}}</w:t>
+        <w:t>{{CALC: Días de perjuicio totales - Días de perjuicio moderado [</w:t>
+      </w:r>
+      <w:proofErr w:type="spellStart"/>
+      <w:r>
+        <w:rPr>
+          <w:color w:val="000000" w:themeColor="text1"/>
+          <w:sz w:val="24"/>
+          <w:szCs w:val="24"/>
+          <w:lang w:val="es-ES"/>
+        </w:rPr>
+        <w:t>int</w:t>
+      </w:r>
+      <w:proofErr w:type="spellEnd"/>
+      <w:r>
+        <w:rPr>
+          <w:color w:val="000000" w:themeColor="text1"/>
+          <w:sz w:val="24"/>
+          <w:szCs w:val="24"/>
+          <w:lang w:val="es-ES"/>
+        </w:rPr>
+        <w:t>]}}</w:t>
       </w:r>
       <w:r>
         <w:rPr>
@@ -2904,7 +3910,16 @@
           <w:sz w:val="24"/>
           <w:szCs w:val="24"/>
         </w:rPr>
-        <w:t xml:space="preserve"> * Importe por día de perjuicio básico}}</w:t>
+        <w:t xml:space="preserve"> * Importe por día de perjuicio básico</w:t>
+      </w:r>
+      <w:proofErr w:type="gramStart"/>
+      <w:r>
+        <w:rPr>
+          <w:color w:val="000000" w:themeColor="text1"/>
+          <w:sz w:val="24"/>
+          <w:szCs w:val="24"/>
+        </w:rPr>
+        <w:t>}}</w:t>
       </w:r>
       <w:r>
         <w:rPr>
@@ -2925,7 +3940,17 @@
           <w:szCs w:val="24"/>
           <w:lang w:val="es-ES"/>
         </w:rPr>
-        <w:t xml:space="preserve"> euros.</w:t>
+        <w:t xml:space="preserve"> euros</w:t>
+      </w:r>
+      <w:proofErr w:type="gramEnd"/>
+      <w:r>
+        <w:rPr>
+          <w:color w:val="000000" w:themeColor="text1"/>
+          <w:sz w:val="24"/>
+          <w:szCs w:val="24"/>
+          <w:lang w:val="es-ES"/>
+        </w:rPr>
+        <w:t>.</w:t>
       </w:r>
     </w:p>
     <w:p>
@@ -2966,6 +3991,7 @@
           <w:lang w:val="es-ES"/>
         </w:rPr>
       </w:pPr>
+      <w:proofErr w:type="gramStart"/>
       <w:r>
         <w:rPr>
           <w:color w:val="000000" w:themeColor="text1"/>
@@ -2975,6 +4001,7 @@
         </w:rPr>
         <w:t>Todas las cantidades señaladas asciende</w:t>
       </w:r>
+      <w:proofErr w:type="gramEnd"/>
       <w:r>
         <w:rPr>
           <w:color w:val="000000" w:themeColor="text1"/>
@@ -3203,7 +4230,17 @@
           <w:szCs w:val="24"/>
           <w:lang w:val="es-ES"/>
         </w:rPr>
-        <w:t>quedado acreditado mediante documento n</w:t>
+        <w:t xml:space="preserve">quedado acreditado mediante documento </w:t>
+      </w:r>
+      <w:proofErr w:type="spellStart"/>
+      <w:r>
+        <w:rPr>
+          <w:color w:val="000000" w:themeColor="text1"/>
+          <w:sz w:val="24"/>
+          <w:szCs w:val="24"/>
+          <w:lang w:val="es-ES"/>
+        </w:rPr>
+        <w:t>n</w:t>
       </w:r>
       <w:r>
         <w:rPr>
@@ -3214,6 +4251,7 @@
         </w:rPr>
         <w:t>º</w:t>
       </w:r>
+      <w:proofErr w:type="spellEnd"/>
       <w:r>
         <w:rPr>
           <w:color w:val="000000" w:themeColor="text1"/>
@@ -3288,8 +4326,9 @@
           <w:highlight w:val="yellow"/>
           <w:lang w:val="es-ES"/>
         </w:rPr>
-        <w:t>documento n</w:t>
-      </w:r>
+        <w:t xml:space="preserve">documento </w:t>
+      </w:r>
+      <w:proofErr w:type="spellStart"/>
       <w:r>
         <w:rPr>
           <w:b/>
@@ -3300,8 +4339,21 @@
           <w:highlight w:val="yellow"/>
           <w:lang w:val="es-ES"/>
         </w:rPr>
+        <w:t>n</w:t>
+      </w:r>
+      <w:r>
+        <w:rPr>
+          <w:b/>
+          <w:bCs/>
+          <w:color w:val="000000" w:themeColor="text1"/>
+          <w:sz w:val="24"/>
+          <w:szCs w:val="24"/>
+          <w:highlight w:val="yellow"/>
+          <w:lang w:val="es-ES"/>
+        </w:rPr>
         <w:t>º</w:t>
       </w:r>
+      <w:proofErr w:type="spellEnd"/>
       <w:r>
         <w:rPr>
           <w:b/>
@@ -3324,8 +4376,9 @@
           <w:highlight w:val="yellow"/>
           <w:lang w:val="es-ES"/>
         </w:rPr>
-        <w:t>{{[num</w:t>
-      </w:r>
+        <w:t>{{[</w:t>
+      </w:r>
+      <w:proofErr w:type="spellStart"/>
       <w:r>
         <w:rPr>
           <w:b/>
@@ -3336,6 +4389,19 @@
           <w:highlight w:val="yellow"/>
           <w:lang w:val="es-ES"/>
         </w:rPr>
+        <w:t>num</w:t>
+      </w:r>
+      <w:proofErr w:type="spellEnd"/>
+      <w:r>
+        <w:rPr>
+          <w:b/>
+          <w:bCs/>
+          <w:color w:val="000000" w:themeColor="text1"/>
+          <w:sz w:val="24"/>
+          <w:szCs w:val="24"/>
+          <w:highlight w:val="yellow"/>
+          <w:lang w:val="es-ES"/>
+        </w:rPr>
         <w:t xml:space="preserve"> </w:t>
       </w:r>
       <w:r>
@@ -3380,8 +4446,9 @@
           <w:highlight w:val="yellow"/>
           <w:lang w:val="es-ES"/>
         </w:rPr>
-        <w:t>documento n</w:t>
-      </w:r>
+        <w:t xml:space="preserve">documento </w:t>
+      </w:r>
+      <w:proofErr w:type="spellStart"/>
       <w:r>
         <w:rPr>
           <w:b/>
@@ -3392,8 +4459,21 @@
           <w:highlight w:val="yellow"/>
           <w:lang w:val="es-ES"/>
         </w:rPr>
+        <w:t>n</w:t>
+      </w:r>
+      <w:r>
+        <w:rPr>
+          <w:b/>
+          <w:bCs/>
+          <w:color w:val="000000" w:themeColor="text1"/>
+          <w:sz w:val="24"/>
+          <w:szCs w:val="24"/>
+          <w:highlight w:val="yellow"/>
+          <w:lang w:val="es-ES"/>
+        </w:rPr>
         <w:t>º</w:t>
       </w:r>
+      <w:proofErr w:type="spellEnd"/>
       <w:r>
         <w:rPr>
           <w:b/>
@@ -3416,8 +4496,9 @@
           <w:highlight w:val="yellow"/>
           <w:lang w:val="es-ES"/>
         </w:rPr>
-        <w:t>{{[num</w:t>
-      </w:r>
+        <w:t>{{[</w:t>
+      </w:r>
+      <w:proofErr w:type="spellStart"/>
       <w:r>
         <w:rPr>
           <w:b/>
@@ -3428,6 +4509,19 @@
           <w:highlight w:val="yellow"/>
           <w:lang w:val="es-ES"/>
         </w:rPr>
+        <w:t>num</w:t>
+      </w:r>
+      <w:proofErr w:type="spellEnd"/>
+      <w:r>
+        <w:rPr>
+          <w:b/>
+          <w:bCs/>
+          <w:color w:val="000000" w:themeColor="text1"/>
+          <w:sz w:val="24"/>
+          <w:szCs w:val="24"/>
+          <w:highlight w:val="yellow"/>
+          <w:lang w:val="es-ES"/>
+        </w:rPr>
         <w:t xml:space="preserve"> </w:t>
       </w:r>
       <w:r>
@@ -3474,8 +4568,9 @@
           <w:highlight w:val="yellow"/>
           <w:lang w:val="es-ES"/>
         </w:rPr>
-        <w:t>{{[num</w:t>
-      </w:r>
+        <w:t>{{[</w:t>
+      </w:r>
+      <w:proofErr w:type="spellStart"/>
       <w:r>
         <w:rPr>
           <w:b/>
@@ -3486,6 +4581,19 @@
           <w:highlight w:val="yellow"/>
           <w:lang w:val="es-ES"/>
         </w:rPr>
+        <w:t>num</w:t>
+      </w:r>
+      <w:proofErr w:type="spellEnd"/>
+      <w:r>
+        <w:rPr>
+          <w:b/>
+          <w:bCs/>
+          <w:color w:val="000000" w:themeColor="text1"/>
+          <w:sz w:val="24"/>
+          <w:szCs w:val="24"/>
+          <w:highlight w:val="yellow"/>
+          <w:lang w:val="es-ES"/>
+        </w:rPr>
         <w:t xml:space="preserve"> </w:t>
       </w:r>
       <w:r>
@@ -3496,96 +4604,720 @@
           <w:highlight w:val="yellow"/>
           <w:lang w:val="es-ES"/>
         </w:rPr>
-        <w:t xml:space="preserve">{Informe </w:t>
-      </w:r>
-      <w:r>
-        <w:rPr>
+        <w:t>{Informe biomecánico.}</w:t>
+      </w:r>
+      <w:r>
+        <w:rPr>
+          <w:b/>
+          <w:bCs/>
           <w:color w:val="000000" w:themeColor="text1"/>
           <w:sz w:val="24"/>
           <w:szCs w:val="24"/>
           <w:highlight w:val="yellow"/>
           <w:lang w:val="es-ES"/>
         </w:rPr>
+        <w:t>]}}</w:t>
+      </w:r>
+      <w:r>
+        <w:rPr>
+          <w:color w:val="000000" w:themeColor="text1"/>
+          <w:sz w:val="24"/>
+          <w:szCs w:val="24"/>
+          <w:highlight w:val="yellow"/>
+          <w:lang w:val="es-ES"/>
+        </w:rPr>
+        <w:t>, respectivamente.</w:t>
+      </w:r>
+    </w:p>
+    <w:p>
+      <w:pPr>
+        <w:pBdr>
+          <w:top w:val="nil"/>
+          <w:left w:val="nil"/>
+          <w:bottom w:val="nil"/>
+          <w:right w:val="nil"/>
+          <w:between w:val="nil"/>
+        </w:pBdr>
+        <w:ind w:left="2" w:right="136" w:firstLine="707"/>
+        <w:jc w:val="both"/>
+        <w:rPr>
+          <w:color w:val="000000" w:themeColor="text1"/>
+          <w:sz w:val="24"/>
+          <w:szCs w:val="24"/>
+          <w:lang w:val="es-ES"/>
+        </w:rPr>
+      </w:pPr>
+    </w:p>
+    <w:p>
+      <w:pPr>
+        <w:pBdr>
+          <w:top w:val="nil"/>
+          <w:left w:val="nil"/>
+          <w:bottom w:val="nil"/>
+          <w:right w:val="nil"/>
+          <w:between w:val="nil"/>
+        </w:pBdr>
+        <w:ind w:left="2" w:right="136" w:firstLine="707"/>
+        <w:jc w:val="both"/>
+        <w:rPr>
+          <w:color w:val="000000" w:themeColor="text1"/>
+          <w:sz w:val="24"/>
+          <w:szCs w:val="24"/>
+          <w:lang w:val="es-ES"/>
+        </w:rPr>
+      </w:pPr>
+      <w:r>
+        <w:rPr>
+          <w:color w:val="000000" w:themeColor="text1"/>
+          <w:sz w:val="24"/>
+          <w:szCs w:val="24"/>
+          <w:lang w:val="es-ES"/>
+        </w:rPr>
+        <w:t>{{</w:t>
+      </w:r>
+      <w:r>
+        <w:rPr>
+          <w:color w:val="000000" w:themeColor="text1"/>
+          <w:sz w:val="24"/>
+          <w:szCs w:val="24"/>
+          <w:lang w:val="es-ES"/>
+        </w:rPr>
+        <w:t>Oferta previa</w:t>
+      </w:r>
+      <w:r>
+        <w:rPr>
+          <w:color w:val="000000" w:themeColor="text1"/>
+          <w:sz w:val="24"/>
+          <w:szCs w:val="24"/>
+          <w:lang w:val="es-ES"/>
+        </w:rPr>
+        <w:t xml:space="preserve"> </w:t>
+      </w:r>
+      <w:r>
+        <w:rPr>
+          <w:color w:val="000000" w:themeColor="text1"/>
+          <w:sz w:val="24"/>
+          <w:szCs w:val="24"/>
+          <w:lang w:val="es-ES"/>
+        </w:rPr>
+        <w:t>[</w:t>
+      </w:r>
+      <w:proofErr w:type="spellStart"/>
+      <w:r>
+        <w:rPr>
+          <w:color w:val="000000" w:themeColor="text1"/>
+          <w:sz w:val="24"/>
+          <w:szCs w:val="24"/>
+          <w:lang w:val="es-ES"/>
+        </w:rPr>
+        <w:t>checkbox</w:t>
+      </w:r>
+      <w:proofErr w:type="spellEnd"/>
+      <w:r>
+        <w:rPr>
+          <w:color w:val="000000" w:themeColor="text1"/>
+          <w:sz w:val="24"/>
+          <w:szCs w:val="24"/>
+          <w:lang w:val="es-ES"/>
+        </w:rPr>
+        <w:t>]</w:t>
+      </w:r>
+      <w:r>
+        <w:rPr>
+          <w:color w:val="000000" w:themeColor="text1"/>
+          <w:sz w:val="24"/>
+          <w:szCs w:val="24"/>
+          <w:lang w:val="es-ES"/>
+        </w:rPr>
+        <w:t xml:space="preserve"> </w:t>
+      </w:r>
+      <w:r>
+        <w:rPr>
+          <w:color w:val="000000" w:themeColor="text1"/>
+          <w:sz w:val="24"/>
+          <w:szCs w:val="24"/>
+          <w:lang w:val="es-ES"/>
+        </w:rPr>
+        <w:t>{</w:t>
+      </w:r>
+      <w:r>
+        <w:rPr>
+          <w:color w:val="000000" w:themeColor="text1"/>
+          <w:sz w:val="24"/>
+          <w:szCs w:val="24"/>
+          <w:lang w:val="es-ES"/>
+        </w:rPr>
+        <w:t>Habiendo intentado conseguir un acuerdo con la compañía aseguradora, ha</w:t>
+      </w:r>
+      <w:r>
+        <w:rPr>
+          <w:color w:val="000000" w:themeColor="text1"/>
+          <w:sz w:val="24"/>
+          <w:szCs w:val="24"/>
+          <w:lang w:val="es-ES"/>
+        </w:rPr>
+        <w:t xml:space="preserve"> </w:t>
+      </w:r>
+      <w:r>
+        <w:rPr>
+          <w:color w:val="000000" w:themeColor="text1"/>
+          <w:sz w:val="24"/>
+          <w:szCs w:val="24"/>
+          <w:lang w:val="es-ES"/>
+        </w:rPr>
+        <w:t>resultado infructuoso, razón por la que, habiendo interrumpido esta parte la</w:t>
+      </w:r>
+      <w:r>
+        <w:rPr>
+          <w:color w:val="000000" w:themeColor="text1"/>
+          <w:sz w:val="24"/>
+          <w:szCs w:val="24"/>
+          <w:lang w:val="es-ES"/>
+        </w:rPr>
+        <w:t xml:space="preserve"> </w:t>
+      </w:r>
+      <w:r>
+        <w:rPr>
+          <w:color w:val="000000" w:themeColor="text1"/>
+          <w:sz w:val="24"/>
+          <w:szCs w:val="24"/>
+          <w:lang w:val="es-ES"/>
+        </w:rPr>
+        <w:t xml:space="preserve">prescripción de la acción que ahora se ejercita (según acredito mediante </w:t>
+      </w:r>
+      <w:r>
+        <w:rPr>
+          <w:b/>
+          <w:bCs/>
+          <w:color w:val="000000" w:themeColor="text1"/>
+          <w:sz w:val="24"/>
+          <w:szCs w:val="24"/>
+          <w:lang w:val="es-ES"/>
+        </w:rPr>
+        <w:t xml:space="preserve">documento </w:t>
+      </w:r>
+      <w:proofErr w:type="spellStart"/>
+      <w:r>
+        <w:rPr>
+          <w:b/>
+          <w:bCs/>
+          <w:color w:val="000000" w:themeColor="text1"/>
+          <w:sz w:val="24"/>
+          <w:szCs w:val="24"/>
+          <w:lang w:val="es-ES"/>
+        </w:rPr>
+        <w:t>nº</w:t>
+      </w:r>
+      <w:proofErr w:type="spellEnd"/>
+      <w:r>
+        <w:rPr>
+          <w:b/>
+          <w:bCs/>
+          <w:color w:val="000000" w:themeColor="text1"/>
+          <w:sz w:val="24"/>
+          <w:szCs w:val="24"/>
+          <w:lang w:val="es-ES"/>
+        </w:rPr>
+        <w:t xml:space="preserve"> </w:t>
+      </w:r>
+      <w:r>
+        <w:rPr>
+          <w:b/>
+          <w:bCs/>
+          <w:color w:val="000000" w:themeColor="text1"/>
+          <w:sz w:val="24"/>
+          <w:szCs w:val="24"/>
+          <w:lang w:val="es-ES"/>
+        </w:rPr>
+        <w:t>[</w:t>
+      </w:r>
+      <w:proofErr w:type="spellStart"/>
+      <w:r>
+        <w:rPr>
+          <w:b/>
+          <w:bCs/>
+          <w:color w:val="000000" w:themeColor="text1"/>
+          <w:sz w:val="24"/>
+          <w:szCs w:val="24"/>
+          <w:lang w:val="es-ES"/>
+        </w:rPr>
+        <w:t>num</w:t>
+      </w:r>
+      <w:proofErr w:type="spellEnd"/>
+      <w:r>
+        <w:rPr>
+          <w:b/>
+          <w:bCs/>
+          <w:color w:val="000000" w:themeColor="text1"/>
+          <w:sz w:val="24"/>
+          <w:szCs w:val="24"/>
+          <w:lang w:val="es-ES"/>
+        </w:rPr>
+        <w:t xml:space="preserve"> </w:t>
+      </w:r>
+      <w:r>
+        <w:rPr>
+          <w:color w:val="000000" w:themeColor="text1"/>
+          <w:sz w:val="24"/>
+          <w:szCs w:val="24"/>
+          <w:lang w:val="es-ES"/>
+        </w:rPr>
+        <w:t>{Burofax de interrupción de prescripción.}</w:t>
+      </w:r>
+      <w:r>
+        <w:rPr>
+          <w:b/>
+          <w:bCs/>
+          <w:color w:val="000000" w:themeColor="text1"/>
+          <w:sz w:val="24"/>
+          <w:szCs w:val="24"/>
+          <w:lang w:val="es-ES"/>
+        </w:rPr>
+        <w:t>]</w:t>
+      </w:r>
+      <w:r>
+        <w:rPr>
+          <w:b/>
+          <w:bCs/>
+          <w:color w:val="000000" w:themeColor="text1"/>
+          <w:sz w:val="24"/>
+          <w:szCs w:val="24"/>
+          <w:lang w:val="es-ES"/>
+        </w:rPr>
+        <w:t xml:space="preserve">) </w:t>
+      </w:r>
+      <w:r>
+        <w:rPr>
+          <w:color w:val="000000" w:themeColor="text1"/>
+          <w:sz w:val="24"/>
+          <w:szCs w:val="24"/>
+          <w:lang w:val="es-ES"/>
+        </w:rPr>
+        <w:t>se interpone la presente demanda.</w:t>
+      </w:r>
+      <w:r>
+        <w:rPr>
+          <w:color w:val="000000" w:themeColor="text1"/>
+          <w:sz w:val="24"/>
+          <w:szCs w:val="24"/>
+          <w:lang w:val="es-ES"/>
+        </w:rPr>
+        <w:t>}}}</w:t>
+      </w:r>
+    </w:p>
+    <w:p>
+      <w:pPr>
+        <w:pBdr>
+          <w:top w:val="nil"/>
+          <w:left w:val="nil"/>
+          <w:bottom w:val="nil"/>
+          <w:right w:val="nil"/>
+          <w:between w:val="nil"/>
+        </w:pBdr>
+        <w:ind w:left="2" w:right="136" w:firstLine="707"/>
+        <w:jc w:val="both"/>
+        <w:rPr>
+          <w:color w:val="000000" w:themeColor="text1"/>
+          <w:sz w:val="24"/>
+          <w:szCs w:val="24"/>
+          <w:lang w:val="es-ES"/>
+        </w:rPr>
+      </w:pPr>
+    </w:p>
+    <w:p>
+      <w:pPr>
+        <w:pBdr>
+          <w:top w:val="nil"/>
+          <w:left w:val="nil"/>
+          <w:bottom w:val="nil"/>
+          <w:right w:val="nil"/>
+          <w:between w:val="nil"/>
+        </w:pBdr>
+        <w:ind w:left="2" w:right="136" w:firstLine="707"/>
+        <w:jc w:val="both"/>
+        <w:rPr>
+          <w:color w:val="000000" w:themeColor="text1"/>
+          <w:sz w:val="24"/>
+          <w:szCs w:val="24"/>
+          <w:lang w:val="es-ES"/>
+        </w:rPr>
+      </w:pPr>
+      <w:r>
+        <w:rPr>
+          <w:color w:val="000000" w:themeColor="text1"/>
+          <w:sz w:val="24"/>
+          <w:szCs w:val="24"/>
+          <w:lang w:val="es-ES"/>
+        </w:rPr>
+        <w:t>{{Con contractura [</w:t>
+      </w:r>
+      <w:proofErr w:type="spellStart"/>
+      <w:r>
+        <w:rPr>
+          <w:color w:val="000000" w:themeColor="text1"/>
+          <w:sz w:val="24"/>
+          <w:szCs w:val="24"/>
+          <w:lang w:val="es-ES"/>
+        </w:rPr>
+        <w:t>checkbox</w:t>
+      </w:r>
+      <w:proofErr w:type="spellEnd"/>
+      <w:r>
+        <w:rPr>
+          <w:color w:val="000000" w:themeColor="text1"/>
+          <w:sz w:val="24"/>
+          <w:szCs w:val="24"/>
+          <w:lang w:val="es-ES"/>
+        </w:rPr>
+        <w:t>] {</w:t>
+      </w:r>
+      <w:r>
+        <w:rPr>
+          <w:color w:val="000000" w:themeColor="text1"/>
+          <w:sz w:val="24"/>
+          <w:szCs w:val="24"/>
+          <w:lang w:val="es-ES"/>
+        </w:rPr>
+        <w:t>Por todo lo expuesto no puede considerarse que exista falta de nexo causal, ya</w:t>
+      </w:r>
+      <w:r>
+        <w:rPr>
+          <w:color w:val="000000" w:themeColor="text1"/>
+          <w:sz w:val="24"/>
+          <w:szCs w:val="24"/>
+          <w:lang w:val="es-ES"/>
+        </w:rPr>
+        <w:t xml:space="preserve"> </w:t>
+      </w:r>
+      <w:r>
+        <w:rPr>
+          <w:color w:val="000000" w:themeColor="text1"/>
+          <w:sz w:val="24"/>
+          <w:szCs w:val="24"/>
+          <w:lang w:val="es-ES"/>
+        </w:rPr>
+        <w:t>que el informe biomecánico es una prueba insuficiente para acreditarlo y,</w:t>
+      </w:r>
+      <w:r>
+        <w:rPr>
+          <w:color w:val="000000" w:themeColor="text1"/>
+          <w:sz w:val="24"/>
+          <w:szCs w:val="24"/>
+          <w:lang w:val="es-ES"/>
+        </w:rPr>
+        <w:t xml:space="preserve"> </w:t>
+      </w:r>
+      <w:r>
+        <w:rPr>
+          <w:color w:val="000000" w:themeColor="text1"/>
+          <w:sz w:val="24"/>
+          <w:szCs w:val="24"/>
+          <w:lang w:val="es-ES"/>
+        </w:rPr>
+        <w:t>consecuentemente, siendo que, además, la demandada se basa en un informe médico</w:t>
+      </w:r>
+      <w:r>
+        <w:rPr>
+          <w:color w:val="000000" w:themeColor="text1"/>
+          <w:sz w:val="24"/>
+          <w:szCs w:val="24"/>
+          <w:lang w:val="es-ES"/>
+        </w:rPr>
+        <w:t xml:space="preserve"> </w:t>
+      </w:r>
+      <w:r>
+        <w:rPr>
+          <w:color w:val="000000" w:themeColor="text1"/>
+          <w:sz w:val="24"/>
+          <w:szCs w:val="24"/>
+          <w:lang w:val="es-ES"/>
+        </w:rPr>
+        <w:t>pericial para negar igualmente nexo causal y éste se fundamenta principalmente en el</w:t>
+      </w:r>
+      <w:r>
+        <w:rPr>
+          <w:color w:val="000000" w:themeColor="text1"/>
+          <w:sz w:val="24"/>
+          <w:szCs w:val="24"/>
+          <w:lang w:val="es-ES"/>
+        </w:rPr>
+        <w:t xml:space="preserve"> </w:t>
+      </w:r>
+      <w:r>
+        <w:rPr>
+          <w:color w:val="000000" w:themeColor="text1"/>
+          <w:sz w:val="24"/>
+          <w:szCs w:val="24"/>
+          <w:lang w:val="es-ES"/>
+        </w:rPr>
+        <w:t>propio informe biomecánico antedicho, tampoco ha de considerarse éste válido.</w:t>
+      </w:r>
+      <w:r>
+        <w:rPr>
+          <w:color w:val="000000" w:themeColor="text1"/>
+          <w:sz w:val="24"/>
+          <w:szCs w:val="24"/>
+          <w:lang w:val="es-ES"/>
+        </w:rPr>
+        <w:t>}}}</w:t>
+      </w:r>
+    </w:p>
+    <w:p>
+      <w:pPr>
+        <w:pBdr>
+          <w:top w:val="nil"/>
+          <w:left w:val="nil"/>
+          <w:bottom w:val="nil"/>
+          <w:right w:val="nil"/>
+          <w:between w:val="nil"/>
+        </w:pBdr>
+        <w:ind w:left="2" w:right="136" w:firstLine="707"/>
+        <w:jc w:val="both"/>
+        <w:rPr>
+          <w:color w:val="000000" w:themeColor="text1"/>
+          <w:sz w:val="24"/>
+          <w:szCs w:val="24"/>
+          <w:lang w:val="es-ES"/>
+        </w:rPr>
+      </w:pPr>
+    </w:p>
+    <w:p>
+      <w:pPr>
+        <w:pBdr>
+          <w:top w:val="nil"/>
+          <w:left w:val="nil"/>
+          <w:bottom w:val="nil"/>
+          <w:right w:val="nil"/>
+          <w:between w:val="nil"/>
+        </w:pBdr>
+        <w:ind w:left="2" w:right="136" w:firstLine="707"/>
+        <w:jc w:val="both"/>
+        <w:rPr>
+          <w:b/>
+          <w:bCs/>
+          <w:color w:val="000000" w:themeColor="text1"/>
+          <w:sz w:val="24"/>
+          <w:szCs w:val="24"/>
+          <w:lang w:val="es-ES"/>
+        </w:rPr>
+      </w:pPr>
+      <w:r>
+        <w:rPr>
+          <w:b/>
+          <w:bCs/>
+          <w:color w:val="000000" w:themeColor="text1"/>
+          <w:sz w:val="24"/>
+          <w:szCs w:val="24"/>
+          <w:lang w:val="es-ES"/>
+        </w:rPr>
+        <w:t>V.- Cuantía</w:t>
+      </w:r>
+    </w:p>
+    <w:p>
+      <w:pPr>
+        <w:pBdr>
+          <w:top w:val="nil"/>
+          <w:left w:val="nil"/>
+          <w:bottom w:val="nil"/>
+          <w:right w:val="nil"/>
+          <w:between w:val="nil"/>
+        </w:pBdr>
+        <w:ind w:left="2" w:right="136" w:firstLine="707"/>
+        <w:jc w:val="both"/>
+        <w:rPr>
+          <w:color w:val="000000" w:themeColor="text1"/>
+          <w:sz w:val="24"/>
+          <w:szCs w:val="24"/>
+          <w:lang w:val="es-ES"/>
+        </w:rPr>
+      </w:pPr>
+      <w:r>
+        <w:rPr>
+          <w:color w:val="000000" w:themeColor="text1"/>
+          <w:sz w:val="24"/>
+          <w:szCs w:val="24"/>
+          <w:lang w:val="es-ES"/>
+        </w:rPr>
+        <w:t>La</w:t>
+      </w:r>
+      <w:r>
+        <w:rPr>
+          <w:b/>
+          <w:bCs/>
+          <w:color w:val="000000" w:themeColor="text1"/>
+          <w:sz w:val="24"/>
+          <w:szCs w:val="24"/>
+          <w:lang w:val="es-ES"/>
+        </w:rPr>
+        <w:t xml:space="preserve"> CUANTÍA </w:t>
+      </w:r>
+      <w:r>
+        <w:rPr>
+          <w:color w:val="000000" w:themeColor="text1"/>
+          <w:sz w:val="24"/>
+          <w:szCs w:val="24"/>
+          <w:lang w:val="es-ES"/>
+        </w:rPr>
+        <w:t xml:space="preserve">del presente procedimiento la ciframos en la cantidad de </w:t>
+      </w:r>
+      <w:r>
+        <w:rPr>
+          <w:b/>
+          <w:bCs/>
+          <w:color w:val="000000" w:themeColor="text1"/>
+          <w:sz w:val="24"/>
+          <w:szCs w:val="24"/>
+        </w:rPr>
+        <w:t xml:space="preserve">{{CALC: Días de perjuicio moderado * Importe por día de perjuicio moderado + </w:t>
+      </w:r>
+      <w:r>
+        <w:rPr>
+          <w:b/>
+          <w:bCs/>
+          <w:color w:val="000000" w:themeColor="text1"/>
+          <w:sz w:val="24"/>
+          <w:szCs w:val="24"/>
+        </w:rPr>
+        <w:t>(</w:t>
+      </w:r>
+      <w:r>
+        <w:rPr>
+          <w:b/>
+          <w:bCs/>
+          <w:color w:val="000000" w:themeColor="text1"/>
+          <w:sz w:val="24"/>
+          <w:szCs w:val="24"/>
+          <w:lang w:val="es-ES"/>
+        </w:rPr>
+        <w:t>Días de perjuicio totales - Días de perjuicio moderado)</w:t>
+      </w:r>
+      <w:r>
+        <w:rPr>
+          <w:b/>
+          <w:bCs/>
+          <w:color w:val="000000" w:themeColor="text1"/>
+          <w:sz w:val="24"/>
+          <w:szCs w:val="24"/>
+        </w:rPr>
+        <w:t xml:space="preserve"> </w:t>
+      </w:r>
+      <w:r>
+        <w:rPr>
+          <w:b/>
+          <w:bCs/>
+          <w:color w:val="000000" w:themeColor="text1"/>
+          <w:sz w:val="24"/>
+          <w:szCs w:val="24"/>
+        </w:rPr>
+        <w:t>* Importe por día de perjuicio básico}}</w:t>
+      </w:r>
+      <w:r>
+        <w:rPr>
+          <w:color w:val="000000" w:themeColor="text1"/>
+          <w:sz w:val="24"/>
+          <w:szCs w:val="24"/>
+          <w:lang w:val="es-ES"/>
+        </w:rPr>
+        <w:t xml:space="preserve"> </w:t>
+      </w:r>
+      <w:r>
+        <w:rPr>
+          <w:b/>
+          <w:bCs/>
+          <w:color w:val="000000" w:themeColor="text1"/>
+          <w:sz w:val="24"/>
+          <w:szCs w:val="24"/>
+          <w:lang w:val="es-ES"/>
+        </w:rPr>
+        <w:t>euros</w:t>
+      </w:r>
+      <w:r>
+        <w:rPr>
+          <w:color w:val="000000" w:themeColor="text1"/>
+          <w:sz w:val="24"/>
+          <w:szCs w:val="24"/>
+          <w:lang w:val="es-ES"/>
+        </w:rPr>
+        <w:t xml:space="preserve"> que reclamamos como </w:t>
+      </w:r>
+      <w:r>
+        <w:rPr>
+          <w:b/>
+          <w:bCs/>
+          <w:color w:val="000000" w:themeColor="text1"/>
+          <w:sz w:val="24"/>
+          <w:szCs w:val="24"/>
+          <w:lang w:val="es-ES"/>
+        </w:rPr>
+        <w:t>PRINCIPAL</w:t>
+      </w:r>
+      <w:r>
+        <w:rPr>
+          <w:color w:val="000000" w:themeColor="text1"/>
+          <w:sz w:val="24"/>
+          <w:szCs w:val="24"/>
+          <w:lang w:val="es-ES"/>
+        </w:rPr>
+        <w:t>.</w:t>
+      </w:r>
+    </w:p>
+    <w:p>
+      <w:pPr>
+        <w:pBdr>
+          <w:top w:val="nil"/>
+          <w:left w:val="nil"/>
+          <w:bottom w:val="nil"/>
+          <w:right w:val="nil"/>
+          <w:between w:val="nil"/>
+        </w:pBdr>
+        <w:ind w:left="2" w:right="136" w:firstLine="707"/>
+        <w:jc w:val="both"/>
+        <w:rPr>
+          <w:color w:val="000000" w:themeColor="text1"/>
+          <w:sz w:val="24"/>
+          <w:szCs w:val="24"/>
+          <w:lang w:val="es-ES"/>
+        </w:rPr>
+      </w:pPr>
+    </w:p>
+    <w:p>
+      <w:pPr>
+        <w:pBdr>
+          <w:top w:val="nil"/>
+          <w:left w:val="nil"/>
+          <w:bottom w:val="nil"/>
+          <w:right w:val="nil"/>
+          <w:between w:val="nil"/>
+        </w:pBdr>
+        <w:ind w:left="2" w:right="136" w:firstLine="707"/>
+        <w:jc w:val="both"/>
+        <w:rPr>
+          <w:color w:val="000000" w:themeColor="text1"/>
+          <w:sz w:val="24"/>
+          <w:szCs w:val="24"/>
+          <w:lang w:val="es-ES"/>
+        </w:rPr>
+      </w:pPr>
+      <w:r>
+        <w:rPr>
+          <w:b/>
+          <w:bCs/>
+          <w:color w:val="000000" w:themeColor="text1"/>
+          <w:sz w:val="24"/>
+          <w:szCs w:val="24"/>
+          <w:lang w:val="es-ES"/>
+        </w:rPr>
         <w:lastRenderedPageBreak/>
-        <w:t>biomecánico.}</w:t>
-      </w:r>
-      <w:r>
-        <w:rPr>
-          <w:b/>
-          <w:bCs/>
-          <w:color w:val="000000" w:themeColor="text1"/>
-          <w:sz w:val="24"/>
-          <w:szCs w:val="24"/>
-          <w:highlight w:val="yellow"/>
-          <w:lang w:val="es-ES"/>
-        </w:rPr>
-        <w:t>]}}</w:t>
-      </w:r>
-      <w:r>
-        <w:rPr>
-          <w:color w:val="000000" w:themeColor="text1"/>
-          <w:sz w:val="24"/>
-          <w:szCs w:val="24"/>
-          <w:highlight w:val="yellow"/>
-          <w:lang w:val="es-ES"/>
-        </w:rPr>
-        <w:t>, respectivamente.</w:t>
-      </w:r>
-    </w:p>
-    <w:p>
-      <w:pPr>
-        <w:pBdr>
-          <w:top w:val="nil"/>
-          <w:left w:val="nil"/>
-          <w:bottom w:val="nil"/>
-          <w:right w:val="nil"/>
-          <w:between w:val="nil"/>
-        </w:pBdr>
-        <w:ind w:left="2" w:right="136" w:firstLine="707"/>
-        <w:jc w:val="both"/>
-        <w:rPr>
-          <w:color w:val="000000" w:themeColor="text1"/>
-          <w:sz w:val="24"/>
-          <w:szCs w:val="24"/>
-          <w:lang w:val="es-ES"/>
-        </w:rPr>
-      </w:pPr>
-    </w:p>
-    <w:p>
-      <w:pPr>
-        <w:pBdr>
-          <w:top w:val="nil"/>
-          <w:left w:val="nil"/>
-          <w:bottom w:val="nil"/>
-          <w:right w:val="nil"/>
-          <w:between w:val="nil"/>
-        </w:pBdr>
-        <w:ind w:left="2" w:right="136" w:firstLine="707"/>
-        <w:jc w:val="both"/>
-        <w:rPr>
-          <w:color w:val="000000" w:themeColor="text1"/>
-          <w:sz w:val="24"/>
-          <w:szCs w:val="24"/>
-          <w:lang w:val="es-ES"/>
-        </w:rPr>
-      </w:pPr>
-      <w:r>
-        <w:rPr>
-          <w:color w:val="000000" w:themeColor="text1"/>
-          <w:sz w:val="24"/>
-          <w:szCs w:val="24"/>
-          <w:lang w:val="es-ES"/>
-        </w:rPr>
-        <w:t>{{</w:t>
-      </w:r>
-      <w:r>
-        <w:rPr>
-          <w:color w:val="000000" w:themeColor="text1"/>
-          <w:sz w:val="24"/>
-          <w:szCs w:val="24"/>
-          <w:lang w:val="es-ES"/>
-        </w:rPr>
-        <w:t>Oferta previa</w:t>
+        <w:t>SUPLICO AL JUZGADO</w:t>
+      </w:r>
+      <w:r>
+        <w:rPr>
+          <w:color w:val="000000" w:themeColor="text1"/>
+          <w:sz w:val="24"/>
+          <w:szCs w:val="24"/>
+          <w:lang w:val="es-ES"/>
+        </w:rPr>
+        <w:t>: Que habiendo por presentado este escrito con los</w:t>
       </w:r>
       <w:r>
         <w:rPr>
@@ -3603,7 +5335,7 @@
           <w:szCs w:val="24"/>
           <w:lang w:val="es-ES"/>
         </w:rPr>
-        <w:t>[checkbox]</w:t>
+        <w:t>documentos que se acompañan y copias simples de todo ello se sirva admitirlo y por</w:t>
       </w:r>
       <w:r>
         <w:rPr>
@@ -3621,16 +5353,46 @@
           <w:szCs w:val="24"/>
           <w:lang w:val="es-ES"/>
         </w:rPr>
-        <w:t>{</w:t>
-      </w:r>
-      <w:r>
-        <w:rPr>
-          <w:color w:val="000000" w:themeColor="text1"/>
-          <w:sz w:val="24"/>
-          <w:szCs w:val="24"/>
-          <w:lang w:val="es-ES"/>
-        </w:rPr>
-        <w:t>Habiendo intentado conseguir un acuerdo con la compañía aseguradora, ha</w:t>
+        <w:t xml:space="preserve">parte en nombre de quien comparezco Y </w:t>
+      </w:r>
+      <w:r>
+        <w:rPr>
+          <w:b/>
+          <w:bCs/>
+          <w:color w:val="000000" w:themeColor="text1"/>
+          <w:sz w:val="24"/>
+          <w:szCs w:val="24"/>
+          <w:lang w:val="es-ES"/>
+        </w:rPr>
+        <w:t>TENER POR INTERPUESTA DEMANDA DE JUICIO VERBAL CONTRA</w:t>
+      </w:r>
+      <w:r>
+        <w:rPr>
+          <w:color w:val="000000" w:themeColor="text1"/>
+          <w:sz w:val="24"/>
+          <w:szCs w:val="24"/>
+          <w:lang w:val="es-ES"/>
+        </w:rPr>
+        <w:t xml:space="preserve"> la entidad </w:t>
+      </w:r>
+      <w:r>
+        <w:rPr>
+          <w:color w:val="000000" w:themeColor="text1"/>
+          <w:sz w:val="24"/>
+          <w:szCs w:val="24"/>
+          <w:highlight w:val="green"/>
+          <w:lang w:val="es-ES"/>
+        </w:rPr>
+        <w:t>REALE</w:t>
+      </w:r>
+      <w:r>
+        <w:rPr>
+          <w:color w:val="000000" w:themeColor="text1"/>
+          <w:sz w:val="24"/>
+          <w:szCs w:val="24"/>
+          <w:lang w:val="es-ES"/>
+        </w:rPr>
+        <w:t>, dándosele la tramitación de los arts. 437 y</w:t>
       </w:r>
       <w:r>
         <w:rPr>
@@ -3648,7 +5410,7 @@
           <w:szCs w:val="24"/>
           <w:lang w:val="es-ES"/>
         </w:rPr>
-        <w:t>resultado infructuoso, razón por la que, habiendo interrumpido esta parte la</w:t>
+        <w:t>siguientes de la LEC, y tras los trámites legales oportunos, se dicte sentencia por la que</w:t>
       </w:r>
       <w:r>
         <w:rPr>
@@ -3666,687 +5428,91 @@
           <w:szCs w:val="24"/>
           <w:lang w:val="es-ES"/>
         </w:rPr>
-        <w:t xml:space="preserve">prescripción de la acción que ahora se ejercita (según acredito mediante </w:t>
-      </w:r>
-      <w:r>
-        <w:rPr>
-          <w:b/>
-          <w:bCs/>
-          <w:color w:val="000000" w:themeColor="text1"/>
-          <w:sz w:val="24"/>
-          <w:szCs w:val="24"/>
-          <w:lang w:val="es-ES"/>
-        </w:rPr>
-        <w:t>documento nº</w:t>
-      </w:r>
-      <w:r>
-        <w:rPr>
-          <w:b/>
-          <w:bCs/>
-          <w:color w:val="000000" w:themeColor="text1"/>
-          <w:sz w:val="24"/>
-          <w:szCs w:val="24"/>
-          <w:lang w:val="es-ES"/>
-        </w:rPr>
-        <w:t xml:space="preserve"> </w:t>
-      </w:r>
-      <w:r>
-        <w:rPr>
-          <w:b/>
-          <w:bCs/>
-          <w:color w:val="000000" w:themeColor="text1"/>
-          <w:sz w:val="24"/>
-          <w:szCs w:val="24"/>
-          <w:lang w:val="es-ES"/>
-        </w:rPr>
-        <w:t>[</w:t>
-      </w:r>
-      <w:r>
-        <w:rPr>
-          <w:b/>
-          <w:bCs/>
-          <w:color w:val="000000" w:themeColor="text1"/>
-          <w:sz w:val="24"/>
-          <w:szCs w:val="24"/>
-          <w:lang w:val="es-ES"/>
-        </w:rPr>
-        <w:t>num</w:t>
-      </w:r>
-      <w:r>
-        <w:rPr>
-          <w:b/>
-          <w:bCs/>
-          <w:color w:val="000000" w:themeColor="text1"/>
-          <w:sz w:val="24"/>
-          <w:szCs w:val="24"/>
-          <w:lang w:val="es-ES"/>
-        </w:rPr>
-        <w:t xml:space="preserve"> </w:t>
-      </w:r>
-      <w:r>
-        <w:rPr>
-          <w:color w:val="000000" w:themeColor="text1"/>
-          <w:sz w:val="24"/>
-          <w:szCs w:val="24"/>
-          <w:lang w:val="es-ES"/>
-        </w:rPr>
-        <w:t>{Burofax de interrupción de prescripción.}</w:t>
-      </w:r>
-      <w:r>
-        <w:rPr>
-          <w:b/>
-          <w:bCs/>
-          <w:color w:val="000000" w:themeColor="text1"/>
-          <w:sz w:val="24"/>
-          <w:szCs w:val="24"/>
-          <w:lang w:val="es-ES"/>
+        <w:t xml:space="preserve">se condene a la demandada a pagar a la actora la </w:t>
+      </w:r>
+      <w:r>
+        <w:rPr>
+          <w:b/>
+          <w:bCs/>
+          <w:color w:val="000000" w:themeColor="text1"/>
+          <w:sz w:val="24"/>
+          <w:szCs w:val="24"/>
+          <w:lang w:val="es-ES"/>
+        </w:rPr>
+        <w:t xml:space="preserve">SUMA DE </w:t>
+      </w:r>
+      <w:r>
+        <w:rPr>
+          <w:b/>
+          <w:bCs/>
+          <w:color w:val="000000" w:themeColor="text1"/>
+          <w:sz w:val="24"/>
+          <w:szCs w:val="24"/>
+        </w:rPr>
+        <w:t xml:space="preserve">{{CALC: </w:t>
+      </w:r>
+      <w:r>
+        <w:rPr>
+          <w:b/>
+          <w:bCs/>
+          <w:color w:val="000000" w:themeColor="text1"/>
+          <w:sz w:val="24"/>
+          <w:szCs w:val="24"/>
+        </w:rPr>
+        <w:t>Días de perjuicio moderado * Importe por día de perjuicio moderado + (</w:t>
+      </w:r>
+      <w:r>
+        <w:rPr>
+          <w:b/>
+          <w:bCs/>
+          <w:color w:val="000000" w:themeColor="text1"/>
+          <w:sz w:val="24"/>
+          <w:szCs w:val="24"/>
+          <w:lang w:val="es-ES"/>
+        </w:rPr>
+        <w:t>Días de perjuicio totales - Días de perjuicio moderado)</w:t>
+      </w:r>
+      <w:r>
+        <w:rPr>
+          <w:b/>
+          <w:bCs/>
+          <w:color w:val="000000" w:themeColor="text1"/>
+          <w:sz w:val="24"/>
+          <w:szCs w:val="24"/>
+        </w:rPr>
+        <w:t xml:space="preserve"> * Importe por día de perjuicio básico</w:t>
+      </w:r>
+      <w:r>
+        <w:rPr>
+          <w:b/>
+          <w:bCs/>
+          <w:color w:val="000000" w:themeColor="text1"/>
+          <w:sz w:val="24"/>
+          <w:szCs w:val="24"/>
+        </w:rPr>
+        <w:t xml:space="preserve"> [</w:t>
+      </w:r>
+      <w:proofErr w:type="spellStart"/>
+      <w:r>
+        <w:rPr>
+          <w:b/>
+          <w:bCs/>
+          <w:color w:val="000000" w:themeColor="text1"/>
+          <w:sz w:val="24"/>
+          <w:szCs w:val="24"/>
+        </w:rPr>
+        <w:t>words</w:t>
+      </w:r>
+      <w:proofErr w:type="spellEnd"/>
+      <w:r>
+        <w:rPr>
+          <w:b/>
+          <w:bCs/>
+          <w:color w:val="000000" w:themeColor="text1"/>
+          <w:sz w:val="24"/>
+          <w:szCs w:val="24"/>
         </w:rPr>
         <w:t>]</w:t>
-      </w:r>
-      <w:r>
-        <w:rPr>
-          <w:b/>
-          <w:bCs/>
-          <w:color w:val="000000" w:themeColor="text1"/>
-          <w:sz w:val="24"/>
-          <w:szCs w:val="24"/>
-          <w:lang w:val="es-ES"/>
-        </w:rPr>
-        <w:t xml:space="preserve">) </w:t>
-      </w:r>
-      <w:r>
-        <w:rPr>
-          <w:color w:val="000000" w:themeColor="text1"/>
-          <w:sz w:val="24"/>
-          <w:szCs w:val="24"/>
-          <w:lang w:val="es-ES"/>
-        </w:rPr>
-        <w:t>se interpone la presente demanda.</w:t>
-      </w:r>
-      <w:r>
-        <w:rPr>
-          <w:color w:val="000000" w:themeColor="text1"/>
-          <w:sz w:val="24"/>
-          <w:szCs w:val="24"/>
-          <w:lang w:val="es-ES"/>
-        </w:rPr>
-        <w:t>}}}</w:t>
-      </w:r>
-    </w:p>
-    <w:p>
-      <w:pPr>
-        <w:pBdr>
-          <w:top w:val="nil"/>
-          <w:left w:val="nil"/>
-          <w:bottom w:val="nil"/>
-          <w:right w:val="nil"/>
-          <w:between w:val="nil"/>
-        </w:pBdr>
-        <w:ind w:left="2" w:right="136" w:firstLine="707"/>
-        <w:jc w:val="both"/>
-        <w:rPr>
-          <w:color w:val="000000" w:themeColor="text1"/>
-          <w:sz w:val="24"/>
-          <w:szCs w:val="24"/>
-          <w:lang w:val="es-ES"/>
-        </w:rPr>
-      </w:pPr>
-    </w:p>
-    <w:p>
-      <w:pPr>
-        <w:pBdr>
-          <w:top w:val="nil"/>
-          <w:left w:val="nil"/>
-          <w:bottom w:val="nil"/>
-          <w:right w:val="nil"/>
-          <w:between w:val="nil"/>
-        </w:pBdr>
-        <w:ind w:left="2" w:right="136" w:firstLine="707"/>
-        <w:jc w:val="both"/>
-        <w:rPr>
-          <w:color w:val="000000" w:themeColor="text1"/>
-          <w:sz w:val="24"/>
-          <w:szCs w:val="24"/>
-          <w:lang w:val="es-ES"/>
-        </w:rPr>
-      </w:pPr>
-      <w:r>
-        <w:rPr>
-          <w:color w:val="000000" w:themeColor="text1"/>
-          <w:sz w:val="24"/>
-          <w:szCs w:val="24"/>
-          <w:lang w:val="es-ES"/>
-        </w:rPr>
-        <w:t>{{Con contractura [checkbox</w:t>
-      </w:r>
-      <w:r>
-        <w:rPr>
-          <w:color w:val="000000" w:themeColor="text1"/>
-          <w:sz w:val="24"/>
-          <w:szCs w:val="24"/>
-          <w:lang w:val="es-ES"/>
-        </w:rPr>
-        <w:t>] {</w:t>
-      </w:r>
-      <w:r>
-        <w:rPr>
-          <w:color w:val="000000" w:themeColor="text1"/>
-          <w:sz w:val="24"/>
-          <w:szCs w:val="24"/>
-          <w:lang w:val="es-ES"/>
-        </w:rPr>
-        <w:t>Por todo lo expuesto no puede considerarse que exista falta de nexo causal, ya</w:t>
-      </w:r>
-      <w:r>
-        <w:rPr>
-          <w:color w:val="000000" w:themeColor="text1"/>
-          <w:sz w:val="24"/>
-          <w:szCs w:val="24"/>
-          <w:lang w:val="es-ES"/>
-        </w:rPr>
-        <w:t xml:space="preserve"> </w:t>
-      </w:r>
-      <w:r>
-        <w:rPr>
-          <w:color w:val="000000" w:themeColor="text1"/>
-          <w:sz w:val="24"/>
-          <w:szCs w:val="24"/>
-          <w:lang w:val="es-ES"/>
-        </w:rPr>
-        <w:t>que el informe biomecánico es una prueba insuficiente para acreditarlo y,</w:t>
-      </w:r>
-      <w:r>
-        <w:rPr>
-          <w:color w:val="000000" w:themeColor="text1"/>
-          <w:sz w:val="24"/>
-          <w:szCs w:val="24"/>
-          <w:lang w:val="es-ES"/>
-        </w:rPr>
-        <w:t xml:space="preserve"> </w:t>
-      </w:r>
-      <w:r>
-        <w:rPr>
-          <w:color w:val="000000" w:themeColor="text1"/>
-          <w:sz w:val="24"/>
-          <w:szCs w:val="24"/>
-          <w:lang w:val="es-ES"/>
-        </w:rPr>
-        <w:t>consecuentemente, siendo que, además, la demandada se basa en un informe médico</w:t>
-      </w:r>
-      <w:r>
-        <w:rPr>
-          <w:color w:val="000000" w:themeColor="text1"/>
-          <w:sz w:val="24"/>
-          <w:szCs w:val="24"/>
-          <w:lang w:val="es-ES"/>
-        </w:rPr>
-        <w:t xml:space="preserve"> </w:t>
-      </w:r>
-      <w:r>
-        <w:rPr>
-          <w:color w:val="000000" w:themeColor="text1"/>
-          <w:sz w:val="24"/>
-          <w:szCs w:val="24"/>
-          <w:lang w:val="es-ES"/>
-        </w:rPr>
-        <w:t>pericial para negar igualmente nexo causal y éste se fundamenta principalmente en el</w:t>
-      </w:r>
-      <w:r>
-        <w:rPr>
-          <w:color w:val="000000" w:themeColor="text1"/>
-          <w:sz w:val="24"/>
-          <w:szCs w:val="24"/>
-          <w:lang w:val="es-ES"/>
-        </w:rPr>
-        <w:t xml:space="preserve"> </w:t>
-      </w:r>
-      <w:r>
-        <w:rPr>
-          <w:color w:val="000000" w:themeColor="text1"/>
-          <w:sz w:val="24"/>
-          <w:szCs w:val="24"/>
-          <w:lang w:val="es-ES"/>
-        </w:rPr>
-        <w:t>propio informe biomecánico antedicho, tampoco ha de considerarse éste válido.</w:t>
-      </w:r>
-      <w:r>
-        <w:rPr>
-          <w:color w:val="000000" w:themeColor="text1"/>
-          <w:sz w:val="24"/>
-          <w:szCs w:val="24"/>
-          <w:lang w:val="es-ES"/>
-        </w:rPr>
-        <w:t>}}}</w:t>
-      </w:r>
-    </w:p>
-    <w:p>
-      <w:pPr>
-        <w:pBdr>
-          <w:top w:val="nil"/>
-          <w:left w:val="nil"/>
-          <w:bottom w:val="nil"/>
-          <w:right w:val="nil"/>
-          <w:between w:val="nil"/>
-        </w:pBdr>
-        <w:ind w:left="2" w:right="136" w:firstLine="707"/>
-        <w:jc w:val="both"/>
-        <w:rPr>
-          <w:color w:val="000000" w:themeColor="text1"/>
-          <w:sz w:val="24"/>
-          <w:szCs w:val="24"/>
-          <w:lang w:val="es-ES"/>
-        </w:rPr>
-      </w:pPr>
-    </w:p>
-    <w:p>
-      <w:pPr>
-        <w:pBdr>
-          <w:top w:val="nil"/>
-          <w:left w:val="nil"/>
-          <w:bottom w:val="nil"/>
-          <w:right w:val="nil"/>
-          <w:between w:val="nil"/>
-        </w:pBdr>
-        <w:ind w:left="2" w:right="136" w:firstLine="707"/>
-        <w:jc w:val="both"/>
-        <w:rPr>
-          <w:b/>
-          <w:bCs/>
-          <w:color w:val="000000" w:themeColor="text1"/>
-          <w:sz w:val="24"/>
-          <w:szCs w:val="24"/>
-          <w:lang w:val="es-ES"/>
-        </w:rPr>
-      </w:pPr>
-      <w:r>
-        <w:rPr>
-          <w:b/>
-          <w:bCs/>
-          <w:color w:val="000000" w:themeColor="text1"/>
-          <w:sz w:val="24"/>
-          <w:szCs w:val="24"/>
-          <w:lang w:val="es-ES"/>
-        </w:rPr>
-        <w:t>V.- Cuantía</w:t>
-      </w:r>
-    </w:p>
-    <w:p>
-      <w:pPr>
-        <w:pBdr>
-          <w:top w:val="nil"/>
-          <w:left w:val="nil"/>
-          <w:bottom w:val="nil"/>
-          <w:right w:val="nil"/>
-          <w:between w:val="nil"/>
-        </w:pBdr>
-        <w:ind w:left="2" w:right="136" w:firstLine="707"/>
-        <w:jc w:val="both"/>
-        <w:rPr>
-          <w:color w:val="000000" w:themeColor="text1"/>
-          <w:sz w:val="24"/>
-          <w:szCs w:val="24"/>
-          <w:lang w:val="es-ES"/>
-        </w:rPr>
-      </w:pPr>
-      <w:r>
-        <w:rPr>
-          <w:color w:val="000000" w:themeColor="text1"/>
-          <w:sz w:val="24"/>
-          <w:szCs w:val="24"/>
-          <w:lang w:val="es-ES"/>
-        </w:rPr>
-        <w:t>La</w:t>
-      </w:r>
-      <w:r>
-        <w:rPr>
-          <w:b/>
-          <w:bCs/>
-          <w:color w:val="000000" w:themeColor="text1"/>
-          <w:sz w:val="24"/>
-          <w:szCs w:val="24"/>
-          <w:lang w:val="es-ES"/>
-        </w:rPr>
-        <w:t xml:space="preserve"> CUANTÍA </w:t>
-      </w:r>
-      <w:r>
-        <w:rPr>
-          <w:color w:val="000000" w:themeColor="text1"/>
-          <w:sz w:val="24"/>
-          <w:szCs w:val="24"/>
-          <w:lang w:val="es-ES"/>
-        </w:rPr>
-        <w:t xml:space="preserve">del presente procedimiento la ciframos en la cantidad de </w:t>
-      </w:r>
-      <w:r>
-        <w:rPr>
-          <w:b/>
-          <w:bCs/>
-          <w:color w:val="000000" w:themeColor="text1"/>
-          <w:sz w:val="24"/>
-          <w:szCs w:val="24"/>
-        </w:rPr>
-        <w:t xml:space="preserve">{{CALC: Días de perjuicio moderado * Importe por día de perjuicio moderado + </w:t>
-      </w:r>
-      <w:r>
-        <w:rPr>
-          <w:b/>
-          <w:bCs/>
-          <w:color w:val="000000" w:themeColor="text1"/>
-          <w:sz w:val="24"/>
-          <w:szCs w:val="24"/>
-        </w:rPr>
-        <w:t>(</w:t>
-      </w:r>
-      <w:r>
-        <w:rPr>
-          <w:b/>
-          <w:bCs/>
-          <w:color w:val="000000" w:themeColor="text1"/>
-          <w:sz w:val="24"/>
-          <w:szCs w:val="24"/>
-          <w:lang w:val="es-ES"/>
-        </w:rPr>
-        <w:t>Días de perjuicio totales - Días de perjuicio moderado)</w:t>
-      </w:r>
-      <w:r>
-        <w:rPr>
-          <w:b/>
-          <w:bCs/>
-          <w:color w:val="000000" w:themeColor="text1"/>
-          <w:sz w:val="24"/>
-          <w:szCs w:val="24"/>
-        </w:rPr>
-        <w:t xml:space="preserve"> </w:t>
-      </w:r>
-      <w:r>
-        <w:rPr>
-          <w:b/>
-          <w:bCs/>
-          <w:color w:val="000000" w:themeColor="text1"/>
-          <w:sz w:val="24"/>
-          <w:szCs w:val="24"/>
-        </w:rPr>
-        <w:t>* Importe por día de perjuicio básico}}</w:t>
-      </w:r>
-      <w:r>
-        <w:rPr>
-          <w:color w:val="000000" w:themeColor="text1"/>
-          <w:sz w:val="24"/>
-          <w:szCs w:val="24"/>
-          <w:lang w:val="es-ES"/>
-        </w:rPr>
-        <w:t xml:space="preserve"> </w:t>
-      </w:r>
-      <w:r>
-        <w:rPr>
-          <w:b/>
-          <w:bCs/>
-          <w:color w:val="000000" w:themeColor="text1"/>
-          <w:sz w:val="24"/>
-          <w:szCs w:val="24"/>
-          <w:lang w:val="es-ES"/>
-        </w:rPr>
-        <w:t>euros</w:t>
-      </w:r>
-      <w:r>
-        <w:rPr>
-          <w:color w:val="000000" w:themeColor="text1"/>
-          <w:sz w:val="24"/>
-          <w:szCs w:val="24"/>
-          <w:lang w:val="es-ES"/>
-        </w:rPr>
-        <w:t xml:space="preserve"> que reclamamos como </w:t>
-      </w:r>
-      <w:r>
-        <w:rPr>
-          <w:b/>
-          <w:bCs/>
-          <w:color w:val="000000" w:themeColor="text1"/>
-          <w:sz w:val="24"/>
-          <w:szCs w:val="24"/>
-          <w:lang w:val="es-ES"/>
-        </w:rPr>
-        <w:t>PRINCIPAL</w:t>
-      </w:r>
-      <w:r>
-        <w:rPr>
-          <w:color w:val="000000" w:themeColor="text1"/>
-          <w:sz w:val="24"/>
-          <w:szCs w:val="24"/>
-          <w:lang w:val="es-ES"/>
-        </w:rPr>
-        <w:t>.</w:t>
-      </w:r>
-    </w:p>
-    <w:p>
-      <w:pPr>
-        <w:pBdr>
-          <w:top w:val="nil"/>
-          <w:left w:val="nil"/>
-          <w:bottom w:val="nil"/>
-          <w:right w:val="nil"/>
-          <w:between w:val="nil"/>
-        </w:pBdr>
-        <w:ind w:left="2" w:right="136" w:firstLine="707"/>
-        <w:jc w:val="both"/>
-        <w:rPr>
-          <w:color w:val="000000" w:themeColor="text1"/>
-          <w:sz w:val="24"/>
-          <w:szCs w:val="24"/>
-          <w:lang w:val="es-ES"/>
-        </w:rPr>
-      </w:pPr>
-    </w:p>
-    <w:p>
-      <w:pPr>
-        <w:pBdr>
-          <w:top w:val="nil"/>
-          <w:left w:val="nil"/>
-          <w:bottom w:val="nil"/>
-          <w:right w:val="nil"/>
-          <w:between w:val="nil"/>
-        </w:pBdr>
-        <w:ind w:left="2" w:right="136" w:firstLine="707"/>
-        <w:jc w:val="both"/>
-        <w:rPr>
-          <w:color w:val="000000" w:themeColor="text1"/>
-          <w:sz w:val="24"/>
-          <w:szCs w:val="24"/>
-          <w:lang w:val="es-ES"/>
-        </w:rPr>
-      </w:pPr>
-      <w:r>
-        <w:rPr>
-          <w:b/>
-          <w:bCs/>
-          <w:color w:val="000000" w:themeColor="text1"/>
-          <w:sz w:val="24"/>
-          <w:szCs w:val="24"/>
-          <w:lang w:val="es-ES"/>
-        </w:rPr>
-        <w:t>SUPLICO AL JUZGADO</w:t>
-      </w:r>
-      <w:r>
-        <w:rPr>
-          <w:color w:val="000000" w:themeColor="text1"/>
-          <w:sz w:val="24"/>
-          <w:szCs w:val="24"/>
-          <w:lang w:val="es-ES"/>
-        </w:rPr>
-        <w:t>: Que habiendo por presentado este escrito con los</w:t>
-      </w:r>
-      <w:r>
-        <w:rPr>
-          <w:color w:val="000000" w:themeColor="text1"/>
-          <w:sz w:val="24"/>
-          <w:szCs w:val="24"/>
-          <w:lang w:val="es-ES"/>
-        </w:rPr>
-        <w:t xml:space="preserve"> </w:t>
-      </w:r>
-      <w:r>
-        <w:rPr>
-          <w:color w:val="000000" w:themeColor="text1"/>
-          <w:sz w:val="24"/>
-          <w:szCs w:val="24"/>
-          <w:lang w:val="es-ES"/>
-        </w:rPr>
-        <w:t>documentos que se acompañan y copias simples de todo ello se sirva admitirlo y por</w:t>
-      </w:r>
-      <w:r>
-        <w:rPr>
-          <w:color w:val="000000" w:themeColor="text1"/>
-          <w:sz w:val="24"/>
-          <w:szCs w:val="24"/>
-          <w:lang w:val="es-ES"/>
-        </w:rPr>
-        <w:t xml:space="preserve"> </w:t>
-      </w:r>
-      <w:r>
-        <w:rPr>
-          <w:color w:val="000000" w:themeColor="text1"/>
-          <w:sz w:val="24"/>
-          <w:szCs w:val="24"/>
-          <w:lang w:val="es-ES"/>
-        </w:rPr>
-        <w:t xml:space="preserve">parte en nombre de quien comparezco Y </w:t>
-      </w:r>
-      <w:r>
-        <w:rPr>
-          <w:b/>
-          <w:bCs/>
-          <w:color w:val="000000" w:themeColor="text1"/>
-          <w:sz w:val="24"/>
-          <w:szCs w:val="24"/>
-          <w:lang w:val="es-ES"/>
-        </w:rPr>
-        <w:t>TENER POR INTERPUESTA DEMANDA DE JUICIO VERBAL CONTRA</w:t>
-      </w:r>
-      <w:r>
-        <w:rPr>
-          <w:color w:val="000000" w:themeColor="text1"/>
-          <w:sz w:val="24"/>
-          <w:szCs w:val="24"/>
-          <w:lang w:val="es-ES"/>
-        </w:rPr>
-        <w:t xml:space="preserve"> la entidad </w:t>
-      </w:r>
-      <w:r>
-        <w:rPr>
-          <w:color w:val="000000" w:themeColor="text1"/>
-          <w:sz w:val="24"/>
-          <w:szCs w:val="24"/>
-          <w:highlight w:val="green"/>
-          <w:lang w:val="es-ES"/>
-        </w:rPr>
-        <w:t>REALE</w:t>
-      </w:r>
-      <w:r>
-        <w:rPr>
-          <w:color w:val="000000" w:themeColor="text1"/>
-          <w:sz w:val="24"/>
-          <w:szCs w:val="24"/>
-          <w:lang w:val="es-ES"/>
-        </w:rPr>
-        <w:t>, dándosele la tramitación de los arts. 437 y</w:t>
-      </w:r>
-      <w:r>
-        <w:rPr>
-          <w:color w:val="000000" w:themeColor="text1"/>
-          <w:sz w:val="24"/>
-          <w:szCs w:val="24"/>
-          <w:lang w:val="es-ES"/>
-        </w:rPr>
-        <w:t xml:space="preserve"> </w:t>
-      </w:r>
-      <w:r>
-        <w:rPr>
-          <w:color w:val="000000" w:themeColor="text1"/>
-          <w:sz w:val="24"/>
-          <w:szCs w:val="24"/>
-          <w:lang w:val="es-ES"/>
-        </w:rPr>
-        <w:t>siguientes de la LEC, y tras los trámites legales oportunos, se dicte sentencia por la que</w:t>
-      </w:r>
-      <w:r>
-        <w:rPr>
-          <w:color w:val="000000" w:themeColor="text1"/>
-          <w:sz w:val="24"/>
-          <w:szCs w:val="24"/>
-          <w:lang w:val="es-ES"/>
-        </w:rPr>
-        <w:t xml:space="preserve"> </w:t>
-      </w:r>
-      <w:r>
-        <w:rPr>
-          <w:color w:val="000000" w:themeColor="text1"/>
-          <w:sz w:val="24"/>
-          <w:szCs w:val="24"/>
-          <w:lang w:val="es-ES"/>
-        </w:rPr>
-        <w:t xml:space="preserve">se condene a la demandada a pagar a la actora la </w:t>
-      </w:r>
-      <w:r>
-        <w:rPr>
-          <w:b/>
-          <w:bCs/>
-          <w:color w:val="000000" w:themeColor="text1"/>
-          <w:sz w:val="24"/>
-          <w:szCs w:val="24"/>
-          <w:lang w:val="es-ES"/>
-        </w:rPr>
-        <w:t xml:space="preserve">SUMA DE </w:t>
-      </w:r>
-      <w:r>
-        <w:rPr>
-          <w:b/>
-          <w:bCs/>
-          <w:color w:val="000000" w:themeColor="text1"/>
-          <w:sz w:val="24"/>
-          <w:szCs w:val="24"/>
-        </w:rPr>
-        <w:t xml:space="preserve">{{CALC: </w:t>
-      </w:r>
-      <w:r>
-        <w:rPr>
-          <w:b/>
-          <w:bCs/>
-          <w:color w:val="000000" w:themeColor="text1"/>
-          <w:sz w:val="24"/>
-          <w:szCs w:val="24"/>
-        </w:rPr>
-        <w:t>Días de perjuicio moderado * Importe por día de perjuicio moderado + (</w:t>
-      </w:r>
-      <w:r>
-        <w:rPr>
-          <w:b/>
-          <w:bCs/>
-          <w:color w:val="000000" w:themeColor="text1"/>
-          <w:sz w:val="24"/>
-          <w:szCs w:val="24"/>
-          <w:lang w:val="es-ES"/>
-        </w:rPr>
-        <w:t>Días de perjuicio totales - Días de perjuicio moderado)</w:t>
-      </w:r>
-      <w:r>
-        <w:rPr>
-          <w:b/>
-          <w:bCs/>
-          <w:color w:val="000000" w:themeColor="text1"/>
-          <w:sz w:val="24"/>
-          <w:szCs w:val="24"/>
-        </w:rPr>
-        <w:t xml:space="preserve"> * Importe por día de perjuicio básico</w:t>
-      </w:r>
-      <w:r>
-        <w:rPr>
-          <w:b/>
-          <w:bCs/>
-          <w:color w:val="000000" w:themeColor="text1"/>
-          <w:sz w:val="24"/>
-          <w:szCs w:val="24"/>
-        </w:rPr>
-        <w:t xml:space="preserve"> [words]</w:t>
       </w:r>
       <w:r>
         <w:rPr>
@@ -5469,7 +6635,6 @@
   <w:style w:type="character" w:default="1" w:styleId="Fuentedeprrafopredeter">
     <w:name w:val="Default Paragraph Font"/>
     <w:uiPriority w:val="1"/>
-    <w:semiHidden/>
     <w:unhideWhenUsed/>
   </w:style>
   <w:style w:type="table" w:default="1" w:styleId="Tablanormal">

</xml_diff>